<commit_message>
Sprawozdanie - SSN cz. 2; dodanie wykresów
</commit_message>
<xml_diff>
--- a/ESI - sprawozdanie.docx
+++ b/ESI - sprawozdanie.docx
@@ -4,7 +4,7 @@
   <w:body>
     <w:p>
       <w:pPr>
-        <w:pStyle w:val="Title"/>
+        <w:pStyle w:val="Tytu"/>
         <w:jc w:val="both"/>
         <w:rPr>
           <w:rFonts w:asciiTheme="minorHAnsi" w:hAnsiTheme="minorHAnsi"/>
@@ -19,7 +19,7 @@
     </w:p>
     <w:p>
       <w:pPr>
-        <w:pStyle w:val="Heading1"/>
+        <w:pStyle w:val="Nagwek1"/>
         <w:numPr>
           <w:ilvl w:val="0"/>
           <w:numId w:val="3"/>
@@ -324,7 +324,7 @@
     </w:p>
     <w:p>
       <w:pPr>
-        <w:pStyle w:val="Heading1"/>
+        <w:pStyle w:val="Nagwek1"/>
         <w:numPr>
           <w:ilvl w:val="0"/>
           <w:numId w:val="5"/>
@@ -343,7 +343,7 @@
     </w:p>
     <w:p>
       <w:pPr>
-        <w:pStyle w:val="NormalWeb"/>
+        <w:pStyle w:val="NormalnyWeb"/>
         <w:rPr>
           <w:rFonts w:asciiTheme="minorHAnsi" w:hAnsiTheme="minorHAnsi"/>
           <w:sz w:val="22"/>
@@ -361,7 +361,7 @@
     </w:p>
     <w:p>
       <w:pPr>
-        <w:pStyle w:val="NormalWeb"/>
+        <w:pStyle w:val="NormalnyWeb"/>
         <w:rPr>
           <w:rFonts w:asciiTheme="minorHAnsi" w:hAnsiTheme="minorHAnsi"/>
         </w:rPr>
@@ -369,7 +369,7 @@
     </w:p>
     <w:p>
       <w:pPr>
-        <w:pStyle w:val="NormalWeb"/>
+        <w:pStyle w:val="NormalnyWeb"/>
         <w:rPr>
           <w:rFonts w:asciiTheme="minorHAnsi" w:hAnsiTheme="minorHAnsi"/>
         </w:rPr>
@@ -377,7 +377,7 @@
     </w:p>
     <w:p>
       <w:pPr>
-        <w:pStyle w:val="NormalWeb"/>
+        <w:pStyle w:val="NormalnyWeb"/>
         <w:rPr>
           <w:rFonts w:asciiTheme="minorHAnsi" w:hAnsiTheme="minorHAnsi"/>
         </w:rPr>
@@ -385,7 +385,7 @@
     </w:p>
     <w:p>
       <w:pPr>
-        <w:pStyle w:val="NormalWeb"/>
+        <w:pStyle w:val="NormalnyWeb"/>
         <w:rPr>
           <w:rFonts w:asciiTheme="minorHAnsi" w:hAnsiTheme="minorHAnsi"/>
         </w:rPr>
@@ -393,7 +393,7 @@
     </w:p>
     <w:p>
       <w:pPr>
-        <w:pStyle w:val="NormalWeb"/>
+        <w:pStyle w:val="NormalnyWeb"/>
         <w:rPr>
           <w:rFonts w:asciiTheme="minorHAnsi" w:hAnsiTheme="minorHAnsi"/>
         </w:rPr>
@@ -401,7 +401,7 @@
     </w:p>
     <w:p>
       <w:pPr>
-        <w:pStyle w:val="NormalWeb"/>
+        <w:pStyle w:val="NormalnyWeb"/>
         <w:rPr>
           <w:rFonts w:asciiTheme="minorHAnsi" w:hAnsiTheme="minorHAnsi"/>
         </w:rPr>
@@ -409,7 +409,7 @@
     </w:p>
     <w:p>
       <w:pPr>
-        <w:pStyle w:val="NormalWeb"/>
+        <w:pStyle w:val="NormalnyWeb"/>
         <w:rPr>
           <w:rFonts w:asciiTheme="minorHAnsi" w:hAnsiTheme="minorHAnsi"/>
         </w:rPr>
@@ -417,7 +417,7 @@
     </w:p>
     <w:p>
       <w:pPr>
-        <w:pStyle w:val="NormalWeb"/>
+        <w:pStyle w:val="NormalnyWeb"/>
         <w:rPr>
           <w:rFonts w:asciiTheme="minorHAnsi" w:hAnsiTheme="minorHAnsi"/>
         </w:rPr>
@@ -425,7 +425,7 @@
     </w:p>
     <w:p>
       <w:pPr>
-        <w:pStyle w:val="NormalWeb"/>
+        <w:pStyle w:val="NormalnyWeb"/>
         <w:rPr>
           <w:rFonts w:asciiTheme="minorHAnsi" w:hAnsiTheme="minorHAnsi"/>
         </w:rPr>
@@ -433,7 +433,7 @@
     </w:p>
     <w:p>
       <w:pPr>
-        <w:pStyle w:val="NormalWeb"/>
+        <w:pStyle w:val="NormalnyWeb"/>
         <w:rPr>
           <w:rFonts w:asciiTheme="minorHAnsi" w:hAnsiTheme="minorHAnsi"/>
         </w:rPr>
@@ -441,7 +441,7 @@
     </w:p>
     <w:p>
       <w:pPr>
-        <w:pStyle w:val="NormalWeb"/>
+        <w:pStyle w:val="NormalnyWeb"/>
         <w:rPr>
           <w:rFonts w:asciiTheme="minorHAnsi" w:hAnsiTheme="minorHAnsi"/>
         </w:rPr>
@@ -449,7 +449,7 @@
     </w:p>
     <w:p>
       <w:pPr>
-        <w:pStyle w:val="NormalWeb"/>
+        <w:pStyle w:val="NormalnyWeb"/>
         <w:rPr>
           <w:rFonts w:asciiTheme="minorHAnsi" w:hAnsiTheme="minorHAnsi"/>
         </w:rPr>
@@ -457,7 +457,7 @@
     </w:p>
     <w:p>
       <w:pPr>
-        <w:pStyle w:val="NormalWeb"/>
+        <w:pStyle w:val="NormalnyWeb"/>
         <w:rPr>
           <w:rFonts w:asciiTheme="minorHAnsi" w:hAnsiTheme="minorHAnsi"/>
         </w:rPr>
@@ -465,7 +465,7 @@
     </w:p>
     <w:p>
       <w:pPr>
-        <w:pStyle w:val="NormalWeb"/>
+        <w:pStyle w:val="NormalnyWeb"/>
         <w:rPr>
           <w:rFonts w:asciiTheme="minorHAnsi" w:hAnsiTheme="minorHAnsi"/>
         </w:rPr>
@@ -473,7 +473,7 @@
     </w:p>
     <w:p>
       <w:pPr>
-        <w:pStyle w:val="NormalWeb"/>
+        <w:pStyle w:val="NormalnyWeb"/>
         <w:rPr>
           <w:rFonts w:asciiTheme="minorHAnsi" w:hAnsiTheme="minorHAnsi"/>
         </w:rPr>
@@ -481,7 +481,7 @@
     </w:p>
     <w:p>
       <w:pPr>
-        <w:pStyle w:val="NormalWeb"/>
+        <w:pStyle w:val="NormalnyWeb"/>
         <w:rPr>
           <w:rFonts w:asciiTheme="minorHAnsi" w:hAnsiTheme="minorHAnsi"/>
         </w:rPr>
@@ -489,7 +489,7 @@
     </w:p>
     <w:p>
       <w:pPr>
-        <w:pStyle w:val="Heading1"/>
+        <w:pStyle w:val="Nagwek1"/>
         <w:numPr>
           <w:ilvl w:val="0"/>
           <w:numId w:val="5"/>
@@ -508,7 +508,7 @@
     </w:p>
     <w:p>
       <w:pPr>
-        <w:pStyle w:val="Subtitle"/>
+        <w:pStyle w:val="Podtytu"/>
         <w:jc w:val="both"/>
       </w:pPr>
       <w:r>
@@ -3702,32 +3702,32 @@
     <w:p/>
     <w:p>
       <w:pPr>
-        <w:pStyle w:val="Subtitle"/>
+        <w:pStyle w:val="Podtytu"/>
       </w:pPr>
     </w:p>
     <w:p>
       <w:pPr>
-        <w:pStyle w:val="Subtitle"/>
+        <w:pStyle w:val="Podtytu"/>
       </w:pPr>
     </w:p>
     <w:p>
       <w:pPr>
-        <w:pStyle w:val="Subtitle"/>
+        <w:pStyle w:val="Podtytu"/>
       </w:pPr>
     </w:p>
     <w:p>
       <w:pPr>
-        <w:pStyle w:val="Subtitle"/>
+        <w:pStyle w:val="Podtytu"/>
       </w:pPr>
     </w:p>
     <w:p>
       <w:pPr>
-        <w:pStyle w:val="Subtitle"/>
+        <w:pStyle w:val="Podtytu"/>
       </w:pPr>
     </w:p>
     <w:p>
       <w:pPr>
-        <w:pStyle w:val="Subtitle"/>
+        <w:pStyle w:val="Podtytu"/>
       </w:pPr>
       <w:r>
         <w:t>Gradient Booster</w:t>
@@ -6941,7 +6941,7 @@
     </w:p>
     <w:p>
       <w:pPr>
-        <w:pStyle w:val="Heading1"/>
+        <w:pStyle w:val="Nagwek1"/>
         <w:numPr>
           <w:ilvl w:val="0"/>
           <w:numId w:val="5"/>
@@ -6960,7 +6960,7 @@
     </w:p>
     <w:p>
       <w:pPr>
-        <w:pStyle w:val="Subtitle"/>
+        <w:pStyle w:val="Podtytu"/>
       </w:pPr>
       <w:r>
         <w:t>Random Forest</w:t>
@@ -11370,7 +11370,7 @@
     </w:p>
     <w:p>
       <w:pPr>
-        <w:pStyle w:val="Subtitle"/>
+        <w:pStyle w:val="Podtytu"/>
       </w:pPr>
       <w:r>
         <w:lastRenderedPageBreak/>
@@ -15793,7 +15793,7 @@
     <w:p/>
     <w:p>
       <w:pPr>
-        <w:pStyle w:val="Title"/>
+        <w:pStyle w:val="Tytu"/>
       </w:pPr>
       <w:r>
         <w:lastRenderedPageBreak/>
@@ -15802,7 +15802,7 @@
     </w:p>
     <w:p>
       <w:pPr>
-        <w:pStyle w:val="Heading1"/>
+        <w:pStyle w:val="Nagwek1"/>
         <w:rPr>
           <w:b/>
           <w:bCs/>
@@ -15823,7 +15823,7 @@
     </w:p>
     <w:p>
       <w:pPr>
-        <w:pStyle w:val="Heading1"/>
+        <w:pStyle w:val="Nagwek1"/>
         <w:rPr>
           <w:b/>
           <w:bCs/>
@@ -15839,7 +15839,7 @@
     </w:p>
     <w:p>
       <w:pPr>
-        <w:pStyle w:val="Heading2"/>
+        <w:pStyle w:val="Nagwek2"/>
         <w:rPr>
           <w:b/>
           <w:bCs/>
@@ -15948,7 +15948,7 @@
                     </pic:cNvPicPr>
                   </pic:nvPicPr>
                   <pic:blipFill>
-                    <a:blip r:embed="rId6">
+                    <a:blip r:embed="rId8">
                       <a:extLst>
                         <a:ext uri="{28A0092B-C50C-407E-A947-70E740481C1C}">
                           <a14:useLocalDpi xmlns:a14="http://schemas.microsoft.com/office/drawing/2010/main" val="0"/>
@@ -15986,7 +15986,7 @@
     <w:p/>
     <w:p>
       <w:pPr>
-        <w:pStyle w:val="Heading2"/>
+        <w:pStyle w:val="Nagwek2"/>
         <w:rPr>
           <w:b/>
           <w:bCs/>
@@ -16027,220 +16027,6 @@
                 <pic:pic xmlns:pic="http://schemas.openxmlformats.org/drawingml/2006/picture">
                   <pic:nvPicPr>
                     <pic:cNvPr id="0" name="Picture 3"/>
-                    <pic:cNvPicPr>
-                      <a:picLocks noChangeAspect="1" noChangeArrowheads="1"/>
-                    </pic:cNvPicPr>
-                  </pic:nvPicPr>
-                  <pic:blipFill>
-                    <a:blip r:embed="rId7">
-                      <a:extLst>
-                        <a:ext uri="{28A0092B-C50C-407E-A947-70E740481C1C}">
-                          <a14:useLocalDpi xmlns:a14="http://schemas.microsoft.com/office/drawing/2010/main" val="0"/>
-                        </a:ext>
-                      </a:extLst>
-                    </a:blip>
-                    <a:srcRect/>
-                    <a:stretch>
-                      <a:fillRect/>
-                    </a:stretch>
-                  </pic:blipFill>
-                  <pic:spPr bwMode="auto">
-                    <a:xfrm>
-                      <a:off x="0" y="0"/>
-                      <a:ext cx="5760720" cy="3830320"/>
-                    </a:xfrm>
-                    <a:prstGeom prst="rect">
-                      <a:avLst/>
-                    </a:prstGeom>
-                    <a:noFill/>
-                    <a:ln>
-                      <a:noFill/>
-                    </a:ln>
-                  </pic:spPr>
-                </pic:pic>
-              </a:graphicData>
-            </a:graphic>
-          </wp:inline>
-        </w:drawing>
-      </w:r>
-    </w:p>
-    <w:p>
-      <w:r>
-        <w:t>Liczba 12 neuronów w jednej wartstwie ukrytej wykazuje się najniższym MSE oraz najwyższą dokładnością predykcji. Taka konfiguracja sieci została uznana za optymalną i stała się podstawą przy innych porównaniach</w:t>
-      </w:r>
-      <w:r>
-        <w:t>.</w:t>
-      </w:r>
-    </w:p>
-    <w:p>
-      <w:pPr>
-        <w:pStyle w:val="Heading2"/>
-        <w:rPr>
-          <w:b/>
-          <w:bCs/>
-        </w:rPr>
-      </w:pPr>
-      <w:r>
-        <w:rPr>
-          <w:b/>
-          <w:bCs/>
-        </w:rPr>
-        <w:t>Liczba warstw ukrytych</w:t>
-      </w:r>
-    </w:p>
-    <w:p>
-      <w:r>
-        <w:t>Zwiększenie głębokości sieci pozwala na tworzenie bardziej złożonych abstrakcji, ale niesie ryzyko przeuczenia (overfitting).</w:t>
-      </w:r>
-    </w:p>
-    <w:p>
-      <w:r>
-        <w:rPr>
-          <w:noProof/>
-        </w:rPr>
-        <w:drawing>
-          <wp:inline distT="0" distB="0" distL="0" distR="0" wp14:anchorId="01B2AC66" wp14:editId="3E8C7682">
-            <wp:extent cx="5065461" cy="3368040"/>
-            <wp:effectExtent l="0" t="0" r="1905" b="3810"/>
-            <wp:docPr id="1984555379" name="Picture 3"/>
-            <wp:cNvGraphicFramePr>
-              <a:graphicFrameLocks xmlns:a="http://schemas.openxmlformats.org/drawingml/2006/main" noChangeAspect="1"/>
-            </wp:cNvGraphicFramePr>
-            <a:graphic xmlns:a="http://schemas.openxmlformats.org/drawingml/2006/main">
-              <a:graphicData uri="http://schemas.openxmlformats.org/drawingml/2006/picture">
-                <pic:pic xmlns:pic="http://schemas.openxmlformats.org/drawingml/2006/picture">
-                  <pic:nvPicPr>
-                    <pic:cNvPr id="0" name="Picture 5"/>
-                    <pic:cNvPicPr>
-                      <a:picLocks noChangeAspect="1" noChangeArrowheads="1"/>
-                    </pic:cNvPicPr>
-                  </pic:nvPicPr>
-                  <pic:blipFill>
-                    <a:blip r:embed="rId8">
-                      <a:extLst>
-                        <a:ext uri="{28A0092B-C50C-407E-A947-70E740481C1C}">
-                          <a14:useLocalDpi xmlns:a14="http://schemas.microsoft.com/office/drawing/2010/main" val="0"/>
-                        </a:ext>
-                      </a:extLst>
-                    </a:blip>
-                    <a:srcRect/>
-                    <a:stretch>
-                      <a:fillRect/>
-                    </a:stretch>
-                  </pic:blipFill>
-                  <pic:spPr bwMode="auto">
-                    <a:xfrm>
-                      <a:off x="0" y="0"/>
-                      <a:ext cx="5070466" cy="3371368"/>
-                    </a:xfrm>
-                    <a:prstGeom prst="rect">
-                      <a:avLst/>
-                    </a:prstGeom>
-                    <a:noFill/>
-                    <a:ln>
-                      <a:noFill/>
-                    </a:ln>
-                  </pic:spPr>
-                </pic:pic>
-              </a:graphicData>
-            </a:graphic>
-          </wp:inline>
-        </w:drawing>
-      </w:r>
-    </w:p>
-    <w:p>
-      <w:r>
-        <w:lastRenderedPageBreak/>
-        <w:t>Wszystkie konfiguracje neuronów w dwóch warstwach ukrytych osiągały gorsze wyniki od sieci z jedną dwunastoneuronową warstwą. Z tego względu uznane zostało, że jedna warstwa z dwunastoma neuronami jest optymalnym układem sieci.</w:t>
-      </w:r>
-    </w:p>
-    <w:p>
-      <w:pPr>
-        <w:pStyle w:val="Heading2"/>
-        <w:rPr>
-          <w:b/>
-          <w:bCs/>
-        </w:rPr>
-      </w:pPr>
-      <w:r>
-        <w:rPr>
-          <w:b/>
-          <w:bCs/>
-        </w:rPr>
-        <w:t>Sposób inicjalizacji wag</w:t>
-      </w:r>
-    </w:p>
-    <w:p>
-      <w:r>
-        <w:t>Porównano inicjalizację losową na podstawie rozkładu normalnego o parametrach</w:t>
-      </w:r>
-      <w:r>
-        <w:t xml:space="preserve"> </w:t>
-      </w:r>
-      <m:oMath>
-        <m:r>
-          <w:rPr>
-            <w:rFonts w:ascii="Cambria Math" w:hAnsi="Cambria Math"/>
-          </w:rPr>
-          <m:t>μ=0</m:t>
-        </m:r>
-      </m:oMath>
-      <w:r>
-        <w:t>  i </w:t>
-      </w:r>
-      <m:oMath>
-        <m:r>
-          <w:rPr>
-            <w:rFonts w:ascii="Cambria Math" w:hAnsi="Cambria Math"/>
-          </w:rPr>
-          <m:t>σ=1</m:t>
-        </m:r>
-      </m:oMath>
-      <w:r>
-        <w:t>, rozkład jednostajny na przedziale</w:t>
-      </w:r>
-      <w:r>
-        <w:t xml:space="preserve"> [-0,5; 0,5]</w:t>
-      </w:r>
-      <w:r>
-        <w:t>  oraz</w:t>
-      </w:r>
-      <w:r>
-        <w:t xml:space="preserve"> przy użyciu</w:t>
-      </w:r>
-      <w:r>
-        <w:t xml:space="preserve"> metod</w:t>
-      </w:r>
-      <w:r>
-        <w:t>y</w:t>
-      </w:r>
-      <w:r>
-        <w:t xml:space="preserve"> Xaviera.</w:t>
-      </w:r>
-    </w:p>
-    <w:p>
-      <w:pPr>
-        <w:rPr>
-          <w:rFonts w:eastAsiaTheme="minorEastAsia"/>
-        </w:rPr>
-      </w:pPr>
-      <w:r>
-        <w:rPr>
-          <w:noProof/>
-        </w:rPr>
-        <w:drawing>
-          <wp:inline distT="0" distB="0" distL="0" distR="0" wp14:anchorId="2DAB2E93" wp14:editId="1B26839D">
-            <wp:extent cx="5760720" cy="3830320"/>
-            <wp:effectExtent l="0" t="0" r="0" b="0"/>
-            <wp:docPr id="1317223542" name="Picture 4"/>
-            <wp:cNvGraphicFramePr>
-              <a:graphicFrameLocks xmlns:a="http://schemas.openxmlformats.org/drawingml/2006/main" noChangeAspect="1"/>
-            </wp:cNvGraphicFramePr>
-            <a:graphic xmlns:a="http://schemas.openxmlformats.org/drawingml/2006/main">
-              <a:graphicData uri="http://schemas.openxmlformats.org/drawingml/2006/picture">
-                <pic:pic xmlns:pic="http://schemas.openxmlformats.org/drawingml/2006/picture">
-                  <pic:nvPicPr>
-                    <pic:cNvPr id="0" name="Picture 7"/>
                     <pic:cNvPicPr>
                       <a:picLocks noChangeAspect="1" noChangeArrowheads="1"/>
                     </pic:cNvPicPr>
@@ -16280,18 +16066,15 @@
     </w:p>
     <w:p>
       <w:r>
-        <w:t>Z powyższego wykresu wynika, iż rozkład jednostajny jest optymalną metodą. Na wykresie nie ma zawartego rozkładu na przedziale </w:t>
-      </w:r>
-      <w:r>
-        <w:t>[-1;1]</w:t>
-      </w:r>
-      <w:r>
-        <w:t>, lecz on również został pobity przez wyniki rozkładu oznaczonego czerwoną linią.</w:t>
+        <w:t>Liczba 12 neuronów w jednej wartstwie ukrytej wykazuje się najniższym MSE oraz najwyższą dokładnością predykcji. Taka konfiguracja sieci została uznana za optymalną i stała się podstawą przy innych porównaniach</w:t>
+      </w:r>
+      <w:r>
+        <w:t>.</w:t>
       </w:r>
     </w:p>
     <w:p>
       <w:pPr>
-        <w:pStyle w:val="Heading2"/>
+        <w:pStyle w:val="Nagwek2"/>
         <w:rPr>
           <w:b/>
           <w:bCs/>
@@ -16302,73 +16085,12 @@
           <w:b/>
           <w:bCs/>
         </w:rPr>
-        <w:t>Sposób normalizacji danych wejściowych</w:t>
+        <w:t>Liczba warstw ukrytych</w:t>
       </w:r>
     </w:p>
     <w:p>
-      <w:pPr>
-        <w:rPr>
-          <w:lang w:val="en-GB"/>
-        </w:rPr>
-      </w:pPr>
-      <w:r>
-        <w:t xml:space="preserve">Sieci neuronowe są wrażliwe na skalę danych wejściowych. </w:t>
-      </w:r>
-      <w:proofErr w:type="spellStart"/>
-      <w:r>
-        <w:rPr>
-          <w:lang w:val="en-GB"/>
-        </w:rPr>
-        <w:t>Porównano</w:t>
-      </w:r>
-      <w:proofErr w:type="spellEnd"/>
-      <w:r>
-        <w:rPr>
-          <w:lang w:val="en-GB"/>
-        </w:rPr>
-        <w:t>:</w:t>
-      </w:r>
-    </w:p>
-    <w:p>
-      <w:pPr>
-        <w:numPr>
-          <w:ilvl w:val="0"/>
-          <w:numId w:val="7"/>
-        </w:numPr>
-      </w:pPr>
-      <w:r>
-        <w:t>Min-Max Scaling (przesunięcie do zakresu </w:t>
-      </w:r>
-      <w:r>
-        <w:t>[0; 1]</w:t>
-      </w:r>
-      <w:r>
-        <w:t>)</w:t>
-      </w:r>
-    </w:p>
-    <w:p>
-      <w:pPr>
-        <w:numPr>
-          <w:ilvl w:val="0"/>
-          <w:numId w:val="7"/>
-        </w:numPr>
-        <w:rPr>
-          <w:lang w:val="en-GB"/>
-        </w:rPr>
-      </w:pPr>
-      <w:proofErr w:type="spellStart"/>
-      <w:r>
-        <w:rPr>
-          <w:lang w:val="en-GB"/>
-        </w:rPr>
-        <w:t>Standaryzację</w:t>
-      </w:r>
-      <w:proofErr w:type="spellEnd"/>
-      <w:r>
-        <w:rPr>
-          <w:lang w:val="en-GB"/>
-        </w:rPr>
-        <w:t xml:space="preserve"> (Z-score normalization).</w:t>
+      <w:r>
+        <w:t>Zwiększenie głębokości sieci pozwala na tworzenie bardziej złożonych abstrakcji, ale niesie ryzyko przeuczenia (overfitting).</w:t>
       </w:r>
     </w:p>
     <w:p>
@@ -16376,12 +16098,11 @@
         <w:rPr>
           <w:noProof/>
         </w:rPr>
-        <w:lastRenderedPageBreak/>
         <w:drawing>
-          <wp:inline distT="0" distB="0" distL="0" distR="0" wp14:anchorId="2F93D914" wp14:editId="55FBB333">
-            <wp:extent cx="5760720" cy="3830320"/>
-            <wp:effectExtent l="0" t="0" r="0" b="0"/>
-            <wp:docPr id="541020092" name="Picture 5"/>
+          <wp:inline distT="0" distB="0" distL="0" distR="0" wp14:anchorId="01B2AC66" wp14:editId="3E8C7682">
+            <wp:extent cx="5065461" cy="3368040"/>
+            <wp:effectExtent l="0" t="0" r="1905" b="3810"/>
+            <wp:docPr id="1984555379" name="Picture 3"/>
             <wp:cNvGraphicFramePr>
               <a:graphicFrameLocks xmlns:a="http://schemas.openxmlformats.org/drawingml/2006/main" noChangeAspect="1"/>
             </wp:cNvGraphicFramePr>
@@ -16389,13 +16110,143 @@
               <a:graphicData uri="http://schemas.openxmlformats.org/drawingml/2006/picture">
                 <pic:pic xmlns:pic="http://schemas.openxmlformats.org/drawingml/2006/picture">
                   <pic:nvPicPr>
-                    <pic:cNvPr id="0" name="Picture 9"/>
+                    <pic:cNvPr id="0" name="Picture 5"/>
                     <pic:cNvPicPr>
                       <a:picLocks noChangeAspect="1" noChangeArrowheads="1"/>
                     </pic:cNvPicPr>
                   </pic:nvPicPr>
                   <pic:blipFill>
                     <a:blip r:embed="rId10">
+                      <a:extLst>
+                        <a:ext uri="{28A0092B-C50C-407E-A947-70E740481C1C}">
+                          <a14:useLocalDpi xmlns:a14="http://schemas.microsoft.com/office/drawing/2010/main" val="0"/>
+                        </a:ext>
+                      </a:extLst>
+                    </a:blip>
+                    <a:srcRect/>
+                    <a:stretch>
+                      <a:fillRect/>
+                    </a:stretch>
+                  </pic:blipFill>
+                  <pic:spPr bwMode="auto">
+                    <a:xfrm>
+                      <a:off x="0" y="0"/>
+                      <a:ext cx="5070466" cy="3371368"/>
+                    </a:xfrm>
+                    <a:prstGeom prst="rect">
+                      <a:avLst/>
+                    </a:prstGeom>
+                    <a:noFill/>
+                    <a:ln>
+                      <a:noFill/>
+                    </a:ln>
+                  </pic:spPr>
+                </pic:pic>
+              </a:graphicData>
+            </a:graphic>
+          </wp:inline>
+        </w:drawing>
+      </w:r>
+    </w:p>
+    <w:p>
+      <w:r>
+        <w:lastRenderedPageBreak/>
+        <w:t>Wszystkie konfiguracje neuronów w dwóch warstwach ukrytych osiągały gorsze wyniki od sieci z jedną dwunastoneuronową warstwą. Z tego względu uznane zostało, że jedna warstwa z dwunastoma neuronami jest optymalnym układem sieci.</w:t>
+      </w:r>
+    </w:p>
+    <w:p>
+      <w:pPr>
+        <w:pStyle w:val="Nagwek2"/>
+        <w:rPr>
+          <w:b/>
+          <w:bCs/>
+        </w:rPr>
+      </w:pPr>
+      <w:r>
+        <w:rPr>
+          <w:b/>
+          <w:bCs/>
+        </w:rPr>
+        <w:t>Sposób inicjalizacji wag</w:t>
+      </w:r>
+    </w:p>
+    <w:p>
+      <w:r>
+        <w:t>Porównano inicjalizację losową na podstawie rozkładu normalnego o parametrach</w:t>
+      </w:r>
+      <w:r>
+        <w:t xml:space="preserve"> </w:t>
+      </w:r>
+      <m:oMath>
+        <m:r>
+          <w:rPr>
+            <w:rFonts w:ascii="Cambria Math" w:hAnsi="Cambria Math"/>
+          </w:rPr>
+          <m:t>μ=0</m:t>
+        </m:r>
+      </m:oMath>
+      <w:r>
+        <w:t>  i </w:t>
+      </w:r>
+      <m:oMath>
+        <m:r>
+          <w:rPr>
+            <w:rFonts w:ascii="Cambria Math" w:hAnsi="Cambria Math"/>
+          </w:rPr>
+          <m:t>σ=1</m:t>
+        </m:r>
+      </m:oMath>
+      <w:r>
+        <w:t>, rozkład jednostajny na przedziale</w:t>
+      </w:r>
+      <w:r>
+        <w:t xml:space="preserve"> [-0,5; 0,5]</w:t>
+      </w:r>
+      <w:r>
+        <w:t>  oraz</w:t>
+      </w:r>
+      <w:r>
+        <w:t xml:space="preserve"> przy użyciu</w:t>
+      </w:r>
+      <w:r>
+        <w:t xml:space="preserve"> metod</w:t>
+      </w:r>
+      <w:r>
+        <w:t>y</w:t>
+      </w:r>
+      <w:r>
+        <w:t xml:space="preserve"> Xaviera.</w:t>
+      </w:r>
+    </w:p>
+    <w:p>
+      <w:pPr>
+        <w:rPr>
+          <w:rFonts w:eastAsiaTheme="minorEastAsia"/>
+        </w:rPr>
+      </w:pPr>
+      <w:r>
+        <w:rPr>
+          <w:noProof/>
+        </w:rPr>
+        <w:drawing>
+          <wp:inline distT="0" distB="0" distL="0" distR="0" wp14:anchorId="2DAB2E93" wp14:editId="1B26839D">
+            <wp:extent cx="5760720" cy="3830320"/>
+            <wp:effectExtent l="0" t="0" r="0" b="0"/>
+            <wp:docPr id="1317223542" name="Picture 4"/>
+            <wp:cNvGraphicFramePr>
+              <a:graphicFrameLocks xmlns:a="http://schemas.openxmlformats.org/drawingml/2006/main" noChangeAspect="1"/>
+            </wp:cNvGraphicFramePr>
+            <a:graphic xmlns:a="http://schemas.openxmlformats.org/drawingml/2006/main">
+              <a:graphicData uri="http://schemas.openxmlformats.org/drawingml/2006/picture">
+                <pic:pic xmlns:pic="http://schemas.openxmlformats.org/drawingml/2006/picture">
+                  <pic:nvPicPr>
+                    <pic:cNvPr id="0" name="Picture 7"/>
+                    <pic:cNvPicPr>
+                      <a:picLocks noChangeAspect="1" noChangeArrowheads="1"/>
+                    </pic:cNvPicPr>
+                  </pic:nvPicPr>
+                  <pic:blipFill>
+                    <a:blip r:embed="rId11">
                       <a:extLst>
                         <a:ext uri="{28A0092B-C50C-407E-A947-70E740481C1C}">
                           <a14:useLocalDpi xmlns:a14="http://schemas.microsoft.com/office/drawing/2010/main" val="0"/>
@@ -16429,12 +16280,18 @@
     </w:p>
     <w:p>
       <w:r>
-        <w:t>Normalizacja do rozkładu normalnego o parametrach  i  okazała się optymalnym wyborem, który znacznie zmniejszał błąd sieci.</w:t>
+        <w:t>Z powyższego wykresu wynika, iż rozkład jednostajny jest optymalną metodą. Na wykresie nie ma zawartego rozkładu na przedziale </w:t>
+      </w:r>
+      <w:r>
+        <w:t>[-1;1]</w:t>
+      </w:r>
+      <w:r>
+        <w:t>, lecz on również został pobity przez wyniki rozkładu oznaczonego czerwoną linią.</w:t>
       </w:r>
     </w:p>
     <w:p>
       <w:pPr>
-        <w:pStyle w:val="Heading2"/>
+        <w:pStyle w:val="Nagwek2"/>
         <w:rPr>
           <w:b/>
           <w:bCs/>
@@ -16445,7 +16302,7 @@
           <w:b/>
           <w:bCs/>
         </w:rPr>
-        <w:t>Wybór danych wejściowych</w:t>
+        <w:t>Sposób normalizacji danych wejściowych</w:t>
       </w:r>
     </w:p>
     <w:p>
@@ -16455,6 +16312,149 @@
         </w:rPr>
       </w:pPr>
       <w:r>
+        <w:t xml:space="preserve">Sieci neuronowe są wrażliwe na skalę danych wejściowych. </w:t>
+      </w:r>
+      <w:proofErr w:type="spellStart"/>
+      <w:r>
+        <w:rPr>
+          <w:lang w:val="en-GB"/>
+        </w:rPr>
+        <w:t>Porównano</w:t>
+      </w:r>
+      <w:proofErr w:type="spellEnd"/>
+      <w:r>
+        <w:rPr>
+          <w:lang w:val="en-GB"/>
+        </w:rPr>
+        <w:t>:</w:t>
+      </w:r>
+    </w:p>
+    <w:p>
+      <w:pPr>
+        <w:numPr>
+          <w:ilvl w:val="0"/>
+          <w:numId w:val="7"/>
+        </w:numPr>
+      </w:pPr>
+      <w:r>
+        <w:t>Min-Max Scaling (przesunięcie do zakresu </w:t>
+      </w:r>
+      <w:r>
+        <w:t>[0; 1]</w:t>
+      </w:r>
+      <w:r>
+        <w:t>)</w:t>
+      </w:r>
+    </w:p>
+    <w:p>
+      <w:pPr>
+        <w:numPr>
+          <w:ilvl w:val="0"/>
+          <w:numId w:val="7"/>
+        </w:numPr>
+        <w:rPr>
+          <w:lang w:val="en-GB"/>
+        </w:rPr>
+      </w:pPr>
+      <w:proofErr w:type="spellStart"/>
+      <w:r>
+        <w:rPr>
+          <w:lang w:val="en-GB"/>
+        </w:rPr>
+        <w:t>Standaryzację</w:t>
+      </w:r>
+      <w:proofErr w:type="spellEnd"/>
+      <w:r>
+        <w:rPr>
+          <w:lang w:val="en-GB"/>
+        </w:rPr>
+        <w:t xml:space="preserve"> (Z-score normalization).</w:t>
+      </w:r>
+    </w:p>
+    <w:p>
+      <w:r>
+        <w:rPr>
+          <w:noProof/>
+        </w:rPr>
+        <w:lastRenderedPageBreak/>
+        <w:drawing>
+          <wp:inline distT="0" distB="0" distL="0" distR="0" wp14:anchorId="2F93D914" wp14:editId="55FBB333">
+            <wp:extent cx="5760720" cy="3830320"/>
+            <wp:effectExtent l="0" t="0" r="0" b="0"/>
+            <wp:docPr id="541020092" name="Picture 5"/>
+            <wp:cNvGraphicFramePr>
+              <a:graphicFrameLocks xmlns:a="http://schemas.openxmlformats.org/drawingml/2006/main" noChangeAspect="1"/>
+            </wp:cNvGraphicFramePr>
+            <a:graphic xmlns:a="http://schemas.openxmlformats.org/drawingml/2006/main">
+              <a:graphicData uri="http://schemas.openxmlformats.org/drawingml/2006/picture">
+                <pic:pic xmlns:pic="http://schemas.openxmlformats.org/drawingml/2006/picture">
+                  <pic:nvPicPr>
+                    <pic:cNvPr id="0" name="Picture 9"/>
+                    <pic:cNvPicPr>
+                      <a:picLocks noChangeAspect="1" noChangeArrowheads="1"/>
+                    </pic:cNvPicPr>
+                  </pic:nvPicPr>
+                  <pic:blipFill>
+                    <a:blip r:embed="rId12">
+                      <a:extLst>
+                        <a:ext uri="{28A0092B-C50C-407E-A947-70E740481C1C}">
+                          <a14:useLocalDpi xmlns:a14="http://schemas.microsoft.com/office/drawing/2010/main" val="0"/>
+                        </a:ext>
+                      </a:extLst>
+                    </a:blip>
+                    <a:srcRect/>
+                    <a:stretch>
+                      <a:fillRect/>
+                    </a:stretch>
+                  </pic:blipFill>
+                  <pic:spPr bwMode="auto">
+                    <a:xfrm>
+                      <a:off x="0" y="0"/>
+                      <a:ext cx="5760720" cy="3830320"/>
+                    </a:xfrm>
+                    <a:prstGeom prst="rect">
+                      <a:avLst/>
+                    </a:prstGeom>
+                    <a:noFill/>
+                    <a:ln>
+                      <a:noFill/>
+                    </a:ln>
+                  </pic:spPr>
+                </pic:pic>
+              </a:graphicData>
+            </a:graphic>
+          </wp:inline>
+        </w:drawing>
+      </w:r>
+    </w:p>
+    <w:p>
+      <w:r>
+        <w:t>Normalizacja do rozkładu normalnego o parametrach  i  okazała się optymalnym wyborem, który znacznie zmniejszał błąd sieci.</w:t>
+      </w:r>
+    </w:p>
+    <w:p>
+      <w:pPr>
+        <w:pStyle w:val="Nagwek2"/>
+        <w:rPr>
+          <w:b/>
+          <w:bCs/>
+        </w:rPr>
+      </w:pPr>
+      <w:r>
+        <w:rPr>
+          <w:b/>
+          <w:bCs/>
+        </w:rPr>
+        <w:t>Wybór danych wejściowych</w:t>
+      </w:r>
+    </w:p>
+    <w:p>
+      <w:pPr>
+        <w:rPr>
+          <w:lang w:val="en-GB"/>
+        </w:rPr>
+      </w:pPr>
+      <w:r>
         <w:t xml:space="preserve">Przeanalizowano, jak wybór różnych danych wejściowych wpływa na dokładność przewidywań sieci neuronowej. </w:t>
       </w:r>
       <w:proofErr w:type="spellStart"/>
@@ -16497,21 +16497,7 @@
         <w:rPr>
           <w:lang w:val="en-GB"/>
         </w:rPr>
-        <w:t xml:space="preserve"> </w:t>
-      </w:r>
-      <w:proofErr w:type="gramStart"/>
-      <w:r>
-        <w:rPr>
-          <w:lang w:val="en-GB"/>
-        </w:rPr>
-        <w:t>to:</w:t>
-      </w:r>
-      <w:proofErr w:type="gramEnd"/>
-      <w:r>
-        <w:rPr>
-          <w:lang w:val="en-GB"/>
-        </w:rPr>
-        <w:t xml:space="preserve"> 1. Class, online boarding, seat comfort, inflight entertainment </w:t>
+        <w:t xml:space="preserve"> to: 1. Class, online boarding, seat comfort, inflight entertainment </w:t>
       </w:r>
       <w:proofErr w:type="spellStart"/>
       <w:r>
@@ -16599,7 +16585,7 @@
                     </pic:cNvPicPr>
                   </pic:nvPicPr>
                   <pic:blipFill>
-                    <a:blip r:embed="rId11">
+                    <a:blip r:embed="rId13">
                       <a:extLst>
                         <a:ext uri="{28A0092B-C50C-407E-A947-70E740481C1C}">
                           <a14:useLocalDpi xmlns:a14="http://schemas.microsoft.com/office/drawing/2010/main" val="0"/>
@@ -16638,7 +16624,7 @@
     </w:p>
     <w:p>
       <w:pPr>
-        <w:pStyle w:val="Heading2"/>
+        <w:pStyle w:val="Nagwek2"/>
         <w:rPr>
           <w:b/>
           <w:bCs/>
@@ -16698,7 +16684,7 @@
                     </pic:cNvPicPr>
                   </pic:nvPicPr>
                   <pic:blipFill>
-                    <a:blip r:embed="rId12">
+                    <a:blip r:embed="rId14">
                       <a:extLst>
                         <a:ext uri="{28A0092B-C50C-407E-A947-70E740481C1C}">
                           <a14:useLocalDpi xmlns:a14="http://schemas.microsoft.com/office/drawing/2010/main" val="0"/>
@@ -16757,7 +16743,7 @@
     <w:p/>
     <w:p>
       <w:pPr>
-        <w:pStyle w:val="Heading2"/>
+        <w:pStyle w:val="Nagwek2"/>
         <w:rPr>
           <w:b/>
           <w:bCs/>
@@ -16799,7 +16785,7 @@
                     </pic:cNvPicPr>
                   </pic:nvPicPr>
                   <pic:blipFill>
-                    <a:blip r:embed="rId13">
+                    <a:blip r:embed="rId15">
                       <a:extLst>
                         <a:ext uri="{28A0092B-C50C-407E-A947-70E740481C1C}">
                           <a14:useLocalDpi xmlns:a14="http://schemas.microsoft.com/office/drawing/2010/main" val="0"/>
@@ -16848,6 +16834,2701 @@
         <w:t>%, czyli najlepszym wynikiem uzyskanym przez własnoręcznie napisaną sieć neuronową.</w:t>
       </w:r>
     </w:p>
+    <w:p>
+      <w:r>
+        <w:br w:type="page"/>
+      </w:r>
+    </w:p>
+    <w:p>
+      <w:pPr>
+        <w:pStyle w:val="Tytu"/>
+      </w:pPr>
+      <w:r>
+        <w:lastRenderedPageBreak/>
+        <w:t>Sztuczne sieci neuronowe, część 2.</w:t>
+      </w:r>
+    </w:p>
+    <w:p>
+      <w:pPr>
+        <w:pStyle w:val="Nagwek1"/>
+        <w:numPr>
+          <w:ilvl w:val="0"/>
+          <w:numId w:val="8"/>
+        </w:numPr>
+      </w:pPr>
+      <w:r>
+        <w:t>Opis problemu</w:t>
+      </w:r>
+    </w:p>
+    <w:p>
+      <w:pPr>
+        <w:jc w:val="both"/>
+      </w:pPr>
+      <w:r>
+        <w:t xml:space="preserve">Problemem podjętym w ramach projektu jest prognozowanie szeregów czasowych na przykładzie notowań giełdowych spółki </w:t>
+      </w:r>
+      <w:proofErr w:type="spellStart"/>
+      <w:r>
+        <w:t>PayPal</w:t>
+      </w:r>
+      <w:proofErr w:type="spellEnd"/>
+      <w:r>
+        <w:t xml:space="preserve"> Holdings, Inc. (PYPL). Zaimplementowano sieć neuronową typu MLP, na podstawie sieci do klasyfikacji z pierwszej części projektu, ze znaczącymi modyfikacjami, aby nadawała się do problemu regresji. Dane giełdowe, pobrane z serwisu Yahoo Finance, zawierają ceny: otwarcia, zamknięcia, najwyższą, najniższą oraz wolumen. Dane zawierają 2703 rekordy z zakresu od 6 czerwca 2015 do 2 kwietnia 2026.</w:t>
+      </w:r>
+      <w:r>
+        <w:t xml:space="preserve"> Na podstawie wyżej wymienionych zmiennych przewidywana jest cena zamknięcia na dzień następny.</w:t>
+      </w:r>
+    </w:p>
+    <w:p>
+      <w:pPr>
+        <w:pStyle w:val="Nagwek1"/>
+        <w:numPr>
+          <w:ilvl w:val="0"/>
+          <w:numId w:val="8"/>
+        </w:numPr>
+      </w:pPr>
+      <w:bookmarkStart w:id="0" w:name="_Inne_opracowania"/>
+      <w:bookmarkEnd w:id="0"/>
+      <w:r>
+        <w:t>Inne opracowania</w:t>
+      </w:r>
+    </w:p>
+    <w:p>
+      <w:pPr>
+        <w:jc w:val="both"/>
+      </w:pPr>
+      <w:r>
+        <w:t xml:space="preserve">Wyniki porównywane będą z </w:t>
+      </w:r>
+      <w:r>
+        <w:t xml:space="preserve">tymi z </w:t>
+      </w:r>
+      <w:r>
+        <w:t>opracowa</w:t>
+      </w:r>
+      <w:r>
+        <w:t xml:space="preserve">ń </w:t>
+      </w:r>
+      <w:hyperlink r:id="rId16" w:history="1">
+        <w:proofErr w:type="spellStart"/>
+        <w:r>
+          <w:rPr>
+            <w:rStyle w:val="Hipercze"/>
+            <w:i/>
+            <w:iCs/>
+          </w:rPr>
+          <w:t>Intro</w:t>
+        </w:r>
+        <w:proofErr w:type="spellEnd"/>
+        <w:r>
+          <w:rPr>
+            <w:rStyle w:val="Hipercze"/>
+            <w:i/>
+            <w:iCs/>
+          </w:rPr>
+          <w:t xml:space="preserve"> to </w:t>
+        </w:r>
+        <w:proofErr w:type="spellStart"/>
+        <w:r>
+          <w:rPr>
+            <w:rStyle w:val="Hipercze"/>
+            <w:i/>
+            <w:iCs/>
+          </w:rPr>
+          <w:t>Recurrent</w:t>
+        </w:r>
+        <w:proofErr w:type="spellEnd"/>
+        <w:r>
+          <w:rPr>
+            <w:rStyle w:val="Hipercze"/>
+            <w:i/>
+            <w:iCs/>
+          </w:rPr>
+          <w:t xml:space="preserve"> </w:t>
+        </w:r>
+        <w:proofErr w:type="spellStart"/>
+        <w:r>
+          <w:rPr>
+            <w:rStyle w:val="Hipercze"/>
+            <w:i/>
+            <w:iCs/>
+          </w:rPr>
+          <w:t>Neural</w:t>
+        </w:r>
+        <w:proofErr w:type="spellEnd"/>
+        <w:r>
+          <w:rPr>
+            <w:rStyle w:val="Hipercze"/>
+            <w:i/>
+            <w:iCs/>
+          </w:rPr>
+          <w:t xml:space="preserve"> Networks LSTM | GRU</w:t>
+        </w:r>
+      </w:hyperlink>
+      <w:r>
+        <w:t xml:space="preserve"> oraz </w:t>
+      </w:r>
+      <w:hyperlink r:id="rId17" w:history="1">
+        <w:r>
+          <w:rPr>
+            <w:rStyle w:val="Hipercze"/>
+            <w:i/>
+            <w:iCs/>
+          </w:rPr>
+          <w:t xml:space="preserve">Tesla Stock </w:t>
+        </w:r>
+        <w:proofErr w:type="spellStart"/>
+        <w:r>
+          <w:rPr>
+            <w:rStyle w:val="Hipercze"/>
+            <w:i/>
+            <w:iCs/>
+          </w:rPr>
+          <w:t>Forecasting</w:t>
+        </w:r>
+        <w:proofErr w:type="spellEnd"/>
+        <w:r>
+          <w:rPr>
+            <w:rStyle w:val="Hipercze"/>
+            <w:i/>
+            <w:iCs/>
+          </w:rPr>
+          <w:t xml:space="preserve"> </w:t>
+        </w:r>
+        <w:r>
+          <w:rPr>
+            <w:rStyle w:val="Hipercze"/>
+            <w:rFonts w:ascii="Segoe UI Emoji" w:hAnsi="Segoe UI Emoji" w:cs="Segoe UI Emoji"/>
+            <w:i/>
+            <w:iCs/>
+          </w:rPr>
+          <w:t>📈</w:t>
+        </w:r>
+        <w:r>
+          <w:rPr>
+            <w:rStyle w:val="Hipercze"/>
+            <w:i/>
+            <w:iCs/>
+          </w:rPr>
+          <w:t xml:space="preserve"> Multi-Step </w:t>
+        </w:r>
+        <w:proofErr w:type="spellStart"/>
+        <w:r>
+          <w:rPr>
+            <w:rStyle w:val="Hipercze"/>
+            <w:i/>
+            <w:iCs/>
+          </w:rPr>
+          <w:t>Stacked</w:t>
+        </w:r>
+        <w:proofErr w:type="spellEnd"/>
+        <w:r>
+          <w:rPr>
+            <w:rStyle w:val="Hipercze"/>
+            <w:i/>
+            <w:iCs/>
+          </w:rPr>
+          <w:t xml:space="preserve"> LSTM</w:t>
+        </w:r>
+      </w:hyperlink>
+      <w:r>
+        <w:t xml:space="preserve"> </w:t>
+      </w:r>
+      <w:r>
+        <w:t xml:space="preserve">z serwisu </w:t>
+      </w:r>
+      <w:proofErr w:type="spellStart"/>
+      <w:r>
+        <w:t>Kaggle</w:t>
+      </w:r>
+      <w:proofErr w:type="spellEnd"/>
+      <w:r>
+        <w:t>. Opracowania</w:t>
+      </w:r>
+      <w:r>
+        <w:t xml:space="preserve"> </w:t>
+      </w:r>
+      <w:r>
+        <w:t xml:space="preserve">te </w:t>
+      </w:r>
+      <w:r>
+        <w:t>opisuj</w:t>
+      </w:r>
+      <w:r>
+        <w:t>ą</w:t>
+      </w:r>
+      <w:r>
+        <w:t xml:space="preserve"> nieco</w:t>
+      </w:r>
+      <w:r>
+        <w:t xml:space="preserve"> inne, </w:t>
+      </w:r>
+      <w:r>
+        <w:t>również oparte na sieciach neuronowych, choć innego typu</w:t>
+      </w:r>
+      <w:r>
+        <w:t xml:space="preserve">, podejście do problemu przewidywania notowań giełdowych. </w:t>
+      </w:r>
+    </w:p>
+    <w:p>
+      <w:pPr>
+        <w:pStyle w:val="Nagwek1"/>
+        <w:numPr>
+          <w:ilvl w:val="0"/>
+          <w:numId w:val="8"/>
+        </w:numPr>
+      </w:pPr>
+      <w:r>
+        <w:t>Analiza</w:t>
+      </w:r>
+    </w:p>
+    <w:p>
+      <w:pPr>
+        <w:pStyle w:val="Nagwek2"/>
+      </w:pPr>
+      <w:r>
+        <w:t>Parametry</w:t>
+      </w:r>
+    </w:p>
+    <w:p>
+      <w:pPr>
+        <w:jc w:val="both"/>
+      </w:pPr>
+      <w:r>
+        <w:t>Testowanymi parametrami były:</w:t>
+      </w:r>
+    </w:p>
+    <w:p>
+      <w:pPr>
+        <w:pStyle w:val="Akapitzlist"/>
+        <w:numPr>
+          <w:ilvl w:val="0"/>
+          <w:numId w:val="10"/>
+        </w:numPr>
+        <w:jc w:val="both"/>
+      </w:pPr>
+      <w:r>
+        <w:t>Liczba neuronów pierwszej warstwy ukrytej (4, 8, 12, 16)</w:t>
+      </w:r>
+    </w:p>
+    <w:p>
+      <w:pPr>
+        <w:pStyle w:val="Akapitzlist"/>
+        <w:numPr>
+          <w:ilvl w:val="0"/>
+          <w:numId w:val="10"/>
+        </w:numPr>
+        <w:jc w:val="both"/>
+      </w:pPr>
+      <w:r>
+        <w:t>Szybkość uczenia (</w:t>
+      </w:r>
+      <w:r>
+        <w:rPr>
+          <w:i/>
+          <w:iCs/>
+        </w:rPr>
+        <w:t xml:space="preserve">learning </w:t>
+      </w:r>
+      <w:proofErr w:type="spellStart"/>
+      <w:r>
+        <w:rPr>
+          <w:i/>
+          <w:iCs/>
+        </w:rPr>
+        <w:t>rate</w:t>
+      </w:r>
+      <w:proofErr w:type="spellEnd"/>
+      <w:r>
+        <w:t>; 0.01, 0.05, 0.1, 0.3)</w:t>
+      </w:r>
+    </w:p>
+    <w:p>
+      <w:pPr>
+        <w:pStyle w:val="Akapitzlist"/>
+        <w:numPr>
+          <w:ilvl w:val="0"/>
+          <w:numId w:val="10"/>
+        </w:numPr>
+        <w:jc w:val="both"/>
+      </w:pPr>
+      <w:r>
+        <w:t>Liczba epok (</w:t>
+      </w:r>
+      <w:proofErr w:type="spellStart"/>
+      <w:r>
+        <w:rPr>
+          <w:i/>
+          <w:iCs/>
+        </w:rPr>
+        <w:t>epochs</w:t>
+      </w:r>
+      <w:proofErr w:type="spellEnd"/>
+      <w:r>
+        <w:t>; 500, 1000, 2000, 5000)</w:t>
+      </w:r>
+    </w:p>
+    <w:p>
+      <w:pPr>
+        <w:pStyle w:val="Akapitzlist"/>
+        <w:numPr>
+          <w:ilvl w:val="0"/>
+          <w:numId w:val="10"/>
+        </w:numPr>
+        <w:jc w:val="both"/>
+      </w:pPr>
+      <w:r>
+        <w:t>Zakres inicjalizacji wag (0.1, 0.3, 0.5, 1)</w:t>
+      </w:r>
+    </w:p>
+    <w:p>
+      <w:pPr>
+        <w:pStyle w:val="Akapitzlist"/>
+        <w:numPr>
+          <w:ilvl w:val="0"/>
+          <w:numId w:val="10"/>
+        </w:numPr>
+        <w:jc w:val="both"/>
+      </w:pPr>
+      <w:r>
+        <w:t>Podział zbioru na dane treningowe i testowe (</w:t>
+      </w:r>
+      <w:proofErr w:type="spellStart"/>
+      <w:r>
+        <w:rPr>
+          <w:i/>
+          <w:iCs/>
+        </w:rPr>
+        <w:t>train</w:t>
+      </w:r>
+      <w:proofErr w:type="spellEnd"/>
+      <w:r>
+        <w:rPr>
+          <w:i/>
+          <w:iCs/>
+        </w:rPr>
+        <w:t xml:space="preserve"> test </w:t>
+      </w:r>
+      <w:proofErr w:type="spellStart"/>
+      <w:r>
+        <w:rPr>
+          <w:i/>
+          <w:iCs/>
+        </w:rPr>
+        <w:t>split</w:t>
+      </w:r>
+      <w:proofErr w:type="spellEnd"/>
+      <w:r>
+        <w:t>; 60-40, 70-30, 80-20, 90-10)</w:t>
+      </w:r>
+    </w:p>
+    <w:p>
+      <w:pPr>
+        <w:pStyle w:val="Akapitzlist"/>
+        <w:numPr>
+          <w:ilvl w:val="0"/>
+          <w:numId w:val="10"/>
+        </w:numPr>
+        <w:jc w:val="both"/>
+      </w:pPr>
+      <w:r>
+        <w:t>Funkcje aktywacji (</w:t>
+      </w:r>
+      <w:proofErr w:type="spellStart"/>
+      <w:r>
+        <w:t>sigmoid</w:t>
+      </w:r>
+      <w:proofErr w:type="spellEnd"/>
+      <w:r>
+        <w:t xml:space="preserve">, </w:t>
+      </w:r>
+      <w:proofErr w:type="spellStart"/>
+      <w:r>
+        <w:t>tanh</w:t>
+      </w:r>
+      <w:proofErr w:type="spellEnd"/>
+      <w:r>
+        <w:t xml:space="preserve">, </w:t>
+      </w:r>
+      <w:proofErr w:type="spellStart"/>
+      <w:r>
+        <w:t>ReLU</w:t>
+      </w:r>
+      <w:proofErr w:type="spellEnd"/>
+      <w:r>
+        <w:t xml:space="preserve">, </w:t>
+      </w:r>
+      <w:proofErr w:type="spellStart"/>
+      <w:r>
+        <w:t>leaky</w:t>
+      </w:r>
+      <w:proofErr w:type="spellEnd"/>
+      <w:r>
+        <w:t xml:space="preserve"> </w:t>
+      </w:r>
+      <w:proofErr w:type="spellStart"/>
+      <w:r>
+        <w:t>ReLU</w:t>
+      </w:r>
+      <w:proofErr w:type="spellEnd"/>
+      <w:r>
+        <w:t>)</w:t>
+      </w:r>
+    </w:p>
+    <w:p>
+      <w:pPr>
+        <w:pStyle w:val="Akapitzlist"/>
+        <w:numPr>
+          <w:ilvl w:val="0"/>
+          <w:numId w:val="10"/>
+        </w:numPr>
+        <w:jc w:val="both"/>
+      </w:pPr>
+      <w:r>
+        <w:t>Liczba warstw ukrytych</w:t>
+      </w:r>
+      <w:r>
+        <w:t xml:space="preserve"> (1, 2)</w:t>
+      </w:r>
+    </w:p>
+    <w:p>
+      <w:pPr>
+        <w:pStyle w:val="Akapitzlist"/>
+        <w:numPr>
+          <w:ilvl w:val="0"/>
+          <w:numId w:val="10"/>
+        </w:numPr>
+        <w:jc w:val="both"/>
+      </w:pPr>
+      <w:r>
+        <w:t>Liczba neuronów drugiej warstwy ukrytej (4, 8, 12, 16)</w:t>
+      </w:r>
+    </w:p>
+    <w:p>
+      <w:pPr>
+        <w:jc w:val="both"/>
+      </w:pPr>
+      <w:r>
+        <w:t xml:space="preserve">Parametrami bazowymi były kolejno: 8, 0.1, 1000, 0.5, 80-20, </w:t>
+      </w:r>
+      <w:proofErr w:type="spellStart"/>
+      <w:r>
+        <w:t>sigmoid</w:t>
+      </w:r>
+      <w:proofErr w:type="spellEnd"/>
+      <w:r>
+        <w:t>, 1, 4 (nieistotne, gdyż w tym przypadku jest tylko 1 warstwa ukryta).</w:t>
+      </w:r>
+    </w:p>
+    <w:p>
+      <w:pPr>
+        <w:jc w:val="both"/>
+      </w:pPr>
+      <w:r>
+        <w:t>W przypadku sieci z dwiema warstwami ukrytymi zwiększono liczbę epok do 2000.</w:t>
+      </w:r>
+    </w:p>
+    <w:p>
+      <w:pPr>
+        <w:jc w:val="both"/>
+      </w:pPr>
+      <w:r>
+        <w:t>Ponieważ uczenie sieci neuronowej nie jest procesem deterministycznym, dla każdego zestawu parametrów sieć wyszkolono kilkukrotnie oraz przedstawiono</w:t>
+      </w:r>
+      <w:r>
+        <w:t xml:space="preserve"> na wykresach</w:t>
+      </w:r>
+      <w:r>
+        <w:t xml:space="preserve"> </w:t>
+      </w:r>
+      <w:r>
+        <w:t xml:space="preserve">słupkowych </w:t>
+      </w:r>
+      <w:r>
+        <w:t>wartości średnie</w:t>
+      </w:r>
+      <w:r>
+        <w:t xml:space="preserve"> MAPE predykcji na zbiorze testowym</w:t>
+      </w:r>
+      <w:r>
+        <w:t xml:space="preserve">, wraz z ich </w:t>
+      </w:r>
+      <w:r>
+        <w:t>błędem standardowym, oznaczonym „wąsem”.</w:t>
+      </w:r>
+    </w:p>
+    <w:p>
+      <w:pPr>
+        <w:pStyle w:val="Nagwek2"/>
+      </w:pPr>
+      <w:r>
+        <w:lastRenderedPageBreak/>
+        <w:t>Wyniki</w:t>
+      </w:r>
+    </w:p>
+    <w:p>
+      <w:pPr>
+        <w:pStyle w:val="Nagwek3"/>
+        <w:numPr>
+          <w:ilvl w:val="0"/>
+          <w:numId w:val="11"/>
+        </w:numPr>
+      </w:pPr>
+      <w:r>
+        <w:t>Liczba neuronów pierwszej warstwy ukrytej</w:t>
+      </w:r>
+    </w:p>
+    <w:p>
+      <w:r>
+        <w:rPr>
+          <w:noProof/>
+        </w:rPr>
+        <w:drawing>
+          <wp:inline distT="0" distB="0" distL="0" distR="0" wp14:anchorId="3D145467" wp14:editId="7ECD2274">
+            <wp:extent cx="5760720" cy="3596640"/>
+            <wp:effectExtent l="0" t="0" r="0" b="3810"/>
+            <wp:docPr id="2092438025" name="Obraz 1"/>
+            <wp:cNvGraphicFramePr>
+              <a:graphicFrameLocks xmlns:a="http://schemas.openxmlformats.org/drawingml/2006/main" noChangeAspect="1"/>
+            </wp:cNvGraphicFramePr>
+            <a:graphic xmlns:a="http://schemas.openxmlformats.org/drawingml/2006/main">
+              <a:graphicData uri="http://schemas.openxmlformats.org/drawingml/2006/picture">
+                <pic:pic xmlns:pic="http://schemas.openxmlformats.org/drawingml/2006/picture">
+                  <pic:nvPicPr>
+                    <pic:cNvPr id="0" name="Picture 1"/>
+                    <pic:cNvPicPr>
+                      <a:picLocks noChangeAspect="1" noChangeArrowheads="1"/>
+                    </pic:cNvPicPr>
+                  </pic:nvPicPr>
+                  <pic:blipFill>
+                    <a:blip r:embed="rId18" cstate="print">
+                      <a:extLst>
+                        <a:ext uri="{28A0092B-C50C-407E-A947-70E740481C1C}">
+                          <a14:useLocalDpi xmlns:a14="http://schemas.microsoft.com/office/drawing/2010/main" val="0"/>
+                        </a:ext>
+                      </a:extLst>
+                    </a:blip>
+                    <a:srcRect/>
+                    <a:stretch>
+                      <a:fillRect/>
+                    </a:stretch>
+                  </pic:blipFill>
+                  <pic:spPr bwMode="auto">
+                    <a:xfrm>
+                      <a:off x="0" y="0"/>
+                      <a:ext cx="5760720" cy="3596640"/>
+                    </a:xfrm>
+                    <a:prstGeom prst="rect">
+                      <a:avLst/>
+                    </a:prstGeom>
+                    <a:noFill/>
+                    <a:ln>
+                      <a:noFill/>
+                    </a:ln>
+                  </pic:spPr>
+                </pic:pic>
+              </a:graphicData>
+            </a:graphic>
+          </wp:inline>
+        </w:drawing>
+      </w:r>
+    </w:p>
+    <w:p>
+      <w:r>
+        <w:t xml:space="preserve">Widać wyraźnie, że dokładność modelu rośnie wraz ze wzrostem liczby neuronów, do pewnego momentu. Przy 12 neuronach zaobserwowano najniższą wartość MAPE, jak i najmniejszy rozrzut wartości tego błędu. Przy 16 neuronach błąd jest porównywalny do tego przy 8 neuronach. Może to być spowodowane zjawiskiem przeszkolenia sieci – sieć nauczyła się </w:t>
+      </w:r>
+      <w:r>
+        <w:t>szumu i detali charakterystycznych występujących w zbiorze treningowym, które są inne w zbiorze testowym, więc straciła zdolność generalizacji.</w:t>
+      </w:r>
+    </w:p>
+    <w:p>
+      <w:r>
+        <w:t xml:space="preserve">Wyjątkowo dla tego parametru przedstawione zostaną również </w:t>
+      </w:r>
+      <w:r>
+        <w:t xml:space="preserve">wartości MSE dla danych znormalizowanych, RMSE w dolarach oraz MAPE w tabeli. Dla pozostałych parametrów nie zostanie to zawarte w sprawozdaniu, gdyż zajmuje to dużo miejsca. Tabele takie można stworzyć za pomocą linii 227-230 w pliku </w:t>
+      </w:r>
+      <w:proofErr w:type="spellStart"/>
+      <w:r>
+        <w:t>R_Regression</w:t>
+      </w:r>
+      <w:proofErr w:type="spellEnd"/>
+      <w:r>
+        <w:t>/</w:t>
+      </w:r>
+      <w:proofErr w:type="spellStart"/>
+      <w:r>
+        <w:t>main.R</w:t>
+      </w:r>
+      <w:proofErr w:type="spellEnd"/>
+      <w:r>
+        <w:t>, zmieniając nazwę parametru w linii 228.</w:t>
+      </w:r>
+    </w:p>
+    <w:tbl>
+      <w:tblPr>
+        <w:tblStyle w:val="Tabela-Siatka"/>
+        <w:tblW w:w="0" w:type="auto"/>
+        <w:tblLook w:val="04A0" w:firstRow="1" w:lastRow="0" w:firstColumn="1" w:lastColumn="0" w:noHBand="0" w:noVBand="1"/>
+      </w:tblPr>
+      <w:tblGrid>
+        <w:gridCol w:w="990"/>
+        <w:gridCol w:w="727"/>
+        <w:gridCol w:w="1996"/>
+        <w:gridCol w:w="2087"/>
+        <w:gridCol w:w="1631"/>
+        <w:gridCol w:w="1631"/>
+      </w:tblGrid>
+      <w:tr>
+        <w:trPr>
+          <w:trHeight w:val="288"/>
+        </w:trPr>
+        <w:tc>
+          <w:tcPr>
+            <w:tcW w:w="876" w:type="dxa"/>
+            <w:noWrap/>
+            <w:hideMark/>
+          </w:tcPr>
+          <w:p>
+            <w:r>
+              <w:t>Param</w:t>
+            </w:r>
+          </w:p>
+        </w:tc>
+        <w:tc>
+          <w:tcPr>
+            <w:tcW w:w="875" w:type="dxa"/>
+            <w:noWrap/>
+            <w:hideMark/>
+          </w:tcPr>
+          <w:p>
+            <w:r>
+              <w:t>Val</w:t>
+            </w:r>
+          </w:p>
+        </w:tc>
+        <w:tc>
+          <w:tcPr>
+            <w:tcW w:w="2008" w:type="dxa"/>
+            <w:noWrap/>
+            <w:hideMark/>
+          </w:tcPr>
+          <w:p>
+            <w:proofErr w:type="spellStart"/>
+            <w:r>
+              <w:t>Train_MSE_norm</w:t>
+            </w:r>
+            <w:proofErr w:type="spellEnd"/>
+          </w:p>
+        </w:tc>
+        <w:tc>
+          <w:tcPr>
+            <w:tcW w:w="2109" w:type="dxa"/>
+            <w:noWrap/>
+            <w:hideMark/>
+          </w:tcPr>
+          <w:p>
+            <w:proofErr w:type="spellStart"/>
+            <w:r>
+              <w:t>Test_MSE_norm</w:t>
+            </w:r>
+            <w:proofErr w:type="spellEnd"/>
+          </w:p>
+        </w:tc>
+        <w:tc>
+          <w:tcPr>
+            <w:tcW w:w="1602" w:type="dxa"/>
+            <w:noWrap/>
+            <w:hideMark/>
+          </w:tcPr>
+          <w:p>
+            <w:proofErr w:type="spellStart"/>
+            <w:r>
+              <w:t>Test_RMSE_USD</w:t>
+            </w:r>
+            <w:proofErr w:type="spellEnd"/>
+          </w:p>
+        </w:tc>
+        <w:tc>
+          <w:tcPr>
+            <w:tcW w:w="1602" w:type="dxa"/>
+            <w:noWrap/>
+            <w:hideMark/>
+          </w:tcPr>
+          <w:p>
+            <w:proofErr w:type="spellStart"/>
+            <w:r>
+              <w:t>Test_MAPE_pct</w:t>
+            </w:r>
+            <w:proofErr w:type="spellEnd"/>
+          </w:p>
+        </w:tc>
+      </w:tr>
+      <w:tr>
+        <w:trPr>
+          <w:trHeight w:val="288"/>
+        </w:trPr>
+        <w:tc>
+          <w:tcPr>
+            <w:tcW w:w="876" w:type="dxa"/>
+            <w:noWrap/>
+            <w:hideMark/>
+          </w:tcPr>
+          <w:p>
+            <w:r>
+              <w:t>H1_Nodes</w:t>
+            </w:r>
+          </w:p>
+        </w:tc>
+        <w:tc>
+          <w:tcPr>
+            <w:tcW w:w="875" w:type="dxa"/>
+            <w:noWrap/>
+            <w:hideMark/>
+          </w:tcPr>
+          <w:p>
+            <w:r>
+              <w:t>16</w:t>
+            </w:r>
+          </w:p>
+        </w:tc>
+        <w:tc>
+          <w:tcPr>
+            <w:tcW w:w="2008" w:type="dxa"/>
+            <w:noWrap/>
+            <w:hideMark/>
+          </w:tcPr>
+          <w:p>
+            <w:r>
+              <w:t>0.00018217228633109</w:t>
+            </w:r>
+          </w:p>
+        </w:tc>
+        <w:tc>
+          <w:tcPr>
+            <w:tcW w:w="2109" w:type="dxa"/>
+            <w:noWrap/>
+            <w:hideMark/>
+          </w:tcPr>
+          <w:p>
+            <w:r>
+              <w:t>0.000043289046774501</w:t>
+            </w:r>
+          </w:p>
+        </w:tc>
+        <w:tc>
+          <w:tcPr>
+            <w:tcW w:w="1602" w:type="dxa"/>
+            <w:noWrap/>
+            <w:hideMark/>
+          </w:tcPr>
+          <w:p>
+            <w:r>
+              <w:t>1.82842671267737</w:t>
+            </w:r>
+          </w:p>
+        </w:tc>
+        <w:tc>
+          <w:tcPr>
+            <w:tcW w:w="1602" w:type="dxa"/>
+            <w:noWrap/>
+            <w:hideMark/>
+          </w:tcPr>
+          <w:p>
+            <w:r>
+              <w:t>2.02499103287133</w:t>
+            </w:r>
+          </w:p>
+        </w:tc>
+      </w:tr>
+      <w:tr>
+        <w:trPr>
+          <w:trHeight w:val="288"/>
+        </w:trPr>
+        <w:tc>
+          <w:tcPr>
+            <w:tcW w:w="876" w:type="dxa"/>
+            <w:noWrap/>
+            <w:hideMark/>
+          </w:tcPr>
+          <w:p>
+            <w:r>
+              <w:t>H1_Nodes</w:t>
+            </w:r>
+          </w:p>
+        </w:tc>
+        <w:tc>
+          <w:tcPr>
+            <w:tcW w:w="875" w:type="dxa"/>
+            <w:noWrap/>
+            <w:hideMark/>
+          </w:tcPr>
+          <w:p>
+            <w:r>
+              <w:t>8</w:t>
+            </w:r>
+          </w:p>
+        </w:tc>
+        <w:tc>
+          <w:tcPr>
+            <w:tcW w:w="2008" w:type="dxa"/>
+            <w:noWrap/>
+            <w:hideMark/>
+          </w:tcPr>
+          <w:p>
+            <w:r>
+              <w:t>0.000196193593375922</w:t>
+            </w:r>
+          </w:p>
+        </w:tc>
+        <w:tc>
+          <w:tcPr>
+            <w:tcW w:w="2109" w:type="dxa"/>
+            <w:noWrap/>
+            <w:hideMark/>
+          </w:tcPr>
+          <w:p>
+            <w:r>
+              <w:t>0.0000451851409388807</w:t>
+            </w:r>
+          </w:p>
+        </w:tc>
+        <w:tc>
+          <w:tcPr>
+            <w:tcW w:w="1602" w:type="dxa"/>
+            <w:noWrap/>
+            <w:hideMark/>
+          </w:tcPr>
+          <w:p>
+            <w:r>
+              <w:t>1.86804084022686</w:t>
+            </w:r>
+          </w:p>
+        </w:tc>
+        <w:tc>
+          <w:tcPr>
+            <w:tcW w:w="1602" w:type="dxa"/>
+            <w:noWrap/>
+            <w:hideMark/>
+          </w:tcPr>
+          <w:p>
+            <w:r>
+              <w:t>2.02710717227983</w:t>
+            </w:r>
+          </w:p>
+        </w:tc>
+      </w:tr>
+      <w:tr>
+        <w:trPr>
+          <w:trHeight w:val="288"/>
+        </w:trPr>
+        <w:tc>
+          <w:tcPr>
+            <w:tcW w:w="876" w:type="dxa"/>
+            <w:noWrap/>
+            <w:hideMark/>
+          </w:tcPr>
+          <w:p>
+            <w:r>
+              <w:t>H1_Nodes</w:t>
+            </w:r>
+          </w:p>
+        </w:tc>
+        <w:tc>
+          <w:tcPr>
+            <w:tcW w:w="875" w:type="dxa"/>
+            <w:noWrap/>
+            <w:hideMark/>
+          </w:tcPr>
+          <w:p>
+            <w:r>
+              <w:t>12</w:t>
+            </w:r>
+          </w:p>
+        </w:tc>
+        <w:tc>
+          <w:tcPr>
+            <w:tcW w:w="2008" w:type="dxa"/>
+            <w:noWrap/>
+            <w:hideMark/>
+          </w:tcPr>
+          <w:p>
+            <w:r>
+              <w:t>0.000225023802598007</w:t>
+            </w:r>
+          </w:p>
+        </w:tc>
+        <w:tc>
+          <w:tcPr>
+            <w:tcW w:w="2109" w:type="dxa"/>
+            <w:noWrap/>
+            <w:hideMark/>
+          </w:tcPr>
+          <w:p>
+            <w:r>
+              <w:t>0.0000529583936264053</w:t>
+            </w:r>
+          </w:p>
+        </w:tc>
+        <w:tc>
+          <w:tcPr>
+            <w:tcW w:w="1602" w:type="dxa"/>
+            <w:noWrap/>
+            <w:hideMark/>
+          </w:tcPr>
+          <w:p>
+            <w:r>
+              <w:t>2.02234826988161</w:t>
+            </w:r>
+          </w:p>
+        </w:tc>
+        <w:tc>
+          <w:tcPr>
+            <w:tcW w:w="1602" w:type="dxa"/>
+            <w:noWrap/>
+            <w:hideMark/>
+          </w:tcPr>
+          <w:p>
+            <w:r>
+              <w:t>2.07619935770612</w:t>
+            </w:r>
+          </w:p>
+        </w:tc>
+      </w:tr>
+      <w:tr>
+        <w:trPr>
+          <w:trHeight w:val="288"/>
+        </w:trPr>
+        <w:tc>
+          <w:tcPr>
+            <w:tcW w:w="876" w:type="dxa"/>
+            <w:noWrap/>
+            <w:hideMark/>
+          </w:tcPr>
+          <w:p>
+            <w:r>
+              <w:t>H1_Nodes</w:t>
+            </w:r>
+          </w:p>
+        </w:tc>
+        <w:tc>
+          <w:tcPr>
+            <w:tcW w:w="875" w:type="dxa"/>
+            <w:noWrap/>
+            <w:hideMark/>
+          </w:tcPr>
+          <w:p>
+            <w:r>
+              <w:t>8</w:t>
+            </w:r>
+          </w:p>
+        </w:tc>
+        <w:tc>
+          <w:tcPr>
+            <w:tcW w:w="2008" w:type="dxa"/>
+            <w:noWrap/>
+            <w:hideMark/>
+          </w:tcPr>
+          <w:p>
+            <w:r>
+              <w:t>0.00022071954485136</w:t>
+            </w:r>
+          </w:p>
+        </w:tc>
+        <w:tc>
+          <w:tcPr>
+            <w:tcW w:w="2109" w:type="dxa"/>
+            <w:noWrap/>
+            <w:hideMark/>
+          </w:tcPr>
+          <w:p>
+            <w:r>
+              <w:t>0.0000492473884552051</w:t>
+            </w:r>
+          </w:p>
+        </w:tc>
+        <w:tc>
+          <w:tcPr>
+            <w:tcW w:w="1602" w:type="dxa"/>
+            <w:noWrap/>
+            <w:hideMark/>
+          </w:tcPr>
+          <w:p>
+            <w:r>
+              <w:t>1.95020447558875</w:t>
+            </w:r>
+          </w:p>
+        </w:tc>
+        <w:tc>
+          <w:tcPr>
+            <w:tcW w:w="1602" w:type="dxa"/>
+            <w:noWrap/>
+            <w:hideMark/>
+          </w:tcPr>
+          <w:p>
+            <w:r>
+              <w:t>2.14450982151921</w:t>
+            </w:r>
+          </w:p>
+        </w:tc>
+      </w:tr>
+      <w:tr>
+        <w:trPr>
+          <w:trHeight w:val="288"/>
+        </w:trPr>
+        <w:tc>
+          <w:tcPr>
+            <w:tcW w:w="876" w:type="dxa"/>
+            <w:noWrap/>
+            <w:hideMark/>
+          </w:tcPr>
+          <w:p>
+            <w:r>
+              <w:t>H1_Nodes</w:t>
+            </w:r>
+          </w:p>
+        </w:tc>
+        <w:tc>
+          <w:tcPr>
+            <w:tcW w:w="875" w:type="dxa"/>
+            <w:noWrap/>
+            <w:hideMark/>
+          </w:tcPr>
+          <w:p>
+            <w:r>
+              <w:t>12</w:t>
+            </w:r>
+          </w:p>
+        </w:tc>
+        <w:tc>
+          <w:tcPr>
+            <w:tcW w:w="2008" w:type="dxa"/>
+            <w:noWrap/>
+            <w:hideMark/>
+          </w:tcPr>
+          <w:p>
+            <w:r>
+              <w:t>0.000183448140391339</w:t>
+            </w:r>
+          </w:p>
+        </w:tc>
+        <w:tc>
+          <w:tcPr>
+            <w:tcW w:w="2109" w:type="dxa"/>
+            <w:noWrap/>
+            <w:hideMark/>
+          </w:tcPr>
+          <w:p>
+            <w:r>
+              <w:t>0.0000645582520457059</w:t>
+            </w:r>
+          </w:p>
+        </w:tc>
+        <w:tc>
+          <w:tcPr>
+            <w:tcW w:w="1602" w:type="dxa"/>
+            <w:noWrap/>
+            <w:hideMark/>
+          </w:tcPr>
+          <w:p>
+            <w:r>
+              <w:t>2.23287508476883</w:t>
+            </w:r>
+          </w:p>
+        </w:tc>
+        <w:tc>
+          <w:tcPr>
+            <w:tcW w:w="1602" w:type="dxa"/>
+            <w:noWrap/>
+            <w:hideMark/>
+          </w:tcPr>
+          <w:p>
+            <w:r>
+              <w:t>2.41554243230323</w:t>
+            </w:r>
+          </w:p>
+        </w:tc>
+      </w:tr>
+      <w:tr>
+        <w:trPr>
+          <w:trHeight w:val="288"/>
+        </w:trPr>
+        <w:tc>
+          <w:tcPr>
+            <w:tcW w:w="876" w:type="dxa"/>
+            <w:noWrap/>
+            <w:hideMark/>
+          </w:tcPr>
+          <w:p>
+            <w:r>
+              <w:lastRenderedPageBreak/>
+              <w:t>H1_Nodes</w:t>
+            </w:r>
+          </w:p>
+        </w:tc>
+        <w:tc>
+          <w:tcPr>
+            <w:tcW w:w="875" w:type="dxa"/>
+            <w:noWrap/>
+            <w:hideMark/>
+          </w:tcPr>
+          <w:p>
+            <w:r>
+              <w:t>12</w:t>
+            </w:r>
+          </w:p>
+        </w:tc>
+        <w:tc>
+          <w:tcPr>
+            <w:tcW w:w="2008" w:type="dxa"/>
+            <w:noWrap/>
+            <w:hideMark/>
+          </w:tcPr>
+          <w:p>
+            <w:r>
+              <w:t>0.000193962905078159</w:t>
+            </w:r>
+          </w:p>
+        </w:tc>
+        <w:tc>
+          <w:tcPr>
+            <w:tcW w:w="2109" w:type="dxa"/>
+            <w:noWrap/>
+            <w:hideMark/>
+          </w:tcPr>
+          <w:p>
+            <w:r>
+              <w:t>0.0000690908781209053</w:t>
+            </w:r>
+          </w:p>
+        </w:tc>
+        <w:tc>
+          <w:tcPr>
+            <w:tcW w:w="1602" w:type="dxa"/>
+            <w:noWrap/>
+            <w:hideMark/>
+          </w:tcPr>
+          <w:p>
+            <w:r>
+              <w:t>2.3099304422715</w:t>
+            </w:r>
+          </w:p>
+        </w:tc>
+        <w:tc>
+          <w:tcPr>
+            <w:tcW w:w="1602" w:type="dxa"/>
+            <w:noWrap/>
+            <w:hideMark/>
+          </w:tcPr>
+          <w:p>
+            <w:r>
+              <w:t>2.44505631594917</w:t>
+            </w:r>
+          </w:p>
+        </w:tc>
+      </w:tr>
+      <w:tr>
+        <w:trPr>
+          <w:trHeight w:val="288"/>
+        </w:trPr>
+        <w:tc>
+          <w:tcPr>
+            <w:tcW w:w="876" w:type="dxa"/>
+            <w:noWrap/>
+            <w:hideMark/>
+          </w:tcPr>
+          <w:p>
+            <w:r>
+              <w:t>H1_Nodes</w:t>
+            </w:r>
+          </w:p>
+        </w:tc>
+        <w:tc>
+          <w:tcPr>
+            <w:tcW w:w="875" w:type="dxa"/>
+            <w:noWrap/>
+            <w:hideMark/>
+          </w:tcPr>
+          <w:p>
+            <w:r>
+              <w:t>4</w:t>
+            </w:r>
+          </w:p>
+        </w:tc>
+        <w:tc>
+          <w:tcPr>
+            <w:tcW w:w="2008" w:type="dxa"/>
+            <w:noWrap/>
+            <w:hideMark/>
+          </w:tcPr>
+          <w:p>
+            <w:r>
+              <w:t>0.00062288952681985</w:t>
+            </w:r>
+          </w:p>
+        </w:tc>
+        <w:tc>
+          <w:tcPr>
+            <w:tcW w:w="2109" w:type="dxa"/>
+            <w:noWrap/>
+            <w:hideMark/>
+          </w:tcPr>
+          <w:p>
+            <w:r>
+              <w:t>0.000120829193218885</w:t>
+            </w:r>
+          </w:p>
+        </w:tc>
+        <w:tc>
+          <w:tcPr>
+            <w:tcW w:w="1602" w:type="dxa"/>
+            <w:noWrap/>
+            <w:hideMark/>
+          </w:tcPr>
+          <w:p>
+            <w:r>
+              <w:t>3.05474163363433</w:t>
+            </w:r>
+          </w:p>
+        </w:tc>
+        <w:tc>
+          <w:tcPr>
+            <w:tcW w:w="1602" w:type="dxa"/>
+            <w:noWrap/>
+            <w:hideMark/>
+          </w:tcPr>
+          <w:p>
+            <w:r>
+              <w:t>3.6838605487176</w:t>
+            </w:r>
+          </w:p>
+        </w:tc>
+      </w:tr>
+      <w:tr>
+        <w:trPr>
+          <w:trHeight w:val="288"/>
+        </w:trPr>
+        <w:tc>
+          <w:tcPr>
+            <w:tcW w:w="876" w:type="dxa"/>
+            <w:noWrap/>
+            <w:hideMark/>
+          </w:tcPr>
+          <w:p>
+            <w:r>
+              <w:t>H1_Nodes</w:t>
+            </w:r>
+          </w:p>
+        </w:tc>
+        <w:tc>
+          <w:tcPr>
+            <w:tcW w:w="875" w:type="dxa"/>
+            <w:noWrap/>
+            <w:hideMark/>
+          </w:tcPr>
+          <w:p>
+            <w:r>
+              <w:t>16</w:t>
+            </w:r>
+          </w:p>
+        </w:tc>
+        <w:tc>
+          <w:tcPr>
+            <w:tcW w:w="2008" w:type="dxa"/>
+            <w:noWrap/>
+            <w:hideMark/>
+          </w:tcPr>
+          <w:p>
+            <w:r>
+              <w:t>0.000268412534409132</w:t>
+            </w:r>
+          </w:p>
+        </w:tc>
+        <w:tc>
+          <w:tcPr>
+            <w:tcW w:w="2109" w:type="dxa"/>
+            <w:noWrap/>
+            <w:hideMark/>
+          </w:tcPr>
+          <w:p>
+            <w:r>
+              <w:t>0.000223187864741963</w:t>
+            </w:r>
+          </w:p>
+        </w:tc>
+        <w:tc>
+          <w:tcPr>
+            <w:tcW w:w="1602" w:type="dxa"/>
+            <w:noWrap/>
+            <w:hideMark/>
+          </w:tcPr>
+          <w:p>
+            <w:r>
+              <w:t>4.15167964539611</w:t>
+            </w:r>
+          </w:p>
+        </w:tc>
+        <w:tc>
+          <w:tcPr>
+            <w:tcW w:w="1602" w:type="dxa"/>
+            <w:noWrap/>
+            <w:hideMark/>
+          </w:tcPr>
+          <w:p>
+            <w:r>
+              <w:t>3.76752889729248</w:t>
+            </w:r>
+          </w:p>
+        </w:tc>
+      </w:tr>
+      <w:tr>
+        <w:trPr>
+          <w:trHeight w:val="288"/>
+        </w:trPr>
+        <w:tc>
+          <w:tcPr>
+            <w:tcW w:w="876" w:type="dxa"/>
+            <w:noWrap/>
+            <w:hideMark/>
+          </w:tcPr>
+          <w:p>
+            <w:r>
+              <w:t>H1_Nodes</w:t>
+            </w:r>
+          </w:p>
+        </w:tc>
+        <w:tc>
+          <w:tcPr>
+            <w:tcW w:w="875" w:type="dxa"/>
+            <w:noWrap/>
+            <w:hideMark/>
+          </w:tcPr>
+          <w:p>
+            <w:r>
+              <w:t>16</w:t>
+            </w:r>
+          </w:p>
+        </w:tc>
+        <w:tc>
+          <w:tcPr>
+            <w:tcW w:w="2008" w:type="dxa"/>
+            <w:noWrap/>
+            <w:hideMark/>
+          </w:tcPr>
+          <w:p>
+            <w:r>
+              <w:t>0.000339066744342779</w:t>
+            </w:r>
+          </w:p>
+        </w:tc>
+        <w:tc>
+          <w:tcPr>
+            <w:tcW w:w="2109" w:type="dxa"/>
+            <w:noWrap/>
+            <w:hideMark/>
+          </w:tcPr>
+          <w:p>
+            <w:r>
+              <w:t>0.00042345956916731</w:t>
+            </w:r>
+          </w:p>
+        </w:tc>
+        <w:tc>
+          <w:tcPr>
+            <w:tcW w:w="1602" w:type="dxa"/>
+            <w:noWrap/>
+            <w:hideMark/>
+          </w:tcPr>
+          <w:p>
+            <w:r>
+              <w:t>5.71866322983738</w:t>
+            </w:r>
+          </w:p>
+        </w:tc>
+        <w:tc>
+          <w:tcPr>
+            <w:tcW w:w="1602" w:type="dxa"/>
+            <w:noWrap/>
+            <w:hideMark/>
+          </w:tcPr>
+          <w:p>
+            <w:r>
+              <w:t>5.03641976367896</w:t>
+            </w:r>
+          </w:p>
+        </w:tc>
+      </w:tr>
+      <w:tr>
+        <w:trPr>
+          <w:trHeight w:val="288"/>
+        </w:trPr>
+        <w:tc>
+          <w:tcPr>
+            <w:tcW w:w="876" w:type="dxa"/>
+            <w:noWrap/>
+            <w:hideMark/>
+          </w:tcPr>
+          <w:p>
+            <w:r>
+              <w:t>H1_Nodes</w:t>
+            </w:r>
+          </w:p>
+        </w:tc>
+        <w:tc>
+          <w:tcPr>
+            <w:tcW w:w="875" w:type="dxa"/>
+            <w:noWrap/>
+            <w:hideMark/>
+          </w:tcPr>
+          <w:p>
+            <w:r>
+              <w:t>8</w:t>
+            </w:r>
+          </w:p>
+        </w:tc>
+        <w:tc>
+          <w:tcPr>
+            <w:tcW w:w="2008" w:type="dxa"/>
+            <w:noWrap/>
+            <w:hideMark/>
+          </w:tcPr>
+          <w:p>
+            <w:r>
+              <w:t>0.0009774331005811</w:t>
+            </w:r>
+          </w:p>
+        </w:tc>
+        <w:tc>
+          <w:tcPr>
+            <w:tcW w:w="2109" w:type="dxa"/>
+            <w:noWrap/>
+            <w:hideMark/>
+          </w:tcPr>
+          <w:p>
+            <w:r>
+              <w:t>0.000286974477242099</w:t>
+            </w:r>
+          </w:p>
+        </w:tc>
+        <w:tc>
+          <w:tcPr>
+            <w:tcW w:w="1602" w:type="dxa"/>
+            <w:noWrap/>
+            <w:hideMark/>
+          </w:tcPr>
+          <w:p>
+            <w:r>
+              <w:t>4.70771521304591</w:t>
+            </w:r>
+          </w:p>
+        </w:tc>
+        <w:tc>
+          <w:tcPr>
+            <w:tcW w:w="1602" w:type="dxa"/>
+            <w:noWrap/>
+            <w:hideMark/>
+          </w:tcPr>
+          <w:p>
+            <w:r>
+              <w:t>6.17499041198896</w:t>
+            </w:r>
+          </w:p>
+        </w:tc>
+      </w:tr>
+      <w:tr>
+        <w:trPr>
+          <w:trHeight w:val="288"/>
+        </w:trPr>
+        <w:tc>
+          <w:tcPr>
+            <w:tcW w:w="876" w:type="dxa"/>
+            <w:noWrap/>
+            <w:hideMark/>
+          </w:tcPr>
+          <w:p>
+            <w:r>
+              <w:t>H1_Nodes</w:t>
+            </w:r>
+          </w:p>
+        </w:tc>
+        <w:tc>
+          <w:tcPr>
+            <w:tcW w:w="875" w:type="dxa"/>
+            <w:noWrap/>
+            <w:hideMark/>
+          </w:tcPr>
+          <w:p>
+            <w:r>
+              <w:t>4</w:t>
+            </w:r>
+          </w:p>
+        </w:tc>
+        <w:tc>
+          <w:tcPr>
+            <w:tcW w:w="2008" w:type="dxa"/>
+            <w:noWrap/>
+            <w:hideMark/>
+          </w:tcPr>
+          <w:p>
+            <w:r>
+              <w:t>0.00220486936732265</w:t>
+            </w:r>
+          </w:p>
+        </w:tc>
+        <w:tc>
+          <w:tcPr>
+            <w:tcW w:w="2109" w:type="dxa"/>
+            <w:noWrap/>
+            <w:hideMark/>
+          </w:tcPr>
+          <w:p>
+            <w:r>
+              <w:t>0.000419766893936549</w:t>
+            </w:r>
+          </w:p>
+        </w:tc>
+        <w:tc>
+          <w:tcPr>
+            <w:tcW w:w="1602" w:type="dxa"/>
+            <w:noWrap/>
+            <w:hideMark/>
+          </w:tcPr>
+          <w:p>
+            <w:r>
+              <w:t>5.6936745341088</w:t>
+            </w:r>
+          </w:p>
+        </w:tc>
+        <w:tc>
+          <w:tcPr>
+            <w:tcW w:w="1602" w:type="dxa"/>
+            <w:noWrap/>
+            <w:hideMark/>
+          </w:tcPr>
+          <w:p>
+            <w:r>
+              <w:t>8.05593099086231</w:t>
+            </w:r>
+          </w:p>
+        </w:tc>
+      </w:tr>
+      <w:tr>
+        <w:trPr>
+          <w:trHeight w:val="288"/>
+        </w:trPr>
+        <w:tc>
+          <w:tcPr>
+            <w:tcW w:w="876" w:type="dxa"/>
+            <w:noWrap/>
+            <w:hideMark/>
+          </w:tcPr>
+          <w:p>
+            <w:r>
+              <w:t>H1_Nodes</w:t>
+            </w:r>
+          </w:p>
+        </w:tc>
+        <w:tc>
+          <w:tcPr>
+            <w:tcW w:w="875" w:type="dxa"/>
+            <w:noWrap/>
+            <w:hideMark/>
+          </w:tcPr>
+          <w:p>
+            <w:r>
+              <w:t>4</w:t>
+            </w:r>
+          </w:p>
+        </w:tc>
+        <w:tc>
+          <w:tcPr>
+            <w:tcW w:w="2008" w:type="dxa"/>
+            <w:noWrap/>
+            <w:hideMark/>
+          </w:tcPr>
+          <w:p>
+            <w:r>
+              <w:t>0.00425380300109442</w:t>
+            </w:r>
+          </w:p>
+        </w:tc>
+        <w:tc>
+          <w:tcPr>
+            <w:tcW w:w="2109" w:type="dxa"/>
+            <w:noWrap/>
+            <w:hideMark/>
+          </w:tcPr>
+          <w:p>
+            <w:r>
+              <w:t>0.00132641444483971</w:t>
+            </w:r>
+          </w:p>
+        </w:tc>
+        <w:tc>
+          <w:tcPr>
+            <w:tcW w:w="1602" w:type="dxa"/>
+            <w:noWrap/>
+            <w:hideMark/>
+          </w:tcPr>
+          <w:p>
+            <w:r>
+              <w:t>10.1211105267543</w:t>
+            </w:r>
+          </w:p>
+        </w:tc>
+        <w:tc>
+          <w:tcPr>
+            <w:tcW w:w="1602" w:type="dxa"/>
+            <w:noWrap/>
+            <w:hideMark/>
+          </w:tcPr>
+          <w:p>
+            <w:r>
+              <w:t>15.5012571343031</w:t>
+            </w:r>
+          </w:p>
+        </w:tc>
+      </w:tr>
+    </w:tbl>
+    <w:p/>
+    <w:p>
+      <w:pPr>
+        <w:jc w:val="both"/>
+      </w:pPr>
+      <w:r>
+        <w:t xml:space="preserve">Można zaobserwować, że w większości przypadków średni błąd predykcji na zbiorze testowym jest mniejszy niż na </w:t>
+      </w:r>
+      <w:r>
+        <w:t>zbiorze treningowym, co przeczy intuicji. Może być to spowodowane potencjalnie bardziej wymagającymi i nieprzewidywalnymi danymi w zbiorze treningowym oraz łatwiejszymi do przewidywania w zbiorze testowym.</w:t>
+      </w:r>
+    </w:p>
+    <w:p>
+      <w:pPr>
+        <w:jc w:val="both"/>
+      </w:pPr>
+      <w:r>
+        <w:t xml:space="preserve">Najlepsza osiągnięta wartość RMSE równa około 1.828 jest niższa niż </w:t>
+      </w:r>
+      <w:r>
+        <w:t>w</w:t>
+      </w:r>
+      <w:r>
+        <w:t xml:space="preserve"> wyżej wspomniany</w:t>
+      </w:r>
+      <w:r>
+        <w:t>ch</w:t>
+      </w:r>
+      <w:r>
+        <w:t xml:space="preserve"> opracowa</w:t>
+      </w:r>
+      <w:r>
+        <w:t>niach</w:t>
+      </w:r>
+      <w:r>
+        <w:t>, gdzie wynos</w:t>
+      </w:r>
+      <w:r>
+        <w:t>zą</w:t>
+      </w:r>
+      <w:r>
+        <w:t xml:space="preserve"> on</w:t>
+      </w:r>
+      <w:r>
+        <w:t>e</w:t>
+      </w:r>
+      <w:r>
+        <w:t xml:space="preserve"> około 2.869 i</w:t>
+      </w:r>
+      <w:r>
+        <w:t xml:space="preserve"> </w:t>
+      </w:r>
+      <w:r>
+        <w:t>4.276</w:t>
+      </w:r>
+      <w:r>
+        <w:t xml:space="preserve">. </w:t>
+      </w:r>
+      <w:r>
+        <w:t>MAPE równe około 2.025 oznacza, że model myli się średnio o około 2%, co jest dobrym wynikiem.</w:t>
+      </w:r>
+    </w:p>
+    <w:p>
+      <w:pPr>
+        <w:jc w:val="both"/>
+      </w:pPr>
+      <w:r>
+        <w:t>Również wyjątkowo dla tego parametru pokazane będą wykresy wartości rzeczywistych i predykcji w zbiorze testowym</w:t>
+      </w:r>
+      <w:r>
+        <w:t xml:space="preserve"> na podstawie wybranych modeli</w:t>
+      </w:r>
+      <w:r>
+        <w:t>.</w:t>
+      </w:r>
+    </w:p>
+    <w:p>
+      <w:r>
+        <w:t>4 neurony:</w:t>
+      </w:r>
+    </w:p>
+    <w:p>
+      <w:r>
+        <w:rPr>
+          <w:noProof/>
+        </w:rPr>
+        <w:drawing>
+          <wp:inline distT="0" distB="0" distL="0" distR="0" wp14:anchorId="2410F784" wp14:editId="4A240F33">
+            <wp:extent cx="5730714" cy="3901440"/>
+            <wp:effectExtent l="0" t="0" r="3810" b="3810"/>
+            <wp:docPr id="525450690" name="Obraz 3"/>
+            <wp:cNvGraphicFramePr>
+              <a:graphicFrameLocks xmlns:a="http://schemas.openxmlformats.org/drawingml/2006/main" noChangeAspect="1"/>
+            </wp:cNvGraphicFramePr>
+            <a:graphic xmlns:a="http://schemas.openxmlformats.org/drawingml/2006/main">
+              <a:graphicData uri="http://schemas.openxmlformats.org/drawingml/2006/picture">
+                <pic:pic xmlns:pic="http://schemas.openxmlformats.org/drawingml/2006/picture">
+                  <pic:nvPicPr>
+                    <pic:cNvPr id="0" name="Picture 7"/>
+                    <pic:cNvPicPr>
+                      <a:picLocks noChangeAspect="1" noChangeArrowheads="1"/>
+                    </pic:cNvPicPr>
+                  </pic:nvPicPr>
+                  <pic:blipFill>
+                    <a:blip r:embed="rId19">
+                      <a:extLst>
+                        <a:ext uri="{28A0092B-C50C-407E-A947-70E740481C1C}">
+                          <a14:useLocalDpi xmlns:a14="http://schemas.microsoft.com/office/drawing/2010/main" val="0"/>
+                        </a:ext>
+                      </a:extLst>
+                    </a:blip>
+                    <a:srcRect/>
+                    <a:stretch>
+                      <a:fillRect/>
+                    </a:stretch>
+                  </pic:blipFill>
+                  <pic:spPr bwMode="auto">
+                    <a:xfrm>
+                      <a:off x="0" y="0"/>
+                      <a:ext cx="5733277" cy="3903185"/>
+                    </a:xfrm>
+                    <a:prstGeom prst="rect">
+                      <a:avLst/>
+                    </a:prstGeom>
+                    <a:noFill/>
+                    <a:ln>
+                      <a:noFill/>
+                    </a:ln>
+                  </pic:spPr>
+                </pic:pic>
+              </a:graphicData>
+            </a:graphic>
+          </wp:inline>
+        </w:drawing>
+      </w:r>
+    </w:p>
+    <w:p>
+      <w:r>
+        <w:br w:type="page"/>
+      </w:r>
+      <w:r>
+        <w:lastRenderedPageBreak/>
+        <w:t>8 neuronów:</w:t>
+      </w:r>
+    </w:p>
+    <w:p>
+      <w:r>
+        <w:rPr>
+          <w:noProof/>
+        </w:rPr>
+        <w:drawing>
+          <wp:inline distT="0" distB="0" distL="0" distR="0" wp14:anchorId="079CED43" wp14:editId="5E655D25">
+            <wp:extent cx="5753100" cy="3916680"/>
+            <wp:effectExtent l="0" t="0" r="0" b="7620"/>
+            <wp:docPr id="498836297" name="Obraz 4"/>
+            <wp:cNvGraphicFramePr>
+              <a:graphicFrameLocks xmlns:a="http://schemas.openxmlformats.org/drawingml/2006/main" noChangeAspect="1"/>
+            </wp:cNvGraphicFramePr>
+            <a:graphic xmlns:a="http://schemas.openxmlformats.org/drawingml/2006/main">
+              <a:graphicData uri="http://schemas.openxmlformats.org/drawingml/2006/picture">
+                <pic:pic xmlns:pic="http://schemas.openxmlformats.org/drawingml/2006/picture">
+                  <pic:nvPicPr>
+                    <pic:cNvPr id="0" name="Picture 8"/>
+                    <pic:cNvPicPr>
+                      <a:picLocks noChangeAspect="1" noChangeArrowheads="1"/>
+                    </pic:cNvPicPr>
+                  </pic:nvPicPr>
+                  <pic:blipFill>
+                    <a:blip r:embed="rId20">
+                      <a:extLst>
+                        <a:ext uri="{28A0092B-C50C-407E-A947-70E740481C1C}">
+                          <a14:useLocalDpi xmlns:a14="http://schemas.microsoft.com/office/drawing/2010/main" val="0"/>
+                        </a:ext>
+                      </a:extLst>
+                    </a:blip>
+                    <a:srcRect/>
+                    <a:stretch>
+                      <a:fillRect/>
+                    </a:stretch>
+                  </pic:blipFill>
+                  <pic:spPr bwMode="auto">
+                    <a:xfrm>
+                      <a:off x="0" y="0"/>
+                      <a:ext cx="5753100" cy="3916680"/>
+                    </a:xfrm>
+                    <a:prstGeom prst="rect">
+                      <a:avLst/>
+                    </a:prstGeom>
+                    <a:noFill/>
+                    <a:ln>
+                      <a:noFill/>
+                    </a:ln>
+                  </pic:spPr>
+                </pic:pic>
+              </a:graphicData>
+            </a:graphic>
+          </wp:inline>
+        </w:drawing>
+      </w:r>
+    </w:p>
+    <w:p>
+      <w:r>
+        <w:t>12 neuronów:</w:t>
+      </w:r>
+    </w:p>
+    <w:p>
+      <w:r>
+        <w:rPr>
+          <w:noProof/>
+        </w:rPr>
+        <w:drawing>
+          <wp:inline distT="0" distB="0" distL="0" distR="0" wp14:anchorId="684E556B" wp14:editId="4F013D80">
+            <wp:extent cx="5753100" cy="3916680"/>
+            <wp:effectExtent l="0" t="0" r="0" b="7620"/>
+            <wp:docPr id="1377702839" name="Obraz 5"/>
+            <wp:cNvGraphicFramePr>
+              <a:graphicFrameLocks xmlns:a="http://schemas.openxmlformats.org/drawingml/2006/main" noChangeAspect="1"/>
+            </wp:cNvGraphicFramePr>
+            <a:graphic xmlns:a="http://schemas.openxmlformats.org/drawingml/2006/main">
+              <a:graphicData uri="http://schemas.openxmlformats.org/drawingml/2006/picture">
+                <pic:pic xmlns:pic="http://schemas.openxmlformats.org/drawingml/2006/picture">
+                  <pic:nvPicPr>
+                    <pic:cNvPr id="0" name="Picture 9"/>
+                    <pic:cNvPicPr>
+                      <a:picLocks noChangeAspect="1" noChangeArrowheads="1"/>
+                    </pic:cNvPicPr>
+                  </pic:nvPicPr>
+                  <pic:blipFill>
+                    <a:blip r:embed="rId21">
+                      <a:extLst>
+                        <a:ext uri="{28A0092B-C50C-407E-A947-70E740481C1C}">
+                          <a14:useLocalDpi xmlns:a14="http://schemas.microsoft.com/office/drawing/2010/main" val="0"/>
+                        </a:ext>
+                      </a:extLst>
+                    </a:blip>
+                    <a:srcRect/>
+                    <a:stretch>
+                      <a:fillRect/>
+                    </a:stretch>
+                  </pic:blipFill>
+                  <pic:spPr bwMode="auto">
+                    <a:xfrm>
+                      <a:off x="0" y="0"/>
+                      <a:ext cx="5753100" cy="3916680"/>
+                    </a:xfrm>
+                    <a:prstGeom prst="rect">
+                      <a:avLst/>
+                    </a:prstGeom>
+                    <a:noFill/>
+                    <a:ln>
+                      <a:noFill/>
+                    </a:ln>
+                  </pic:spPr>
+                </pic:pic>
+              </a:graphicData>
+            </a:graphic>
+          </wp:inline>
+        </w:drawing>
+      </w:r>
+    </w:p>
+    <w:p>
+      <w:r>
+        <w:br w:type="page"/>
+      </w:r>
+    </w:p>
+    <w:p>
+      <w:r>
+        <w:lastRenderedPageBreak/>
+        <w:t>16 neuronów:</w:t>
+      </w:r>
+    </w:p>
+    <w:p>
+      <w:r>
+        <w:rPr>
+          <w:noProof/>
+        </w:rPr>
+        <w:drawing>
+          <wp:inline distT="0" distB="0" distL="0" distR="0" wp14:anchorId="18EE5300" wp14:editId="7DF22C18">
+            <wp:extent cx="5753100" cy="3916680"/>
+            <wp:effectExtent l="0" t="0" r="0" b="7620"/>
+            <wp:docPr id="652549691" name="Obraz 6"/>
+            <wp:cNvGraphicFramePr>
+              <a:graphicFrameLocks xmlns:a="http://schemas.openxmlformats.org/drawingml/2006/main" noChangeAspect="1"/>
+            </wp:cNvGraphicFramePr>
+            <a:graphic xmlns:a="http://schemas.openxmlformats.org/drawingml/2006/main">
+              <a:graphicData uri="http://schemas.openxmlformats.org/drawingml/2006/picture">
+                <pic:pic xmlns:pic="http://schemas.openxmlformats.org/drawingml/2006/picture">
+                  <pic:nvPicPr>
+                    <pic:cNvPr id="0" name="Picture 10"/>
+                    <pic:cNvPicPr>
+                      <a:picLocks noChangeAspect="1" noChangeArrowheads="1"/>
+                    </pic:cNvPicPr>
+                  </pic:nvPicPr>
+                  <pic:blipFill>
+                    <a:blip r:embed="rId22">
+                      <a:extLst>
+                        <a:ext uri="{28A0092B-C50C-407E-A947-70E740481C1C}">
+                          <a14:useLocalDpi xmlns:a14="http://schemas.microsoft.com/office/drawing/2010/main" val="0"/>
+                        </a:ext>
+                      </a:extLst>
+                    </a:blip>
+                    <a:srcRect/>
+                    <a:stretch>
+                      <a:fillRect/>
+                    </a:stretch>
+                  </pic:blipFill>
+                  <pic:spPr bwMode="auto">
+                    <a:xfrm>
+                      <a:off x="0" y="0"/>
+                      <a:ext cx="5753100" cy="3916680"/>
+                    </a:xfrm>
+                    <a:prstGeom prst="rect">
+                      <a:avLst/>
+                    </a:prstGeom>
+                    <a:noFill/>
+                    <a:ln>
+                      <a:noFill/>
+                    </a:ln>
+                  </pic:spPr>
+                </pic:pic>
+              </a:graphicData>
+            </a:graphic>
+          </wp:inline>
+        </w:drawing>
+      </w:r>
+    </w:p>
+    <w:p>
+      <w:pPr>
+        <w:pStyle w:val="Nagwek3"/>
+        <w:numPr>
+          <w:ilvl w:val="0"/>
+          <w:numId w:val="11"/>
+        </w:numPr>
+      </w:pPr>
+      <w:r>
+        <w:t>Szybkość uczenia</w:t>
+      </w:r>
+    </w:p>
+    <w:p>
+      <w:r>
+        <w:rPr>
+          <w:noProof/>
+        </w:rPr>
+        <w:drawing>
+          <wp:inline distT="0" distB="0" distL="0" distR="0" wp14:anchorId="7D7D7A4C" wp14:editId="22B42D03">
+            <wp:extent cx="5760720" cy="3596640"/>
+            <wp:effectExtent l="0" t="0" r="0" b="3810"/>
+            <wp:docPr id="189061201" name="Obraz 7"/>
+            <wp:cNvGraphicFramePr>
+              <a:graphicFrameLocks xmlns:a="http://schemas.openxmlformats.org/drawingml/2006/main" noChangeAspect="1"/>
+            </wp:cNvGraphicFramePr>
+            <a:graphic xmlns:a="http://schemas.openxmlformats.org/drawingml/2006/main">
+              <a:graphicData uri="http://schemas.openxmlformats.org/drawingml/2006/picture">
+                <pic:pic xmlns:pic="http://schemas.openxmlformats.org/drawingml/2006/picture">
+                  <pic:nvPicPr>
+                    <pic:cNvPr id="0" name="Picture 11"/>
+                    <pic:cNvPicPr>
+                      <a:picLocks noChangeAspect="1" noChangeArrowheads="1"/>
+                    </pic:cNvPicPr>
+                  </pic:nvPicPr>
+                  <pic:blipFill>
+                    <a:blip r:embed="rId23" cstate="print">
+                      <a:extLst>
+                        <a:ext uri="{28A0092B-C50C-407E-A947-70E740481C1C}">
+                          <a14:useLocalDpi xmlns:a14="http://schemas.microsoft.com/office/drawing/2010/main" val="0"/>
+                        </a:ext>
+                      </a:extLst>
+                    </a:blip>
+                    <a:srcRect/>
+                    <a:stretch>
+                      <a:fillRect/>
+                    </a:stretch>
+                  </pic:blipFill>
+                  <pic:spPr bwMode="auto">
+                    <a:xfrm>
+                      <a:off x="0" y="0"/>
+                      <a:ext cx="5760720" cy="3596640"/>
+                    </a:xfrm>
+                    <a:prstGeom prst="rect">
+                      <a:avLst/>
+                    </a:prstGeom>
+                    <a:noFill/>
+                    <a:ln>
+                      <a:noFill/>
+                    </a:ln>
+                  </pic:spPr>
+                </pic:pic>
+              </a:graphicData>
+            </a:graphic>
+          </wp:inline>
+        </w:drawing>
+      </w:r>
+    </w:p>
+    <w:p>
+      <w:r>
+        <w:t xml:space="preserve">Wartości błędu maleją wraz ze wzrostem wartości szybkości uczenia. Dla wartości 0.1 i 0.3 błąd jest podobny. </w:t>
+      </w:r>
+      <w:r>
+        <w:t>Wartości błędów dla najlepszego modelu (pod względem RMSE) z LR=0.3: RMSE=</w:t>
+      </w:r>
+      <w:r>
+        <w:t>1.873493</w:t>
+      </w:r>
+      <w:r>
+        <w:t>; MAPE=</w:t>
+      </w:r>
+      <w:r>
+        <w:t>1.949458</w:t>
+      </w:r>
+    </w:p>
+    <w:p>
+      <w:pPr>
+        <w:pStyle w:val="Nagwek3"/>
+        <w:numPr>
+          <w:ilvl w:val="0"/>
+          <w:numId w:val="11"/>
+        </w:numPr>
+      </w:pPr>
+      <w:r>
+        <w:lastRenderedPageBreak/>
+        <w:t>Liczba epok</w:t>
+      </w:r>
+    </w:p>
+    <w:p>
+      <w:r>
+        <w:rPr>
+          <w:noProof/>
+        </w:rPr>
+        <w:drawing>
+          <wp:inline distT="0" distB="0" distL="0" distR="0" wp14:anchorId="320841CA" wp14:editId="5781E658">
+            <wp:extent cx="5760720" cy="3596640"/>
+            <wp:effectExtent l="0" t="0" r="0" b="3810"/>
+            <wp:docPr id="695426926" name="Obraz 8"/>
+            <wp:cNvGraphicFramePr>
+              <a:graphicFrameLocks xmlns:a="http://schemas.openxmlformats.org/drawingml/2006/main" noChangeAspect="1"/>
+            </wp:cNvGraphicFramePr>
+            <a:graphic xmlns:a="http://schemas.openxmlformats.org/drawingml/2006/main">
+              <a:graphicData uri="http://schemas.openxmlformats.org/drawingml/2006/picture">
+                <pic:pic xmlns:pic="http://schemas.openxmlformats.org/drawingml/2006/picture">
+                  <pic:nvPicPr>
+                    <pic:cNvPr id="0" name="Picture 12"/>
+                    <pic:cNvPicPr>
+                      <a:picLocks noChangeAspect="1" noChangeArrowheads="1"/>
+                    </pic:cNvPicPr>
+                  </pic:nvPicPr>
+                  <pic:blipFill>
+                    <a:blip r:embed="rId24" cstate="print">
+                      <a:extLst>
+                        <a:ext uri="{28A0092B-C50C-407E-A947-70E740481C1C}">
+                          <a14:useLocalDpi xmlns:a14="http://schemas.microsoft.com/office/drawing/2010/main" val="0"/>
+                        </a:ext>
+                      </a:extLst>
+                    </a:blip>
+                    <a:srcRect/>
+                    <a:stretch>
+                      <a:fillRect/>
+                    </a:stretch>
+                  </pic:blipFill>
+                  <pic:spPr bwMode="auto">
+                    <a:xfrm>
+                      <a:off x="0" y="0"/>
+                      <a:ext cx="5760720" cy="3596640"/>
+                    </a:xfrm>
+                    <a:prstGeom prst="rect">
+                      <a:avLst/>
+                    </a:prstGeom>
+                    <a:noFill/>
+                    <a:ln>
+                      <a:noFill/>
+                    </a:ln>
+                  </pic:spPr>
+                </pic:pic>
+              </a:graphicData>
+            </a:graphic>
+          </wp:inline>
+        </w:drawing>
+      </w:r>
+    </w:p>
+    <w:p>
+      <w:r>
+        <w:t xml:space="preserve">Tu również dostrzegalne jest potencjalne przeszkolenie modelu przy wartości 5000. Najlepszy (pod względem RMSE) model z </w:t>
+      </w:r>
+      <w:proofErr w:type="spellStart"/>
+      <w:r>
+        <w:t>Epochs</w:t>
+      </w:r>
+      <w:proofErr w:type="spellEnd"/>
+      <w:r>
+        <w:t>=2000: RMSE=</w:t>
+      </w:r>
+      <w:r>
+        <w:t>2.022729</w:t>
+      </w:r>
+      <w:r>
+        <w:t>; MAPE=</w:t>
+      </w:r>
+      <w:r>
+        <w:t>2.268343</w:t>
+      </w:r>
+      <w:r>
+        <w:t>.</w:t>
+      </w:r>
+    </w:p>
+    <w:p>
+      <w:pPr>
+        <w:pStyle w:val="Nagwek3"/>
+        <w:numPr>
+          <w:ilvl w:val="0"/>
+          <w:numId w:val="11"/>
+        </w:numPr>
+      </w:pPr>
+      <w:r>
+        <w:t>Zakres inicjalizacji wag</w:t>
+      </w:r>
+    </w:p>
+    <w:p>
+      <w:r>
+        <w:rPr>
+          <w:noProof/>
+        </w:rPr>
+        <w:drawing>
+          <wp:inline distT="0" distB="0" distL="0" distR="0" wp14:anchorId="1FBDA6E8" wp14:editId="31244543">
+            <wp:extent cx="5760720" cy="3596640"/>
+            <wp:effectExtent l="0" t="0" r="0" b="3810"/>
+            <wp:docPr id="1996859238" name="Obraz 9"/>
+            <wp:cNvGraphicFramePr>
+              <a:graphicFrameLocks xmlns:a="http://schemas.openxmlformats.org/drawingml/2006/main" noChangeAspect="1"/>
+            </wp:cNvGraphicFramePr>
+            <a:graphic xmlns:a="http://schemas.openxmlformats.org/drawingml/2006/main">
+              <a:graphicData uri="http://schemas.openxmlformats.org/drawingml/2006/picture">
+                <pic:pic xmlns:pic="http://schemas.openxmlformats.org/drawingml/2006/picture">
+                  <pic:nvPicPr>
+                    <pic:cNvPr id="0" name="Picture 13"/>
+                    <pic:cNvPicPr>
+                      <a:picLocks noChangeAspect="1" noChangeArrowheads="1"/>
+                    </pic:cNvPicPr>
+                  </pic:nvPicPr>
+                  <pic:blipFill>
+                    <a:blip r:embed="rId25" cstate="print">
+                      <a:extLst>
+                        <a:ext uri="{28A0092B-C50C-407E-A947-70E740481C1C}">
+                          <a14:useLocalDpi xmlns:a14="http://schemas.microsoft.com/office/drawing/2010/main" val="0"/>
+                        </a:ext>
+                      </a:extLst>
+                    </a:blip>
+                    <a:srcRect/>
+                    <a:stretch>
+                      <a:fillRect/>
+                    </a:stretch>
+                  </pic:blipFill>
+                  <pic:spPr bwMode="auto">
+                    <a:xfrm>
+                      <a:off x="0" y="0"/>
+                      <a:ext cx="5760720" cy="3596640"/>
+                    </a:xfrm>
+                    <a:prstGeom prst="rect">
+                      <a:avLst/>
+                    </a:prstGeom>
+                    <a:noFill/>
+                    <a:ln>
+                      <a:noFill/>
+                    </a:ln>
+                  </pic:spPr>
+                </pic:pic>
+              </a:graphicData>
+            </a:graphic>
+          </wp:inline>
+        </w:drawing>
+      </w:r>
+    </w:p>
+    <w:p>
+      <w:r>
+        <w:lastRenderedPageBreak/>
+        <w:t xml:space="preserve">Podobnie jak poprzednio, dla najwyższej przyjętej wartości może występować przeszkolenie modelu, choć rozrzut wyników jest duży i najlepszy model udało się wyszkolić przy wartości </w:t>
+      </w:r>
+      <w:proofErr w:type="spellStart"/>
+      <w:r>
+        <w:t>Init_Range</w:t>
+      </w:r>
+      <w:proofErr w:type="spellEnd"/>
+      <w:r>
+        <w:t>=1: RMSE=</w:t>
+      </w:r>
+      <w:r>
+        <w:t>1.89050</w:t>
+      </w:r>
+      <w:r>
+        <w:t>; MAPE=</w:t>
+      </w:r>
+      <w:r>
+        <w:t>1.994306</w:t>
+      </w:r>
+      <w:r>
+        <w:t>.</w:t>
+      </w:r>
+    </w:p>
+    <w:p>
+      <w:pPr>
+        <w:pStyle w:val="Nagwek3"/>
+        <w:numPr>
+          <w:ilvl w:val="0"/>
+          <w:numId w:val="11"/>
+        </w:numPr>
+      </w:pPr>
+      <w:r>
+        <w:t>Podział zbioru na dane treningowe i testowe</w:t>
+      </w:r>
+    </w:p>
+    <w:p>
+      <w:r>
+        <w:rPr>
+          <w:noProof/>
+        </w:rPr>
+        <w:drawing>
+          <wp:inline distT="0" distB="0" distL="0" distR="0" wp14:anchorId="462261DF" wp14:editId="6D535657">
+            <wp:extent cx="5760720" cy="3596640"/>
+            <wp:effectExtent l="0" t="0" r="0" b="3810"/>
+            <wp:docPr id="1116831764" name="Obraz 10"/>
+            <wp:cNvGraphicFramePr>
+              <a:graphicFrameLocks xmlns:a="http://schemas.openxmlformats.org/drawingml/2006/main" noChangeAspect="1"/>
+            </wp:cNvGraphicFramePr>
+            <a:graphic xmlns:a="http://schemas.openxmlformats.org/drawingml/2006/main">
+              <a:graphicData uri="http://schemas.openxmlformats.org/drawingml/2006/picture">
+                <pic:pic xmlns:pic="http://schemas.openxmlformats.org/drawingml/2006/picture">
+                  <pic:nvPicPr>
+                    <pic:cNvPr id="0" name="Picture 14"/>
+                    <pic:cNvPicPr>
+                      <a:picLocks noChangeAspect="1" noChangeArrowheads="1"/>
+                    </pic:cNvPicPr>
+                  </pic:nvPicPr>
+                  <pic:blipFill>
+                    <a:blip r:embed="rId26" cstate="print">
+                      <a:extLst>
+                        <a:ext uri="{28A0092B-C50C-407E-A947-70E740481C1C}">
+                          <a14:useLocalDpi xmlns:a14="http://schemas.microsoft.com/office/drawing/2010/main" val="0"/>
+                        </a:ext>
+                      </a:extLst>
+                    </a:blip>
+                    <a:srcRect/>
+                    <a:stretch>
+                      <a:fillRect/>
+                    </a:stretch>
+                  </pic:blipFill>
+                  <pic:spPr bwMode="auto">
+                    <a:xfrm>
+                      <a:off x="0" y="0"/>
+                      <a:ext cx="5760720" cy="3596640"/>
+                    </a:xfrm>
+                    <a:prstGeom prst="rect">
+                      <a:avLst/>
+                    </a:prstGeom>
+                    <a:noFill/>
+                    <a:ln>
+                      <a:noFill/>
+                    </a:ln>
+                  </pic:spPr>
+                </pic:pic>
+              </a:graphicData>
+            </a:graphic>
+          </wp:inline>
+        </w:drawing>
+      </w:r>
+    </w:p>
+    <w:p>
+      <w:r>
+        <w:t>W tym przypadku nie widać wyraźnej zależności. Wpłynąć na to mógł charakter danych</w:t>
+      </w:r>
+      <w:r>
+        <w:t>, np. szumy losowe. Najlepszy model z Split=0.8 (podział 80-20): RMSE=</w:t>
+      </w:r>
+      <w:r>
+        <w:t>1.972612</w:t>
+      </w:r>
+      <w:r>
+        <w:t>; MAPE=</w:t>
+      </w:r>
+      <w:r>
+        <w:t>2.158708</w:t>
+      </w:r>
+      <w:r>
+        <w:t>.</w:t>
+      </w:r>
+    </w:p>
+    <w:p>
+      <w:pPr>
+        <w:pStyle w:val="Nagwek3"/>
+        <w:numPr>
+          <w:ilvl w:val="0"/>
+          <w:numId w:val="11"/>
+        </w:numPr>
+      </w:pPr>
+      <w:r>
+        <w:t>Funkcje aktywacji</w:t>
+      </w:r>
+    </w:p>
+    <w:p>
+      <w:r>
+        <w:rPr>
+          <w:noProof/>
+        </w:rPr>
+        <w:drawing>
+          <wp:inline distT="0" distB="0" distL="0" distR="0" wp14:anchorId="45761374" wp14:editId="673C1070">
+            <wp:extent cx="5524500" cy="3449159"/>
+            <wp:effectExtent l="0" t="0" r="0" b="0"/>
+            <wp:docPr id="702861474" name="Obraz 11"/>
+            <wp:cNvGraphicFramePr>
+              <a:graphicFrameLocks xmlns:a="http://schemas.openxmlformats.org/drawingml/2006/main" noChangeAspect="1"/>
+            </wp:cNvGraphicFramePr>
+            <a:graphic xmlns:a="http://schemas.openxmlformats.org/drawingml/2006/main">
+              <a:graphicData uri="http://schemas.openxmlformats.org/drawingml/2006/picture">
+                <pic:pic xmlns:pic="http://schemas.openxmlformats.org/drawingml/2006/picture">
+                  <pic:nvPicPr>
+                    <pic:cNvPr id="0" name="Picture 15"/>
+                    <pic:cNvPicPr>
+                      <a:picLocks noChangeAspect="1" noChangeArrowheads="1"/>
+                    </pic:cNvPicPr>
+                  </pic:nvPicPr>
+                  <pic:blipFill>
+                    <a:blip r:embed="rId27" cstate="print">
+                      <a:extLst>
+                        <a:ext uri="{28A0092B-C50C-407E-A947-70E740481C1C}">
+                          <a14:useLocalDpi xmlns:a14="http://schemas.microsoft.com/office/drawing/2010/main" val="0"/>
+                        </a:ext>
+                      </a:extLst>
+                    </a:blip>
+                    <a:srcRect/>
+                    <a:stretch>
+                      <a:fillRect/>
+                    </a:stretch>
+                  </pic:blipFill>
+                  <pic:spPr bwMode="auto">
+                    <a:xfrm>
+                      <a:off x="0" y="0"/>
+                      <a:ext cx="5548825" cy="3464346"/>
+                    </a:xfrm>
+                    <a:prstGeom prst="rect">
+                      <a:avLst/>
+                    </a:prstGeom>
+                    <a:noFill/>
+                    <a:ln>
+                      <a:noFill/>
+                    </a:ln>
+                  </pic:spPr>
+                </pic:pic>
+              </a:graphicData>
+            </a:graphic>
+          </wp:inline>
+        </w:drawing>
+      </w:r>
+    </w:p>
+    <w:p>
+      <w:r>
+        <w:lastRenderedPageBreak/>
+        <w:t xml:space="preserve">Najlepsze wyniki dały funkcje </w:t>
+      </w:r>
+      <w:proofErr w:type="spellStart"/>
+      <w:r>
+        <w:t>ReLU</w:t>
+      </w:r>
+      <w:proofErr w:type="spellEnd"/>
+      <w:r>
+        <w:t xml:space="preserve">  oraz tangens hiperboliczny. Najlepszy model z </w:t>
+      </w:r>
+      <w:proofErr w:type="spellStart"/>
+      <w:r>
+        <w:t>Activation</w:t>
+      </w:r>
+      <w:proofErr w:type="spellEnd"/>
+      <w:r>
+        <w:t>=”</w:t>
+      </w:r>
+      <w:proofErr w:type="spellStart"/>
+      <w:r>
+        <w:t>relu</w:t>
+      </w:r>
+      <w:proofErr w:type="spellEnd"/>
+      <w:r>
+        <w:t>”: RMSE=</w:t>
+      </w:r>
+      <w:r>
+        <w:t>1.949950</w:t>
+      </w:r>
+      <w:r>
+        <w:t>; MAPE=</w:t>
+      </w:r>
+      <w:r>
+        <w:t>2.075116</w:t>
+      </w:r>
+      <w:r>
+        <w:t>.</w:t>
+      </w:r>
+    </w:p>
+    <w:p>
+      <w:pPr>
+        <w:pStyle w:val="Nagwek3"/>
+        <w:numPr>
+          <w:ilvl w:val="0"/>
+          <w:numId w:val="11"/>
+        </w:numPr>
+      </w:pPr>
+      <w:r>
+        <w:t>Liczba warstw ukrytych</w:t>
+      </w:r>
+    </w:p>
+    <w:p>
+      <w:r>
+        <w:rPr>
+          <w:noProof/>
+        </w:rPr>
+        <w:drawing>
+          <wp:inline distT="0" distB="0" distL="0" distR="0" wp14:anchorId="2C049E39" wp14:editId="4111E99D">
+            <wp:extent cx="5760720" cy="3596640"/>
+            <wp:effectExtent l="0" t="0" r="0" b="3810"/>
+            <wp:docPr id="1511776162" name="Obraz 12"/>
+            <wp:cNvGraphicFramePr>
+              <a:graphicFrameLocks xmlns:a="http://schemas.openxmlformats.org/drawingml/2006/main" noChangeAspect="1"/>
+            </wp:cNvGraphicFramePr>
+            <a:graphic xmlns:a="http://schemas.openxmlformats.org/drawingml/2006/main">
+              <a:graphicData uri="http://schemas.openxmlformats.org/drawingml/2006/picture">
+                <pic:pic xmlns:pic="http://schemas.openxmlformats.org/drawingml/2006/picture">
+                  <pic:nvPicPr>
+                    <pic:cNvPr id="0" name="Picture 16"/>
+                    <pic:cNvPicPr>
+                      <a:picLocks noChangeAspect="1" noChangeArrowheads="1"/>
+                    </pic:cNvPicPr>
+                  </pic:nvPicPr>
+                  <pic:blipFill>
+                    <a:blip r:embed="rId28" cstate="print">
+                      <a:extLst>
+                        <a:ext uri="{28A0092B-C50C-407E-A947-70E740481C1C}">
+                          <a14:useLocalDpi xmlns:a14="http://schemas.microsoft.com/office/drawing/2010/main" val="0"/>
+                        </a:ext>
+                      </a:extLst>
+                    </a:blip>
+                    <a:srcRect/>
+                    <a:stretch>
+                      <a:fillRect/>
+                    </a:stretch>
+                  </pic:blipFill>
+                  <pic:spPr bwMode="auto">
+                    <a:xfrm>
+                      <a:off x="0" y="0"/>
+                      <a:ext cx="5760720" cy="3596640"/>
+                    </a:xfrm>
+                    <a:prstGeom prst="rect">
+                      <a:avLst/>
+                    </a:prstGeom>
+                    <a:noFill/>
+                    <a:ln>
+                      <a:noFill/>
+                    </a:ln>
+                  </pic:spPr>
+                </pic:pic>
+              </a:graphicData>
+            </a:graphic>
+          </wp:inline>
+        </w:drawing>
+      </w:r>
+    </w:p>
+    <w:p>
+      <w:r>
+        <w:t>Modele wyuczone z wykorzystaniem sieci z dwiema warstwami ukrytymi dają przeciętnie gorsze rezultaty, z dużo większym rozrzutem. Może to wynikać z tego, że pozostałe parametry, które były dobre w przypadku sieci z jedną warstwą ukrytą, niekoniecznie muszą być odpowiednie dla dwóch warstw ukrytych.</w:t>
+      </w:r>
+    </w:p>
+    <w:p>
+      <w:pPr>
+        <w:pStyle w:val="Nagwek3"/>
+        <w:numPr>
+          <w:ilvl w:val="0"/>
+          <w:numId w:val="11"/>
+        </w:numPr>
+      </w:pPr>
+      <w:r>
+        <w:t>Liczba neuronów drugiej warstwy ukrytej</w:t>
+      </w:r>
+    </w:p>
+    <w:p>
+      <w:r>
+        <w:rPr>
+          <w:noProof/>
+        </w:rPr>
+        <w:drawing>
+          <wp:inline distT="0" distB="0" distL="0" distR="0" wp14:anchorId="20F1EED9" wp14:editId="27714FDF">
+            <wp:extent cx="5284730" cy="3299460"/>
+            <wp:effectExtent l="0" t="0" r="0" b="0"/>
+            <wp:docPr id="2087728320" name="Obraz 13"/>
+            <wp:cNvGraphicFramePr>
+              <a:graphicFrameLocks xmlns:a="http://schemas.openxmlformats.org/drawingml/2006/main" noChangeAspect="1"/>
+            </wp:cNvGraphicFramePr>
+            <a:graphic xmlns:a="http://schemas.openxmlformats.org/drawingml/2006/main">
+              <a:graphicData uri="http://schemas.openxmlformats.org/drawingml/2006/picture">
+                <pic:pic xmlns:pic="http://schemas.openxmlformats.org/drawingml/2006/picture">
+                  <pic:nvPicPr>
+                    <pic:cNvPr id="0" name="Picture 17"/>
+                    <pic:cNvPicPr>
+                      <a:picLocks noChangeAspect="1" noChangeArrowheads="1"/>
+                    </pic:cNvPicPr>
+                  </pic:nvPicPr>
+                  <pic:blipFill>
+                    <a:blip r:embed="rId29" cstate="print">
+                      <a:extLst>
+                        <a:ext uri="{28A0092B-C50C-407E-A947-70E740481C1C}">
+                          <a14:useLocalDpi xmlns:a14="http://schemas.microsoft.com/office/drawing/2010/main" val="0"/>
+                        </a:ext>
+                      </a:extLst>
+                    </a:blip>
+                    <a:srcRect/>
+                    <a:stretch>
+                      <a:fillRect/>
+                    </a:stretch>
+                  </pic:blipFill>
+                  <pic:spPr bwMode="auto">
+                    <a:xfrm>
+                      <a:off x="0" y="0"/>
+                      <a:ext cx="5300532" cy="3309326"/>
+                    </a:xfrm>
+                    <a:prstGeom prst="rect">
+                      <a:avLst/>
+                    </a:prstGeom>
+                    <a:noFill/>
+                    <a:ln>
+                      <a:noFill/>
+                    </a:ln>
+                  </pic:spPr>
+                </pic:pic>
+              </a:graphicData>
+            </a:graphic>
+          </wp:inline>
+        </w:drawing>
+      </w:r>
+    </w:p>
+    <w:p>
+      <w:r>
+        <w:lastRenderedPageBreak/>
+        <w:t>Zwiększanie liczby neuronów w drugiej warstwie ukrytej wyraźnie poprawia jakość modelu. Najlepszy model z H2_Nodes=16: RMSE=</w:t>
+      </w:r>
+      <w:r>
+        <w:t>3.631074</w:t>
+      </w:r>
+      <w:r>
+        <w:t>; MAPE=</w:t>
+      </w:r>
+      <w:r>
+        <w:t>4.859652</w:t>
+      </w:r>
+      <w:r>
+        <w:t>.</w:t>
+      </w:r>
+    </w:p>
+    <w:p>
+      <w:pPr>
+        <w:pStyle w:val="Nagwek1"/>
+      </w:pPr>
+      <w:r>
+        <w:t>Wnioski</w:t>
+      </w:r>
+    </w:p>
+    <w:p>
+      <w:pPr>
+        <w:pStyle w:val="Akapitzlist"/>
+        <w:numPr>
+          <w:ilvl w:val="0"/>
+          <w:numId w:val="12"/>
+        </w:numPr>
+      </w:pPr>
+      <w:r>
+        <w:t xml:space="preserve">Samodzielnie napisana sieć neuronowa, przy odpowiednim doborze parametrów, potrafi przewidywać notowania giełdowe ze średnim błędem </w:t>
+      </w:r>
+      <w:r>
+        <w:t xml:space="preserve">niższym niż w obu </w:t>
+      </w:r>
+      <w:hyperlink w:anchor="_Inne_opracowania" w:history="1">
+        <w:r>
+          <w:rPr>
+            <w:rStyle w:val="Hipercze"/>
+          </w:rPr>
+          <w:t>wyżej wspomnianych opracowaniach</w:t>
+        </w:r>
+      </w:hyperlink>
+      <w:r>
+        <w:t>.</w:t>
+      </w:r>
+    </w:p>
+    <w:p>
+      <w:pPr>
+        <w:pStyle w:val="Akapitzlist"/>
+        <w:numPr>
+          <w:ilvl w:val="0"/>
+          <w:numId w:val="12"/>
+        </w:numPr>
+      </w:pPr>
+      <w:r>
+        <w:t>Dla tego problemu sieci z jedną warstwą ukrytą okazały się lepsze, niż te z dwiema, choć na podstawie przeprowadzonych testów trudno powiedzieć, czy wynika to z nieodpowiedniego doboru pozostały parametrów, czy z charakteru danych.</w:t>
+      </w:r>
+    </w:p>
+    <w:p>
+      <w:pPr>
+        <w:pStyle w:val="Akapitzlist"/>
+        <w:numPr>
+          <w:ilvl w:val="0"/>
+          <w:numId w:val="12"/>
+        </w:numPr>
+      </w:pPr>
+      <w:r>
+        <w:t>Zwiększanie parametrów takich jak liczba neuronów, liczba epok, szybkość uczenia, zakres inicjalizacji wag może przynieść korzyści, jednak należy uważać, gdyż zbyt wysokie wartości mogą prowadzić do przeszkolenia modelu.</w:t>
+      </w:r>
+    </w:p>
+    <w:p>
+      <w:pPr>
+        <w:pStyle w:val="Akapitzlist"/>
+        <w:numPr>
+          <w:ilvl w:val="0"/>
+          <w:numId w:val="12"/>
+        </w:numPr>
+      </w:pPr>
+      <w:r>
+        <w:t xml:space="preserve">Najlepszą funkcją aktywacji do tego problemu okazała się funkcja </w:t>
+      </w:r>
+      <w:proofErr w:type="spellStart"/>
+      <w:r>
+        <w:t>ReLU</w:t>
+      </w:r>
+      <w:proofErr w:type="spellEnd"/>
+      <w:r>
+        <w:t>.</w:t>
+      </w:r>
+    </w:p>
+    <w:p>
+      <w:pPr>
+        <w:pStyle w:val="Akapitzlist"/>
+        <w:numPr>
+          <w:ilvl w:val="0"/>
+          <w:numId w:val="12"/>
+        </w:numPr>
+      </w:pPr>
+      <w:r>
+        <w:t>Najlepszym podziałem zbioru danych w tym przypadku było 80-20.</w:t>
+      </w:r>
+    </w:p>
     <w:p/>
     <w:sectPr>
       <w:pgSz w:w="11906" w:h="16838"/>
@@ -16857,6 +19538,56 @@
     </w:sectPr>
   </w:body>
 </w:document>
+</file>
+
+<file path=word/endnotes.xml><?xml version="1.0" encoding="utf-8"?>
+<w:endnotes xmlns:wpc="http://schemas.microsoft.com/office/word/2010/wordprocessingCanvas" xmlns:cx="http://schemas.microsoft.com/office/drawing/2014/chartex" xmlns:cx1="http://schemas.microsoft.com/office/drawing/2015/9/8/chartex" xmlns:cx2="http://schemas.microsoft.com/office/drawing/2015/10/21/chartex" xmlns:cx3="http://schemas.microsoft.com/office/drawing/2016/5/9/chartex" xmlns:cx4="http://schemas.microsoft.com/office/drawing/2016/5/10/chartex" xmlns:cx5="http://schemas.microsoft.com/office/drawing/2016/5/11/chartex" xmlns:cx6="http://schemas.microsoft.com/office/drawing/2016/5/12/chartex" xmlns:cx7="http://schemas.microsoft.com/office/drawing/2016/5/13/chartex" xmlns:cx8="http://schemas.microsoft.com/office/drawing/2016/5/14/chartex" xmlns:mc="http://schemas.openxmlformats.org/markup-compatibility/2006" xmlns:aink="http://schemas.microsoft.com/office/drawing/2016/ink" xmlns:am3d="http://schemas.microsoft.com/office/drawing/2017/model3d" xmlns:o="urn:schemas-microsoft-com:office:office" xmlns:oel="http://schemas.microsoft.com/office/2019/extlst" xmlns:r="http://schemas.openxmlformats.org/officeDocument/2006/relationships" xmlns:m="http://schemas.openxmlformats.org/officeDocument/2006/math" xmlns:v="urn:schemas-microsoft-com:vml" xmlns:wp14="http://schemas.microsoft.com/office/word/2010/wordprocessingDrawing" xmlns:wp="http://schemas.openxmlformats.org/drawingml/2006/wordprocessingDrawing" xmlns:w10="urn:schemas-microsoft-com:office:word" xmlns:w="http://schemas.openxmlformats.org/wordprocessingml/2006/main" xmlns:w14="http://schemas.microsoft.com/office/word/2010/wordml" xmlns:w15="http://schemas.microsoft.com/office/word/2012/wordml" xmlns:w16cex="http://schemas.microsoft.com/office/word/2018/wordml/cex" xmlns:w16cid="http://schemas.microsoft.com/office/word/2016/wordml/cid" xmlns:w16="http://schemas.microsoft.com/office/word/2018/wordml" xmlns:w16du="http://schemas.microsoft.com/office/word/2023/wordml/word16du" xmlns:w16sdtdh="http://schemas.microsoft.com/office/word/2020/wordml/sdtdatahash" xmlns:w16sdtfl="http://schemas.microsoft.com/office/word/2024/wordml/sdtformatlock" xmlns:w16se="http://schemas.microsoft.com/office/word/2015/wordml/symex" xmlns:wpg="http://schemas.microsoft.com/office/word/2010/wordprocessingGroup" xmlns:wpi="http://schemas.microsoft.com/office/word/2010/wordprocessingInk" xmlns:wne="http://schemas.microsoft.com/office/word/2006/wordml" xmlns:wps="http://schemas.microsoft.com/office/word/2010/wordprocessingShape" mc:Ignorable="w14 w15 w16se w16cid w16 w16cex w16sdtdh w16sdtfl w16du wp14">
+  <w:endnote w:type="separator" w:id="-1">
+    <w:p>
+      <w:pPr>
+        <w:spacing w:after="0" w:line="240" w:lineRule="auto"/>
+      </w:pPr>
+      <w:r>
+        <w:separator/>
+      </w:r>
+    </w:p>
+  </w:endnote>
+  <w:endnote w:type="continuationSeparator" w:id="0">
+    <w:p>
+      <w:pPr>
+        <w:spacing w:after="0" w:line="240" w:lineRule="auto"/>
+      </w:pPr>
+      <w:r>
+        <w:continuationSeparator/>
+      </w:r>
+    </w:p>
+  </w:endnote>
+</w:endnotes>
+</file>
+
+<file path=word/footnotes.xml><?xml version="1.0" encoding="utf-8"?>
+<w:footnotes xmlns:wpc="http://schemas.microsoft.com/office/word/2010/wordprocessingCanvas" xmlns:cx="http://schemas.microsoft.com/office/drawing/2014/chartex" xmlns:cx1="http://schemas.microsoft.com/office/drawing/2015/9/8/chartex" xmlns:cx2="http://schemas.microsoft.com/office/drawing/2015/10/21/chartex" xmlns:cx3="http://schemas.microsoft.com/office/drawing/2016/5/9/chartex" xmlns:cx4="http://schemas.microsoft.com/office/drawing/2016/5/10/chartex" xmlns:cx5="http://schemas.microsoft.com/office/drawing/2016/5/11/chartex" xmlns:cx6="http://schemas.microsoft.com/office/drawing/2016/5/12/chartex" xmlns:cx7="http://schemas.microsoft.com/office/drawing/2016/5/13/chartex" xmlns:cx8="http://schemas.microsoft.com/office/drawing/2016/5/14/chartex" xmlns:mc="http://schemas.openxmlformats.org/markup-compatibility/2006" xmlns:aink="http://schemas.microsoft.com/office/drawing/2016/ink" xmlns:am3d="http://schemas.microsoft.com/office/drawing/2017/model3d" xmlns:o="urn:schemas-microsoft-com:office:office" xmlns:oel="http://schemas.microsoft.com/office/2019/extlst" xmlns:r="http://schemas.openxmlformats.org/officeDocument/2006/relationships" xmlns:m="http://schemas.openxmlformats.org/officeDocument/2006/math" xmlns:v="urn:schemas-microsoft-com:vml" xmlns:wp14="http://schemas.microsoft.com/office/word/2010/wordprocessingDrawing" xmlns:wp="http://schemas.openxmlformats.org/drawingml/2006/wordprocessingDrawing" xmlns:w10="urn:schemas-microsoft-com:office:word" xmlns:w="http://schemas.openxmlformats.org/wordprocessingml/2006/main" xmlns:w14="http://schemas.microsoft.com/office/word/2010/wordml" xmlns:w15="http://schemas.microsoft.com/office/word/2012/wordml" xmlns:w16cex="http://schemas.microsoft.com/office/word/2018/wordml/cex" xmlns:w16cid="http://schemas.microsoft.com/office/word/2016/wordml/cid" xmlns:w16="http://schemas.microsoft.com/office/word/2018/wordml" xmlns:w16du="http://schemas.microsoft.com/office/word/2023/wordml/word16du" xmlns:w16sdtdh="http://schemas.microsoft.com/office/word/2020/wordml/sdtdatahash" xmlns:w16sdtfl="http://schemas.microsoft.com/office/word/2024/wordml/sdtformatlock" xmlns:w16se="http://schemas.microsoft.com/office/word/2015/wordml/symex" xmlns:wpg="http://schemas.microsoft.com/office/word/2010/wordprocessingGroup" xmlns:wpi="http://schemas.microsoft.com/office/word/2010/wordprocessingInk" xmlns:wne="http://schemas.microsoft.com/office/word/2006/wordml" xmlns:wps="http://schemas.microsoft.com/office/word/2010/wordprocessingShape" mc:Ignorable="w14 w15 w16se w16cid w16 w16cex w16sdtdh w16sdtfl w16du wp14">
+  <w:footnote w:type="separator" w:id="-1">
+    <w:p>
+      <w:pPr>
+        <w:spacing w:after="0" w:line="240" w:lineRule="auto"/>
+      </w:pPr>
+      <w:r>
+        <w:separator/>
+      </w:r>
+    </w:p>
+  </w:footnote>
+  <w:footnote w:type="continuationSeparator" w:id="0">
+    <w:p>
+      <w:pPr>
+        <w:spacing w:after="0" w:line="240" w:lineRule="auto"/>
+      </w:pPr>
+      <w:r>
+        <w:continuationSeparator/>
+      </w:r>
+    </w:p>
+  </w:footnote>
+</w:footnotes>
 </file>
 
 <file path=word/numbering.xml><?xml version="1.0" encoding="utf-8"?>
@@ -16951,6 +19682,95 @@
     </w:lvl>
   </w:abstractNum>
   <w:abstractNum w:abstractNumId="1" w15:restartNumberingAfterBreak="0">
+    <w:nsid w:val="18B63793"/>
+    <w:multiLevelType w:val="hybridMultilevel"/>
+    <w:tmpl w:val="1A08F69E"/>
+    <w:lvl w:ilvl="0" w:tplc="75ACB4F2">
+      <w:start w:val="1"/>
+      <w:numFmt w:val="upperRoman"/>
+      <w:lvlText w:val="%1."/>
+      <w:lvlJc w:val="left"/>
+      <w:pPr>
+        <w:ind w:left="1080" w:hanging="720"/>
+      </w:pPr>
+      <w:rPr>
+        <w:rFonts w:hint="default"/>
+      </w:rPr>
+    </w:lvl>
+    <w:lvl w:ilvl="1" w:tplc="04150019" w:tentative="1">
+      <w:start w:val="1"/>
+      <w:numFmt w:val="lowerLetter"/>
+      <w:lvlText w:val="%2."/>
+      <w:lvlJc w:val="left"/>
+      <w:pPr>
+        <w:ind w:left="1440" w:hanging="360"/>
+      </w:pPr>
+    </w:lvl>
+    <w:lvl w:ilvl="2" w:tplc="0415001B" w:tentative="1">
+      <w:start w:val="1"/>
+      <w:numFmt w:val="lowerRoman"/>
+      <w:lvlText w:val="%3."/>
+      <w:lvlJc w:val="right"/>
+      <w:pPr>
+        <w:ind w:left="2160" w:hanging="180"/>
+      </w:pPr>
+    </w:lvl>
+    <w:lvl w:ilvl="3" w:tplc="0415000F" w:tentative="1">
+      <w:start w:val="1"/>
+      <w:numFmt w:val="decimal"/>
+      <w:lvlText w:val="%4."/>
+      <w:lvlJc w:val="left"/>
+      <w:pPr>
+        <w:ind w:left="2880" w:hanging="360"/>
+      </w:pPr>
+    </w:lvl>
+    <w:lvl w:ilvl="4" w:tplc="04150019" w:tentative="1">
+      <w:start w:val="1"/>
+      <w:numFmt w:val="lowerLetter"/>
+      <w:lvlText w:val="%5."/>
+      <w:lvlJc w:val="left"/>
+      <w:pPr>
+        <w:ind w:left="3600" w:hanging="360"/>
+      </w:pPr>
+    </w:lvl>
+    <w:lvl w:ilvl="5" w:tplc="0415001B" w:tentative="1">
+      <w:start w:val="1"/>
+      <w:numFmt w:val="lowerRoman"/>
+      <w:lvlText w:val="%6."/>
+      <w:lvlJc w:val="right"/>
+      <w:pPr>
+        <w:ind w:left="4320" w:hanging="180"/>
+      </w:pPr>
+    </w:lvl>
+    <w:lvl w:ilvl="6" w:tplc="0415000F" w:tentative="1">
+      <w:start w:val="1"/>
+      <w:numFmt w:val="decimal"/>
+      <w:lvlText w:val="%7."/>
+      <w:lvlJc w:val="left"/>
+      <w:pPr>
+        <w:ind w:left="5040" w:hanging="360"/>
+      </w:pPr>
+    </w:lvl>
+    <w:lvl w:ilvl="7" w:tplc="04150019" w:tentative="1">
+      <w:start w:val="1"/>
+      <w:numFmt w:val="lowerLetter"/>
+      <w:lvlText w:val="%8."/>
+      <w:lvlJc w:val="left"/>
+      <w:pPr>
+        <w:ind w:left="5760" w:hanging="360"/>
+      </w:pPr>
+    </w:lvl>
+    <w:lvl w:ilvl="8" w:tplc="0415001B" w:tentative="1">
+      <w:start w:val="1"/>
+      <w:numFmt w:val="lowerRoman"/>
+      <w:lvlText w:val="%9."/>
+      <w:lvlJc w:val="right"/>
+      <w:pPr>
+        <w:ind w:left="6480" w:hanging="180"/>
+      </w:pPr>
+    </w:lvl>
+  </w:abstractNum>
+  <w:abstractNum w:abstractNumId="2" w15:restartNumberingAfterBreak="0">
     <w:nsid w:val="1FBC3847"/>
     <w:multiLevelType w:val="hybridMultilevel"/>
     <w:tmpl w:val="57A01188"/>
@@ -17036,7 +19856,7 @@
       </w:pPr>
     </w:lvl>
   </w:abstractNum>
-  <w:abstractNum w:abstractNumId="2" w15:restartNumberingAfterBreak="0">
+  <w:abstractNum w:abstractNumId="3" w15:restartNumberingAfterBreak="0">
     <w:nsid w:val="28D23B5D"/>
     <w:multiLevelType w:val="multilevel"/>
     <w:tmpl w:val="513E3E0C"/>
@@ -17185,7 +20005,209 @@
       </w:rPr>
     </w:lvl>
   </w:abstractNum>
-  <w:abstractNum w:abstractNumId="3" w15:restartNumberingAfterBreak="0">
+  <w:abstractNum w:abstractNumId="4" w15:restartNumberingAfterBreak="0">
+    <w:nsid w:val="2DD45EA4"/>
+    <w:multiLevelType w:val="hybridMultilevel"/>
+    <w:tmpl w:val="49C21D70"/>
+    <w:lvl w:ilvl="0" w:tplc="0415000F">
+      <w:start w:val="1"/>
+      <w:numFmt w:val="decimal"/>
+      <w:lvlText w:val="%1."/>
+      <w:lvlJc w:val="left"/>
+      <w:pPr>
+        <w:ind w:left="720" w:hanging="360"/>
+      </w:pPr>
+      <w:rPr>
+        <w:rFonts w:hint="default"/>
+      </w:rPr>
+    </w:lvl>
+    <w:lvl w:ilvl="1" w:tplc="04150019" w:tentative="1">
+      <w:start w:val="1"/>
+      <w:numFmt w:val="lowerLetter"/>
+      <w:lvlText w:val="%2."/>
+      <w:lvlJc w:val="left"/>
+      <w:pPr>
+        <w:ind w:left="1440" w:hanging="360"/>
+      </w:pPr>
+    </w:lvl>
+    <w:lvl w:ilvl="2" w:tplc="0415001B" w:tentative="1">
+      <w:start w:val="1"/>
+      <w:numFmt w:val="lowerRoman"/>
+      <w:lvlText w:val="%3."/>
+      <w:lvlJc w:val="right"/>
+      <w:pPr>
+        <w:ind w:left="2160" w:hanging="180"/>
+      </w:pPr>
+    </w:lvl>
+    <w:lvl w:ilvl="3" w:tplc="0415000F" w:tentative="1">
+      <w:start w:val="1"/>
+      <w:numFmt w:val="decimal"/>
+      <w:lvlText w:val="%4."/>
+      <w:lvlJc w:val="left"/>
+      <w:pPr>
+        <w:ind w:left="2880" w:hanging="360"/>
+      </w:pPr>
+    </w:lvl>
+    <w:lvl w:ilvl="4" w:tplc="04150019" w:tentative="1">
+      <w:start w:val="1"/>
+      <w:numFmt w:val="lowerLetter"/>
+      <w:lvlText w:val="%5."/>
+      <w:lvlJc w:val="left"/>
+      <w:pPr>
+        <w:ind w:left="3600" w:hanging="360"/>
+      </w:pPr>
+    </w:lvl>
+    <w:lvl w:ilvl="5" w:tplc="0415001B" w:tentative="1">
+      <w:start w:val="1"/>
+      <w:numFmt w:val="lowerRoman"/>
+      <w:lvlText w:val="%6."/>
+      <w:lvlJc w:val="right"/>
+      <w:pPr>
+        <w:ind w:left="4320" w:hanging="180"/>
+      </w:pPr>
+    </w:lvl>
+    <w:lvl w:ilvl="6" w:tplc="0415000F" w:tentative="1">
+      <w:start w:val="1"/>
+      <w:numFmt w:val="decimal"/>
+      <w:lvlText w:val="%7."/>
+      <w:lvlJc w:val="left"/>
+      <w:pPr>
+        <w:ind w:left="5040" w:hanging="360"/>
+      </w:pPr>
+    </w:lvl>
+    <w:lvl w:ilvl="7" w:tplc="04150019" w:tentative="1">
+      <w:start w:val="1"/>
+      <w:numFmt w:val="lowerLetter"/>
+      <w:lvlText w:val="%8."/>
+      <w:lvlJc w:val="left"/>
+      <w:pPr>
+        <w:ind w:left="5760" w:hanging="360"/>
+      </w:pPr>
+    </w:lvl>
+    <w:lvl w:ilvl="8" w:tplc="0415001B" w:tentative="1">
+      <w:start w:val="1"/>
+      <w:numFmt w:val="lowerRoman"/>
+      <w:lvlText w:val="%9."/>
+      <w:lvlJc w:val="right"/>
+      <w:pPr>
+        <w:ind w:left="6480" w:hanging="180"/>
+      </w:pPr>
+    </w:lvl>
+  </w:abstractNum>
+  <w:abstractNum w:abstractNumId="5" w15:restartNumberingAfterBreak="0">
+    <w:nsid w:val="38F83E07"/>
+    <w:multiLevelType w:val="hybridMultilevel"/>
+    <w:tmpl w:val="A970D106"/>
+    <w:lvl w:ilvl="0" w:tplc="04150001">
+      <w:start w:val="1"/>
+      <w:numFmt w:val="bullet"/>
+      <w:lvlText w:val=""/>
+      <w:lvlJc w:val="left"/>
+      <w:pPr>
+        <w:ind w:left="720" w:hanging="360"/>
+      </w:pPr>
+      <w:rPr>
+        <w:rFonts w:ascii="Symbol" w:hAnsi="Symbol" w:hint="default"/>
+      </w:rPr>
+    </w:lvl>
+    <w:lvl w:ilvl="1" w:tplc="04150003" w:tentative="1">
+      <w:start w:val="1"/>
+      <w:numFmt w:val="bullet"/>
+      <w:lvlText w:val="o"/>
+      <w:lvlJc w:val="left"/>
+      <w:pPr>
+        <w:ind w:left="1440" w:hanging="360"/>
+      </w:pPr>
+      <w:rPr>
+        <w:rFonts w:ascii="Courier New" w:hAnsi="Courier New" w:cs="Courier New" w:hint="default"/>
+      </w:rPr>
+    </w:lvl>
+    <w:lvl w:ilvl="2" w:tplc="04150005" w:tentative="1">
+      <w:start w:val="1"/>
+      <w:numFmt w:val="bullet"/>
+      <w:lvlText w:val=""/>
+      <w:lvlJc w:val="left"/>
+      <w:pPr>
+        <w:ind w:left="2160" w:hanging="360"/>
+      </w:pPr>
+      <w:rPr>
+        <w:rFonts w:ascii="Wingdings" w:hAnsi="Wingdings" w:hint="default"/>
+      </w:rPr>
+    </w:lvl>
+    <w:lvl w:ilvl="3" w:tplc="04150001" w:tentative="1">
+      <w:start w:val="1"/>
+      <w:numFmt w:val="bullet"/>
+      <w:lvlText w:val=""/>
+      <w:lvlJc w:val="left"/>
+      <w:pPr>
+        <w:ind w:left="2880" w:hanging="360"/>
+      </w:pPr>
+      <w:rPr>
+        <w:rFonts w:ascii="Symbol" w:hAnsi="Symbol" w:hint="default"/>
+      </w:rPr>
+    </w:lvl>
+    <w:lvl w:ilvl="4" w:tplc="04150003" w:tentative="1">
+      <w:start w:val="1"/>
+      <w:numFmt w:val="bullet"/>
+      <w:lvlText w:val="o"/>
+      <w:lvlJc w:val="left"/>
+      <w:pPr>
+        <w:ind w:left="3600" w:hanging="360"/>
+      </w:pPr>
+      <w:rPr>
+        <w:rFonts w:ascii="Courier New" w:hAnsi="Courier New" w:cs="Courier New" w:hint="default"/>
+      </w:rPr>
+    </w:lvl>
+    <w:lvl w:ilvl="5" w:tplc="04150005" w:tentative="1">
+      <w:start w:val="1"/>
+      <w:numFmt w:val="bullet"/>
+      <w:lvlText w:val=""/>
+      <w:lvlJc w:val="left"/>
+      <w:pPr>
+        <w:ind w:left="4320" w:hanging="360"/>
+      </w:pPr>
+      <w:rPr>
+        <w:rFonts w:ascii="Wingdings" w:hAnsi="Wingdings" w:hint="default"/>
+      </w:rPr>
+    </w:lvl>
+    <w:lvl w:ilvl="6" w:tplc="04150001" w:tentative="1">
+      <w:start w:val="1"/>
+      <w:numFmt w:val="bullet"/>
+      <w:lvlText w:val=""/>
+      <w:lvlJc w:val="left"/>
+      <w:pPr>
+        <w:ind w:left="5040" w:hanging="360"/>
+      </w:pPr>
+      <w:rPr>
+        <w:rFonts w:ascii="Symbol" w:hAnsi="Symbol" w:hint="default"/>
+      </w:rPr>
+    </w:lvl>
+    <w:lvl w:ilvl="7" w:tplc="04150003" w:tentative="1">
+      <w:start w:val="1"/>
+      <w:numFmt w:val="bullet"/>
+      <w:lvlText w:val="o"/>
+      <w:lvlJc w:val="left"/>
+      <w:pPr>
+        <w:ind w:left="5760" w:hanging="360"/>
+      </w:pPr>
+      <w:rPr>
+        <w:rFonts w:ascii="Courier New" w:hAnsi="Courier New" w:cs="Courier New" w:hint="default"/>
+      </w:rPr>
+    </w:lvl>
+    <w:lvl w:ilvl="8" w:tplc="04150005" w:tentative="1">
+      <w:start w:val="1"/>
+      <w:numFmt w:val="bullet"/>
+      <w:lvlText w:val=""/>
+      <w:lvlJc w:val="left"/>
+      <w:pPr>
+        <w:ind w:left="6480" w:hanging="360"/>
+      </w:pPr>
+      <w:rPr>
+        <w:rFonts w:ascii="Wingdings" w:hAnsi="Wingdings" w:hint="default"/>
+      </w:rPr>
+    </w:lvl>
+  </w:abstractNum>
+  <w:abstractNum w:abstractNumId="6" w15:restartNumberingAfterBreak="0">
     <w:nsid w:val="507141F3"/>
     <w:multiLevelType w:val="hybridMultilevel"/>
     <w:tmpl w:val="BE58C780"/>
@@ -17274,7 +20296,209 @@
       </w:pPr>
     </w:lvl>
   </w:abstractNum>
-  <w:abstractNum w:abstractNumId="4" w15:restartNumberingAfterBreak="0">
+  <w:abstractNum w:abstractNumId="7" w15:restartNumberingAfterBreak="0">
+    <w:nsid w:val="7270754D"/>
+    <w:multiLevelType w:val="hybridMultilevel"/>
+    <w:tmpl w:val="D694A776"/>
+    <w:lvl w:ilvl="0" w:tplc="04150001">
+      <w:start w:val="1"/>
+      <w:numFmt w:val="bullet"/>
+      <w:lvlText w:val=""/>
+      <w:lvlJc w:val="left"/>
+      <w:pPr>
+        <w:ind w:left="720" w:hanging="360"/>
+      </w:pPr>
+      <w:rPr>
+        <w:rFonts w:ascii="Symbol" w:hAnsi="Symbol" w:hint="default"/>
+      </w:rPr>
+    </w:lvl>
+    <w:lvl w:ilvl="1" w:tplc="04150003" w:tentative="1">
+      <w:start w:val="1"/>
+      <w:numFmt w:val="bullet"/>
+      <w:lvlText w:val="o"/>
+      <w:lvlJc w:val="left"/>
+      <w:pPr>
+        <w:ind w:left="1440" w:hanging="360"/>
+      </w:pPr>
+      <w:rPr>
+        <w:rFonts w:ascii="Courier New" w:hAnsi="Courier New" w:cs="Courier New" w:hint="default"/>
+      </w:rPr>
+    </w:lvl>
+    <w:lvl w:ilvl="2" w:tplc="04150005" w:tentative="1">
+      <w:start w:val="1"/>
+      <w:numFmt w:val="bullet"/>
+      <w:lvlText w:val=""/>
+      <w:lvlJc w:val="left"/>
+      <w:pPr>
+        <w:ind w:left="2160" w:hanging="360"/>
+      </w:pPr>
+      <w:rPr>
+        <w:rFonts w:ascii="Wingdings" w:hAnsi="Wingdings" w:hint="default"/>
+      </w:rPr>
+    </w:lvl>
+    <w:lvl w:ilvl="3" w:tplc="04150001" w:tentative="1">
+      <w:start w:val="1"/>
+      <w:numFmt w:val="bullet"/>
+      <w:lvlText w:val=""/>
+      <w:lvlJc w:val="left"/>
+      <w:pPr>
+        <w:ind w:left="2880" w:hanging="360"/>
+      </w:pPr>
+      <w:rPr>
+        <w:rFonts w:ascii="Symbol" w:hAnsi="Symbol" w:hint="default"/>
+      </w:rPr>
+    </w:lvl>
+    <w:lvl w:ilvl="4" w:tplc="04150003" w:tentative="1">
+      <w:start w:val="1"/>
+      <w:numFmt w:val="bullet"/>
+      <w:lvlText w:val="o"/>
+      <w:lvlJc w:val="left"/>
+      <w:pPr>
+        <w:ind w:left="3600" w:hanging="360"/>
+      </w:pPr>
+      <w:rPr>
+        <w:rFonts w:ascii="Courier New" w:hAnsi="Courier New" w:cs="Courier New" w:hint="default"/>
+      </w:rPr>
+    </w:lvl>
+    <w:lvl w:ilvl="5" w:tplc="04150005" w:tentative="1">
+      <w:start w:val="1"/>
+      <w:numFmt w:val="bullet"/>
+      <w:lvlText w:val=""/>
+      <w:lvlJc w:val="left"/>
+      <w:pPr>
+        <w:ind w:left="4320" w:hanging="360"/>
+      </w:pPr>
+      <w:rPr>
+        <w:rFonts w:ascii="Wingdings" w:hAnsi="Wingdings" w:hint="default"/>
+      </w:rPr>
+    </w:lvl>
+    <w:lvl w:ilvl="6" w:tplc="04150001" w:tentative="1">
+      <w:start w:val="1"/>
+      <w:numFmt w:val="bullet"/>
+      <w:lvlText w:val=""/>
+      <w:lvlJc w:val="left"/>
+      <w:pPr>
+        <w:ind w:left="5040" w:hanging="360"/>
+      </w:pPr>
+      <w:rPr>
+        <w:rFonts w:ascii="Symbol" w:hAnsi="Symbol" w:hint="default"/>
+      </w:rPr>
+    </w:lvl>
+    <w:lvl w:ilvl="7" w:tplc="04150003" w:tentative="1">
+      <w:start w:val="1"/>
+      <w:numFmt w:val="bullet"/>
+      <w:lvlText w:val="o"/>
+      <w:lvlJc w:val="left"/>
+      <w:pPr>
+        <w:ind w:left="5760" w:hanging="360"/>
+      </w:pPr>
+      <w:rPr>
+        <w:rFonts w:ascii="Courier New" w:hAnsi="Courier New" w:cs="Courier New" w:hint="default"/>
+      </w:rPr>
+    </w:lvl>
+    <w:lvl w:ilvl="8" w:tplc="04150005" w:tentative="1">
+      <w:start w:val="1"/>
+      <w:numFmt w:val="bullet"/>
+      <w:lvlText w:val=""/>
+      <w:lvlJc w:val="left"/>
+      <w:pPr>
+        <w:ind w:left="6480" w:hanging="360"/>
+      </w:pPr>
+      <w:rPr>
+        <w:rFonts w:ascii="Wingdings" w:hAnsi="Wingdings" w:hint="default"/>
+      </w:rPr>
+    </w:lvl>
+  </w:abstractNum>
+  <w:abstractNum w:abstractNumId="8" w15:restartNumberingAfterBreak="0">
+    <w:nsid w:val="77B53D50"/>
+    <w:multiLevelType w:val="hybridMultilevel"/>
+    <w:tmpl w:val="67B29D2C"/>
+    <w:lvl w:ilvl="0" w:tplc="999C9396">
+      <w:start w:val="1"/>
+      <w:numFmt w:val="upperRoman"/>
+      <w:lvlText w:val="%1."/>
+      <w:lvlJc w:val="left"/>
+      <w:pPr>
+        <w:ind w:left="1080" w:hanging="720"/>
+      </w:pPr>
+      <w:rPr>
+        <w:rFonts w:hint="default"/>
+      </w:rPr>
+    </w:lvl>
+    <w:lvl w:ilvl="1" w:tplc="04150019" w:tentative="1">
+      <w:start w:val="1"/>
+      <w:numFmt w:val="lowerLetter"/>
+      <w:lvlText w:val="%2."/>
+      <w:lvlJc w:val="left"/>
+      <w:pPr>
+        <w:ind w:left="1440" w:hanging="360"/>
+      </w:pPr>
+    </w:lvl>
+    <w:lvl w:ilvl="2" w:tplc="0415001B" w:tentative="1">
+      <w:start w:val="1"/>
+      <w:numFmt w:val="lowerRoman"/>
+      <w:lvlText w:val="%3."/>
+      <w:lvlJc w:val="right"/>
+      <w:pPr>
+        <w:ind w:left="2160" w:hanging="180"/>
+      </w:pPr>
+    </w:lvl>
+    <w:lvl w:ilvl="3" w:tplc="0415000F" w:tentative="1">
+      <w:start w:val="1"/>
+      <w:numFmt w:val="decimal"/>
+      <w:lvlText w:val="%4."/>
+      <w:lvlJc w:val="left"/>
+      <w:pPr>
+        <w:ind w:left="2880" w:hanging="360"/>
+      </w:pPr>
+    </w:lvl>
+    <w:lvl w:ilvl="4" w:tplc="04150019" w:tentative="1">
+      <w:start w:val="1"/>
+      <w:numFmt w:val="lowerLetter"/>
+      <w:lvlText w:val="%5."/>
+      <w:lvlJc w:val="left"/>
+      <w:pPr>
+        <w:ind w:left="3600" w:hanging="360"/>
+      </w:pPr>
+    </w:lvl>
+    <w:lvl w:ilvl="5" w:tplc="0415001B" w:tentative="1">
+      <w:start w:val="1"/>
+      <w:numFmt w:val="lowerRoman"/>
+      <w:lvlText w:val="%6."/>
+      <w:lvlJc w:val="right"/>
+      <w:pPr>
+        <w:ind w:left="4320" w:hanging="180"/>
+      </w:pPr>
+    </w:lvl>
+    <w:lvl w:ilvl="6" w:tplc="0415000F" w:tentative="1">
+      <w:start w:val="1"/>
+      <w:numFmt w:val="decimal"/>
+      <w:lvlText w:val="%7."/>
+      <w:lvlJc w:val="left"/>
+      <w:pPr>
+        <w:ind w:left="5040" w:hanging="360"/>
+      </w:pPr>
+    </w:lvl>
+    <w:lvl w:ilvl="7" w:tplc="04150019" w:tentative="1">
+      <w:start w:val="1"/>
+      <w:numFmt w:val="lowerLetter"/>
+      <w:lvlText w:val="%8."/>
+      <w:lvlJc w:val="left"/>
+      <w:pPr>
+        <w:ind w:left="5760" w:hanging="360"/>
+      </w:pPr>
+    </w:lvl>
+    <w:lvl w:ilvl="8" w:tplc="0415001B" w:tentative="1">
+      <w:start w:val="1"/>
+      <w:numFmt w:val="lowerRoman"/>
+      <w:lvlText w:val="%9."/>
+      <w:lvlJc w:val="right"/>
+      <w:pPr>
+        <w:ind w:left="6480" w:hanging="180"/>
+      </w:pPr>
+    </w:lvl>
+  </w:abstractNum>
+  <w:abstractNum w:abstractNumId="9" w15:restartNumberingAfterBreak="0">
     <w:nsid w:val="7B123DF6"/>
     <w:multiLevelType w:val="hybridMultilevel"/>
     <w:tmpl w:val="F6D4B244"/>
@@ -17363,7 +20587,7 @@
       </w:pPr>
     </w:lvl>
   </w:abstractNum>
-  <w:abstractNum w:abstractNumId="5" w15:restartNumberingAfterBreak="0">
+  <w:abstractNum w:abstractNumId="10" w15:restartNumberingAfterBreak="0">
     <w:nsid w:val="7D1B3D0C"/>
     <w:multiLevelType w:val="multilevel"/>
     <w:tmpl w:val="5CD60646"/>
@@ -17512,7 +20736,7 @@
       </w:rPr>
     </w:lvl>
   </w:abstractNum>
-  <w:abstractNum w:abstractNumId="6" w15:restartNumberingAfterBreak="0">
+  <w:abstractNum w:abstractNumId="11" w15:restartNumberingAfterBreak="0">
     <w:nsid w:val="7D7D7FE4"/>
     <w:multiLevelType w:val="hybridMultilevel"/>
     <w:tmpl w:val="6126809C"/>
@@ -17626,25 +20850,40 @@
     </w:lvl>
   </w:abstractNum>
   <w:num w:numId="1" w16cid:durableId="1328820740">
-    <w:abstractNumId w:val="6"/>
+    <w:abstractNumId w:val="11"/>
   </w:num>
   <w:num w:numId="2" w16cid:durableId="511535952">
-    <w:abstractNumId w:val="1"/>
+    <w:abstractNumId w:val="2"/>
   </w:num>
   <w:num w:numId="3" w16cid:durableId="245306335">
     <w:abstractNumId w:val="0"/>
   </w:num>
   <w:num w:numId="4" w16cid:durableId="471180">
+    <w:abstractNumId w:val="9"/>
+  </w:num>
+  <w:num w:numId="5" w16cid:durableId="1252275187">
+    <w:abstractNumId w:val="6"/>
+  </w:num>
+  <w:num w:numId="6" w16cid:durableId="170796616">
+    <w:abstractNumId w:val="10"/>
+  </w:num>
+  <w:num w:numId="7" w16cid:durableId="1423187062">
+    <w:abstractNumId w:val="3"/>
+  </w:num>
+  <w:num w:numId="8" w16cid:durableId="1513841604">
     <w:abstractNumId w:val="4"/>
   </w:num>
-  <w:num w:numId="5" w16cid:durableId="1252275187">
-    <w:abstractNumId w:val="3"/>
+  <w:num w:numId="9" w16cid:durableId="696661223">
+    <w:abstractNumId w:val="1"/>
   </w:num>
-  <w:num w:numId="6" w16cid:durableId="170796616">
+  <w:num w:numId="10" w16cid:durableId="1558543336">
     <w:abstractNumId w:val="5"/>
   </w:num>
-  <w:num w:numId="7" w16cid:durableId="1423187062">
-    <w:abstractNumId w:val="2"/>
+  <w:num w:numId="11" w16cid:durableId="1372877169">
+    <w:abstractNumId w:val="8"/>
+  </w:num>
+  <w:num w:numId="12" w16cid:durableId="1886016583">
+    <w:abstractNumId w:val="7"/>
   </w:num>
 </w:numbering>
 </file>
@@ -18045,15 +21284,15 @@
     <w:lsdException w:name="Unresolved Mention" w:semiHidden="1" w:unhideWhenUsed="1"/>
     <w:lsdException w:name="Smart Link" w:semiHidden="1" w:unhideWhenUsed="1"/>
   </w:latentStyles>
-  <w:style w:type="paragraph" w:default="1" w:styleId="Normal">
+  <w:style w:type="paragraph" w:default="1" w:styleId="Normalny">
     <w:name w:val="Normal"/>
     <w:qFormat/>
   </w:style>
-  <w:style w:type="paragraph" w:styleId="Heading1">
+  <w:style w:type="paragraph" w:styleId="Nagwek1">
     <w:name w:val="heading 1"/>
-    <w:basedOn w:val="Normal"/>
-    <w:next w:val="Normal"/>
-    <w:link w:val="Heading1Char"/>
+    <w:basedOn w:val="Normalny"/>
+    <w:next w:val="Normalny"/>
+    <w:link w:val="Nagwek1Znak"/>
     <w:uiPriority w:val="9"/>
     <w:qFormat/>
     <w:rsid w:val="007B07D8"/>
@@ -18070,11 +21309,11 @@
       <w:szCs w:val="40"/>
     </w:rPr>
   </w:style>
-  <w:style w:type="paragraph" w:styleId="Heading2">
+  <w:style w:type="paragraph" w:styleId="Nagwek2">
     <w:name w:val="heading 2"/>
-    <w:basedOn w:val="Normal"/>
-    <w:next w:val="Normal"/>
-    <w:link w:val="Heading2Char"/>
+    <w:basedOn w:val="Normalny"/>
+    <w:next w:val="Normalny"/>
+    <w:link w:val="Nagwek2Znak"/>
     <w:uiPriority w:val="9"/>
     <w:unhideWhenUsed/>
     <w:qFormat/>
@@ -18092,13 +21331,12 @@
       <w:szCs w:val="32"/>
     </w:rPr>
   </w:style>
-  <w:style w:type="paragraph" w:styleId="Heading3">
+  <w:style w:type="paragraph" w:styleId="Nagwek3">
     <w:name w:val="heading 3"/>
-    <w:basedOn w:val="Normal"/>
-    <w:next w:val="Normal"/>
-    <w:link w:val="Heading3Char"/>
+    <w:basedOn w:val="Normalny"/>
+    <w:next w:val="Normalny"/>
+    <w:link w:val="Nagwek3Znak"/>
     <w:uiPriority w:val="9"/>
-    <w:semiHidden/>
     <w:unhideWhenUsed/>
     <w:qFormat/>
     <w:rsid w:val="007B07D8"/>
@@ -18115,11 +21353,11 @@
       <w:szCs w:val="28"/>
     </w:rPr>
   </w:style>
-  <w:style w:type="paragraph" w:styleId="Heading4">
+  <w:style w:type="paragraph" w:styleId="Nagwek4">
     <w:name w:val="heading 4"/>
-    <w:basedOn w:val="Normal"/>
-    <w:next w:val="Normal"/>
-    <w:link w:val="Heading4Char"/>
+    <w:basedOn w:val="Normalny"/>
+    <w:next w:val="Normalny"/>
+    <w:link w:val="Nagwek4Znak"/>
     <w:uiPriority w:val="9"/>
     <w:semiHidden/>
     <w:unhideWhenUsed/>
@@ -18138,11 +21376,11 @@
       <w:color w:val="0F4761" w:themeColor="accent1" w:themeShade="BF"/>
     </w:rPr>
   </w:style>
-  <w:style w:type="paragraph" w:styleId="Heading5">
+  <w:style w:type="paragraph" w:styleId="Nagwek5">
     <w:name w:val="heading 5"/>
-    <w:basedOn w:val="Normal"/>
-    <w:next w:val="Normal"/>
-    <w:link w:val="Heading5Char"/>
+    <w:basedOn w:val="Normalny"/>
+    <w:next w:val="Normalny"/>
+    <w:link w:val="Nagwek5Znak"/>
     <w:uiPriority w:val="9"/>
     <w:semiHidden/>
     <w:unhideWhenUsed/>
@@ -18159,11 +21397,11 @@
       <w:color w:val="0F4761" w:themeColor="accent1" w:themeShade="BF"/>
     </w:rPr>
   </w:style>
-  <w:style w:type="paragraph" w:styleId="Heading6">
+  <w:style w:type="paragraph" w:styleId="Nagwek6">
     <w:name w:val="heading 6"/>
-    <w:basedOn w:val="Normal"/>
-    <w:next w:val="Normal"/>
-    <w:link w:val="Heading6Char"/>
+    <w:basedOn w:val="Normalny"/>
+    <w:next w:val="Normalny"/>
+    <w:link w:val="Nagwek6Znak"/>
     <w:uiPriority w:val="9"/>
     <w:semiHidden/>
     <w:unhideWhenUsed/>
@@ -18182,11 +21420,11 @@
       <w:color w:val="595959" w:themeColor="text1" w:themeTint="A6"/>
     </w:rPr>
   </w:style>
-  <w:style w:type="paragraph" w:styleId="Heading7">
+  <w:style w:type="paragraph" w:styleId="Nagwek7">
     <w:name w:val="heading 7"/>
-    <w:basedOn w:val="Normal"/>
-    <w:next w:val="Normal"/>
-    <w:link w:val="Heading7Char"/>
+    <w:basedOn w:val="Normalny"/>
+    <w:next w:val="Normalny"/>
+    <w:link w:val="Nagwek7Znak"/>
     <w:uiPriority w:val="9"/>
     <w:semiHidden/>
     <w:unhideWhenUsed/>
@@ -18203,11 +21441,11 @@
       <w:color w:val="595959" w:themeColor="text1" w:themeTint="A6"/>
     </w:rPr>
   </w:style>
-  <w:style w:type="paragraph" w:styleId="Heading8">
+  <w:style w:type="paragraph" w:styleId="Nagwek8">
     <w:name w:val="heading 8"/>
-    <w:basedOn w:val="Normal"/>
-    <w:next w:val="Normal"/>
-    <w:link w:val="Heading8Char"/>
+    <w:basedOn w:val="Normalny"/>
+    <w:next w:val="Normalny"/>
+    <w:link w:val="Nagwek8Znak"/>
     <w:uiPriority w:val="9"/>
     <w:semiHidden/>
     <w:unhideWhenUsed/>
@@ -18226,11 +21464,11 @@
       <w:color w:val="272727" w:themeColor="text1" w:themeTint="D8"/>
     </w:rPr>
   </w:style>
-  <w:style w:type="paragraph" w:styleId="Heading9">
+  <w:style w:type="paragraph" w:styleId="Nagwek9">
     <w:name w:val="heading 9"/>
-    <w:basedOn w:val="Normal"/>
-    <w:next w:val="Normal"/>
-    <w:link w:val="Heading9Char"/>
+    <w:basedOn w:val="Normalny"/>
+    <w:next w:val="Normalny"/>
+    <w:link w:val="Nagwek9Znak"/>
     <w:uiPriority w:val="9"/>
     <w:semiHidden/>
     <w:unhideWhenUsed/>
@@ -18247,13 +21485,12 @@
       <w:color w:val="272727" w:themeColor="text1" w:themeTint="D8"/>
     </w:rPr>
   </w:style>
-  <w:style w:type="character" w:default="1" w:styleId="DefaultParagraphFont">
+  <w:style w:type="character" w:default="1" w:styleId="Domylnaczcionkaakapitu">
     <w:name w:val="Default Paragraph Font"/>
     <w:uiPriority w:val="1"/>
-    <w:semiHidden/>
     <w:unhideWhenUsed/>
   </w:style>
-  <w:style w:type="table" w:default="1" w:styleId="TableNormal">
+  <w:style w:type="table" w:default="1" w:styleId="Standardowy">
     <w:name w:val="Normal Table"/>
     <w:uiPriority w:val="99"/>
     <w:semiHidden/>
@@ -18268,16 +21505,16 @@
       </w:tblCellMar>
     </w:tblPr>
   </w:style>
-  <w:style w:type="numbering" w:default="1" w:styleId="NoList">
+  <w:style w:type="numbering" w:default="1" w:styleId="Bezlisty">
     <w:name w:val="No List"/>
     <w:uiPriority w:val="99"/>
     <w:semiHidden/>
     <w:unhideWhenUsed/>
   </w:style>
-  <w:style w:type="character" w:customStyle="1" w:styleId="Heading1Char">
-    <w:name w:val="Heading 1 Char"/>
-    <w:basedOn w:val="DefaultParagraphFont"/>
-    <w:link w:val="Heading1"/>
+  <w:style w:type="character" w:customStyle="1" w:styleId="Nagwek1Znak">
+    <w:name w:val="Nagłówek 1 Znak"/>
+    <w:basedOn w:val="Domylnaczcionkaakapitu"/>
+    <w:link w:val="Nagwek1"/>
     <w:uiPriority w:val="9"/>
     <w:rsid w:val="007B07D8"/>
     <w:rPr>
@@ -18287,10 +21524,10 @@
       <w:szCs w:val="40"/>
     </w:rPr>
   </w:style>
-  <w:style w:type="character" w:customStyle="1" w:styleId="Heading2Char">
-    <w:name w:val="Heading 2 Char"/>
-    <w:basedOn w:val="DefaultParagraphFont"/>
-    <w:link w:val="Heading2"/>
+  <w:style w:type="character" w:customStyle="1" w:styleId="Nagwek2Znak">
+    <w:name w:val="Nagłówek 2 Znak"/>
+    <w:basedOn w:val="Domylnaczcionkaakapitu"/>
+    <w:link w:val="Nagwek2"/>
     <w:uiPriority w:val="9"/>
     <w:rsid w:val="007B07D8"/>
     <w:rPr>
@@ -18300,12 +21537,11 @@
       <w:szCs w:val="32"/>
     </w:rPr>
   </w:style>
-  <w:style w:type="character" w:customStyle="1" w:styleId="Heading3Char">
-    <w:name w:val="Heading 3 Char"/>
-    <w:basedOn w:val="DefaultParagraphFont"/>
-    <w:link w:val="Heading3"/>
+  <w:style w:type="character" w:customStyle="1" w:styleId="Nagwek3Znak">
+    <w:name w:val="Nagłówek 3 Znak"/>
+    <w:basedOn w:val="Domylnaczcionkaakapitu"/>
+    <w:link w:val="Nagwek3"/>
     <w:uiPriority w:val="9"/>
-    <w:semiHidden/>
     <w:rsid w:val="007B07D8"/>
     <w:rPr>
       <w:rFonts w:eastAsiaTheme="majorEastAsia" w:cstheme="majorBidi"/>
@@ -18314,10 +21550,10 @@
       <w:szCs w:val="28"/>
     </w:rPr>
   </w:style>
-  <w:style w:type="character" w:customStyle="1" w:styleId="Heading4Char">
-    <w:name w:val="Heading 4 Char"/>
-    <w:basedOn w:val="DefaultParagraphFont"/>
-    <w:link w:val="Heading4"/>
+  <w:style w:type="character" w:customStyle="1" w:styleId="Nagwek4Znak">
+    <w:name w:val="Nagłówek 4 Znak"/>
+    <w:basedOn w:val="Domylnaczcionkaakapitu"/>
+    <w:link w:val="Nagwek4"/>
     <w:uiPriority w:val="9"/>
     <w:semiHidden/>
     <w:rsid w:val="007B07D8"/>
@@ -18328,10 +21564,10 @@
       <w:color w:val="0F4761" w:themeColor="accent1" w:themeShade="BF"/>
     </w:rPr>
   </w:style>
-  <w:style w:type="character" w:customStyle="1" w:styleId="Heading5Char">
-    <w:name w:val="Heading 5 Char"/>
-    <w:basedOn w:val="DefaultParagraphFont"/>
-    <w:link w:val="Heading5"/>
+  <w:style w:type="character" w:customStyle="1" w:styleId="Nagwek5Znak">
+    <w:name w:val="Nagłówek 5 Znak"/>
+    <w:basedOn w:val="Domylnaczcionkaakapitu"/>
+    <w:link w:val="Nagwek5"/>
     <w:uiPriority w:val="9"/>
     <w:semiHidden/>
     <w:rsid w:val="007B07D8"/>
@@ -18340,10 +21576,10 @@
       <w:color w:val="0F4761" w:themeColor="accent1" w:themeShade="BF"/>
     </w:rPr>
   </w:style>
-  <w:style w:type="character" w:customStyle="1" w:styleId="Heading6Char">
-    <w:name w:val="Heading 6 Char"/>
-    <w:basedOn w:val="DefaultParagraphFont"/>
-    <w:link w:val="Heading6"/>
+  <w:style w:type="character" w:customStyle="1" w:styleId="Nagwek6Znak">
+    <w:name w:val="Nagłówek 6 Znak"/>
+    <w:basedOn w:val="Domylnaczcionkaakapitu"/>
+    <w:link w:val="Nagwek6"/>
     <w:uiPriority w:val="9"/>
     <w:semiHidden/>
     <w:rsid w:val="007B07D8"/>
@@ -18354,10 +21590,10 @@
       <w:color w:val="595959" w:themeColor="text1" w:themeTint="A6"/>
     </w:rPr>
   </w:style>
-  <w:style w:type="character" w:customStyle="1" w:styleId="Heading7Char">
-    <w:name w:val="Heading 7 Char"/>
-    <w:basedOn w:val="DefaultParagraphFont"/>
-    <w:link w:val="Heading7"/>
+  <w:style w:type="character" w:customStyle="1" w:styleId="Nagwek7Znak">
+    <w:name w:val="Nagłówek 7 Znak"/>
+    <w:basedOn w:val="Domylnaczcionkaakapitu"/>
+    <w:link w:val="Nagwek7"/>
     <w:uiPriority w:val="9"/>
     <w:semiHidden/>
     <w:rsid w:val="007B07D8"/>
@@ -18366,10 +21602,10 @@
       <w:color w:val="595959" w:themeColor="text1" w:themeTint="A6"/>
     </w:rPr>
   </w:style>
-  <w:style w:type="character" w:customStyle="1" w:styleId="Heading8Char">
-    <w:name w:val="Heading 8 Char"/>
-    <w:basedOn w:val="DefaultParagraphFont"/>
-    <w:link w:val="Heading8"/>
+  <w:style w:type="character" w:customStyle="1" w:styleId="Nagwek8Znak">
+    <w:name w:val="Nagłówek 8 Znak"/>
+    <w:basedOn w:val="Domylnaczcionkaakapitu"/>
+    <w:link w:val="Nagwek8"/>
     <w:uiPriority w:val="9"/>
     <w:semiHidden/>
     <w:rsid w:val="007B07D8"/>
@@ -18380,10 +21616,10 @@
       <w:color w:val="272727" w:themeColor="text1" w:themeTint="D8"/>
     </w:rPr>
   </w:style>
-  <w:style w:type="character" w:customStyle="1" w:styleId="Heading9Char">
-    <w:name w:val="Heading 9 Char"/>
-    <w:basedOn w:val="DefaultParagraphFont"/>
-    <w:link w:val="Heading9"/>
+  <w:style w:type="character" w:customStyle="1" w:styleId="Nagwek9Znak">
+    <w:name w:val="Nagłówek 9 Znak"/>
+    <w:basedOn w:val="Domylnaczcionkaakapitu"/>
+    <w:link w:val="Nagwek9"/>
     <w:uiPriority w:val="9"/>
     <w:semiHidden/>
     <w:rsid w:val="007B07D8"/>
@@ -18392,11 +21628,11 @@
       <w:color w:val="272727" w:themeColor="text1" w:themeTint="D8"/>
     </w:rPr>
   </w:style>
-  <w:style w:type="paragraph" w:styleId="Title">
+  <w:style w:type="paragraph" w:styleId="Tytu">
     <w:name w:val="Title"/>
-    <w:basedOn w:val="Normal"/>
-    <w:next w:val="Normal"/>
-    <w:link w:val="TitleChar"/>
+    <w:basedOn w:val="Normalny"/>
+    <w:next w:val="Normalny"/>
+    <w:link w:val="TytuZnak"/>
     <w:uiPriority w:val="10"/>
     <w:qFormat/>
     <w:rsid w:val="007B07D8"/>
@@ -18412,10 +21648,10 @@
       <w:szCs w:val="56"/>
     </w:rPr>
   </w:style>
-  <w:style w:type="character" w:customStyle="1" w:styleId="TitleChar">
-    <w:name w:val="Title Char"/>
-    <w:basedOn w:val="DefaultParagraphFont"/>
-    <w:link w:val="Title"/>
+  <w:style w:type="character" w:customStyle="1" w:styleId="TytuZnak">
+    <w:name w:val="Tytuł Znak"/>
+    <w:basedOn w:val="Domylnaczcionkaakapitu"/>
+    <w:link w:val="Tytu"/>
     <w:uiPriority w:val="10"/>
     <w:rsid w:val="007B07D8"/>
     <w:rPr>
@@ -18426,11 +21662,11 @@
       <w:szCs w:val="56"/>
     </w:rPr>
   </w:style>
-  <w:style w:type="paragraph" w:styleId="Subtitle">
+  <w:style w:type="paragraph" w:styleId="Podtytu">
     <w:name w:val="Subtitle"/>
-    <w:basedOn w:val="Normal"/>
-    <w:next w:val="Normal"/>
-    <w:link w:val="SubtitleChar"/>
+    <w:basedOn w:val="Normalny"/>
+    <w:next w:val="Normalny"/>
+    <w:link w:val="PodtytuZnak"/>
     <w:uiPriority w:val="11"/>
     <w:qFormat/>
     <w:rsid w:val="007B07D8"/>
@@ -18447,10 +21683,10 @@
       <w:szCs w:val="28"/>
     </w:rPr>
   </w:style>
-  <w:style w:type="character" w:customStyle="1" w:styleId="SubtitleChar">
-    <w:name w:val="Subtitle Char"/>
-    <w:basedOn w:val="DefaultParagraphFont"/>
-    <w:link w:val="Subtitle"/>
+  <w:style w:type="character" w:customStyle="1" w:styleId="PodtytuZnak">
+    <w:name w:val="Podtytuł Znak"/>
+    <w:basedOn w:val="Domylnaczcionkaakapitu"/>
+    <w:link w:val="Podtytu"/>
     <w:uiPriority w:val="11"/>
     <w:rsid w:val="007B07D8"/>
     <w:rPr>
@@ -18461,11 +21697,11 @@
       <w:szCs w:val="28"/>
     </w:rPr>
   </w:style>
-  <w:style w:type="paragraph" w:styleId="Quote">
+  <w:style w:type="paragraph" w:styleId="Cytat">
     <w:name w:val="Quote"/>
-    <w:basedOn w:val="Normal"/>
-    <w:next w:val="Normal"/>
-    <w:link w:val="QuoteChar"/>
+    <w:basedOn w:val="Normalny"/>
+    <w:next w:val="Normalny"/>
+    <w:link w:val="CytatZnak"/>
     <w:uiPriority w:val="29"/>
     <w:qFormat/>
     <w:rsid w:val="007B07D8"/>
@@ -18479,10 +21715,10 @@
       <w:color w:val="404040" w:themeColor="text1" w:themeTint="BF"/>
     </w:rPr>
   </w:style>
-  <w:style w:type="character" w:customStyle="1" w:styleId="QuoteChar">
-    <w:name w:val="Quote Char"/>
-    <w:basedOn w:val="DefaultParagraphFont"/>
-    <w:link w:val="Quote"/>
+  <w:style w:type="character" w:customStyle="1" w:styleId="CytatZnak">
+    <w:name w:val="Cytat Znak"/>
+    <w:basedOn w:val="Domylnaczcionkaakapitu"/>
+    <w:link w:val="Cytat"/>
     <w:uiPriority w:val="29"/>
     <w:rsid w:val="007B07D8"/>
     <w:rPr>
@@ -18491,9 +21727,9 @@
       <w:color w:val="404040" w:themeColor="text1" w:themeTint="BF"/>
     </w:rPr>
   </w:style>
-  <w:style w:type="paragraph" w:styleId="ListParagraph">
+  <w:style w:type="paragraph" w:styleId="Akapitzlist">
     <w:name w:val="List Paragraph"/>
-    <w:basedOn w:val="Normal"/>
+    <w:basedOn w:val="Normalny"/>
     <w:uiPriority w:val="34"/>
     <w:qFormat/>
     <w:rsid w:val="007B07D8"/>
@@ -18502,9 +21738,9 @@
       <w:contextualSpacing/>
     </w:pPr>
   </w:style>
-  <w:style w:type="character" w:styleId="IntenseEmphasis">
+  <w:style w:type="character" w:styleId="Wyrnienieintensywne">
     <w:name w:val="Intense Emphasis"/>
-    <w:basedOn w:val="DefaultParagraphFont"/>
+    <w:basedOn w:val="Domylnaczcionkaakapitu"/>
     <w:uiPriority w:val="21"/>
     <w:qFormat/>
     <w:rsid w:val="007B07D8"/>
@@ -18514,11 +21750,11 @@
       <w:color w:val="0F4761" w:themeColor="accent1" w:themeShade="BF"/>
     </w:rPr>
   </w:style>
-  <w:style w:type="paragraph" w:styleId="IntenseQuote">
+  <w:style w:type="paragraph" w:styleId="Cytatintensywny">
     <w:name w:val="Intense Quote"/>
-    <w:basedOn w:val="Normal"/>
-    <w:next w:val="Normal"/>
-    <w:link w:val="IntenseQuoteChar"/>
+    <w:basedOn w:val="Normalny"/>
+    <w:next w:val="Normalny"/>
+    <w:link w:val="CytatintensywnyZnak"/>
     <w:uiPriority w:val="30"/>
     <w:qFormat/>
     <w:rsid w:val="007B07D8"/>
@@ -18537,10 +21773,10 @@
       <w:color w:val="0F4761" w:themeColor="accent1" w:themeShade="BF"/>
     </w:rPr>
   </w:style>
-  <w:style w:type="character" w:customStyle="1" w:styleId="IntenseQuoteChar">
-    <w:name w:val="Intense Quote Char"/>
-    <w:basedOn w:val="DefaultParagraphFont"/>
-    <w:link w:val="IntenseQuote"/>
+  <w:style w:type="character" w:customStyle="1" w:styleId="CytatintensywnyZnak">
+    <w:name w:val="Cytat intensywny Znak"/>
+    <w:basedOn w:val="Domylnaczcionkaakapitu"/>
+    <w:link w:val="Cytatintensywny"/>
     <w:uiPriority w:val="30"/>
     <w:rsid w:val="007B07D8"/>
     <w:rPr>
@@ -18549,9 +21785,9 @@
       <w:color w:val="0F4761" w:themeColor="accent1" w:themeShade="BF"/>
     </w:rPr>
   </w:style>
-  <w:style w:type="character" w:styleId="IntenseReference">
+  <w:style w:type="character" w:styleId="Odwoanieintensywne">
     <w:name w:val="Intense Reference"/>
-    <w:basedOn w:val="DefaultParagraphFont"/>
+    <w:basedOn w:val="Domylnaczcionkaakapitu"/>
     <w:uiPriority w:val="32"/>
     <w:qFormat/>
     <w:rsid w:val="007B07D8"/>
@@ -18563,9 +21799,9 @@
       <w:spacing w:val="5"/>
     </w:rPr>
   </w:style>
-  <w:style w:type="paragraph" w:styleId="NormalWeb">
+  <w:style w:type="paragraph" w:styleId="NormalnyWeb">
     <w:name w:val="Normal (Web)"/>
-    <w:basedOn w:val="Normal"/>
+    <w:basedOn w:val="Normalny"/>
     <w:uiPriority w:val="99"/>
     <w:semiHidden/>
     <w:unhideWhenUsed/>
@@ -18579,6 +21815,99 @@
       <w:szCs w:val="24"/>
       <w:lang w:eastAsia="pl-PL"/>
       <w14:ligatures w14:val="none"/>
+    </w:rPr>
+  </w:style>
+  <w:style w:type="character" w:styleId="Hipercze">
+    <w:name w:val="Hyperlink"/>
+    <w:basedOn w:val="Domylnaczcionkaakapitu"/>
+    <w:uiPriority w:val="99"/>
+    <w:unhideWhenUsed/>
+    <w:rsid w:val="00E7764E"/>
+    <w:rPr>
+      <w:color w:val="467886" w:themeColor="hyperlink"/>
+      <w:u w:val="single"/>
+    </w:rPr>
+  </w:style>
+  <w:style w:type="character" w:styleId="Nierozpoznanawzmianka">
+    <w:name w:val="Unresolved Mention"/>
+    <w:basedOn w:val="Domylnaczcionkaakapitu"/>
+    <w:uiPriority w:val="99"/>
+    <w:semiHidden/>
+    <w:unhideWhenUsed/>
+    <w:rsid w:val="00E7764E"/>
+    <w:rPr>
+      <w:color w:val="605E5C"/>
+      <w:shd w:val="clear" w:color="auto" w:fill="E1DFDD"/>
+    </w:rPr>
+  </w:style>
+  <w:style w:type="character" w:styleId="UyteHipercze">
+    <w:name w:val="FollowedHyperlink"/>
+    <w:basedOn w:val="Domylnaczcionkaakapitu"/>
+    <w:uiPriority w:val="99"/>
+    <w:semiHidden/>
+    <w:unhideWhenUsed/>
+    <w:rsid w:val="00E7764E"/>
+    <w:rPr>
+      <w:color w:val="96607D" w:themeColor="followedHyperlink"/>
+      <w:u w:val="single"/>
+    </w:rPr>
+  </w:style>
+  <w:style w:type="table" w:styleId="Tabela-Siatka">
+    <w:name w:val="Table Grid"/>
+    <w:basedOn w:val="Standardowy"/>
+    <w:uiPriority w:val="39"/>
+    <w:rsid w:val="00743362"/>
+    <w:pPr>
+      <w:spacing w:after="0" w:line="240" w:lineRule="auto"/>
+    </w:pPr>
+    <w:tblPr>
+      <w:tblBorders>
+        <w:top w:val="single" w:sz="4" w:space="0" w:color="auto"/>
+        <w:left w:val="single" w:sz="4" w:space="0" w:color="auto"/>
+        <w:bottom w:val="single" w:sz="4" w:space="0" w:color="auto"/>
+        <w:right w:val="single" w:sz="4" w:space="0" w:color="auto"/>
+        <w:insideH w:val="single" w:sz="4" w:space="0" w:color="auto"/>
+        <w:insideV w:val="single" w:sz="4" w:space="0" w:color="auto"/>
+      </w:tblBorders>
+    </w:tblPr>
+  </w:style>
+  <w:style w:type="paragraph" w:styleId="Tekstprzypisukocowego">
+    <w:name w:val="endnote text"/>
+    <w:basedOn w:val="Normalny"/>
+    <w:link w:val="TekstprzypisukocowegoZnak"/>
+    <w:uiPriority w:val="99"/>
+    <w:semiHidden/>
+    <w:unhideWhenUsed/>
+    <w:rsid w:val="00F17653"/>
+    <w:pPr>
+      <w:spacing w:after="0" w:line="240" w:lineRule="auto"/>
+    </w:pPr>
+    <w:rPr>
+      <w:sz w:val="20"/>
+      <w:szCs w:val="20"/>
+    </w:rPr>
+  </w:style>
+  <w:style w:type="character" w:customStyle="1" w:styleId="TekstprzypisukocowegoZnak">
+    <w:name w:val="Tekst przypisu końcowego Znak"/>
+    <w:basedOn w:val="Domylnaczcionkaakapitu"/>
+    <w:link w:val="Tekstprzypisukocowego"/>
+    <w:uiPriority w:val="99"/>
+    <w:semiHidden/>
+    <w:rsid w:val="00F17653"/>
+    <w:rPr>
+      <w:sz w:val="20"/>
+      <w:szCs w:val="20"/>
+    </w:rPr>
+  </w:style>
+  <w:style w:type="character" w:styleId="Odwoanieprzypisukocowego">
+    <w:name w:val="endnote reference"/>
+    <w:basedOn w:val="Domylnaczcionkaakapitu"/>
+    <w:uiPriority w:val="99"/>
+    <w:semiHidden/>
+    <w:unhideWhenUsed/>
+    <w:rsid w:val="00F17653"/>
+    <w:rPr>
+      <w:vertAlign w:val="superscript"/>
     </w:rPr>
   </w:style>
 </w:styles>

</xml_diff>

<commit_message>
poprawki sprawozdanie poprawki funkcje aktywacji
</commit_message>
<xml_diff>
--- a/ESI - sprawozdanie.docx
+++ b/ESI - sprawozdanie.docx
@@ -4,7 +4,7 @@
   <w:body>
     <w:p>
       <w:pPr>
-        <w:pStyle w:val="Tytu"/>
+        <w:pStyle w:val="Title"/>
         <w:jc w:val="both"/>
         <w:rPr>
           <w:b/>
@@ -21,7 +21,7 @@
     </w:p>
     <w:p>
       <w:pPr>
-        <w:pStyle w:val="Nagwek1"/>
+        <w:pStyle w:val="Heading1"/>
         <w:jc w:val="both"/>
         <w:rPr>
           <w:b/>
@@ -356,7 +356,7 @@
     </w:p>
     <w:p>
       <w:pPr>
-        <w:pStyle w:val="Nagwek1"/>
+        <w:pStyle w:val="Heading1"/>
         <w:jc w:val="both"/>
         <w:rPr>
           <w:b/>
@@ -380,7 +380,7 @@
     </w:p>
     <w:p>
       <w:pPr>
-        <w:pStyle w:val="NormalnyWeb"/>
+        <w:pStyle w:val="NormalWeb"/>
         <w:rPr>
           <w:rFonts w:asciiTheme="minorHAnsi" w:hAnsiTheme="minorHAnsi"/>
           <w:sz w:val="22"/>
@@ -398,7 +398,7 @@
     </w:p>
     <w:p>
       <w:pPr>
-        <w:pStyle w:val="NormalnyWeb"/>
+        <w:pStyle w:val="NormalWeb"/>
         <w:rPr>
           <w:rFonts w:asciiTheme="minorHAnsi" w:hAnsiTheme="minorHAnsi"/>
           <w:sz w:val="22"/>
@@ -411,25 +411,7 @@
           <w:sz w:val="22"/>
           <w:szCs w:val="22"/>
         </w:rPr>
-        <w:t xml:space="preserve">We wszystkich eksperymentach parametr </w:t>
-      </w:r>
-      <w:proofErr w:type="spellStart"/>
-      <w:r>
-        <w:rPr>
-          <w:rFonts w:asciiTheme="minorHAnsi" w:hAnsiTheme="minorHAnsi"/>
-          <w:sz w:val="22"/>
-          <w:szCs w:val="22"/>
-        </w:rPr>
-        <w:t>random_state</w:t>
-      </w:r>
-      <w:proofErr w:type="spellEnd"/>
-      <w:r>
-        <w:rPr>
-          <w:rFonts w:asciiTheme="minorHAnsi" w:hAnsiTheme="minorHAnsi"/>
-          <w:sz w:val="22"/>
-          <w:szCs w:val="22"/>
-        </w:rPr>
-        <w:t xml:space="preserve"> ustawiono na wartość 42, aby zapewnić powtarzalność wyników. Dzięki temu proces losowania danych</w:t>
+        <w:t>We wszystkich eksperymentach parametr random_state ustawiono na wartość 42, aby zapewnić powtarzalność wyników. Dzięki temu proces losowania danych</w:t>
       </w:r>
       <w:r>
         <w:rPr>
@@ -450,7 +432,7 @@
     </w:p>
     <w:p>
       <w:pPr>
-        <w:pStyle w:val="NormalnyWeb"/>
+        <w:pStyle w:val="NormalWeb"/>
         <w:rPr>
           <w:rFonts w:asciiTheme="majorHAnsi" w:hAnsiTheme="majorHAnsi"/>
           <w:b/>
@@ -472,7 +454,7 @@
     </w:p>
     <w:p>
       <w:pPr>
-        <w:pStyle w:val="NormalnyWeb"/>
+        <w:pStyle w:val="NormalWeb"/>
         <w:rPr>
           <w:rFonts w:asciiTheme="minorHAnsi" w:hAnsiTheme="minorHAnsi"/>
           <w:sz w:val="22"/>
@@ -493,25 +475,7 @@
           <w:sz w:val="22"/>
           <w:szCs w:val="22"/>
         </w:rPr>
-        <w:t xml:space="preserve">e strony </w:t>
-      </w:r>
-      <w:proofErr w:type="spellStart"/>
-      <w:r>
-        <w:rPr>
-          <w:rFonts w:asciiTheme="minorHAnsi" w:hAnsiTheme="minorHAnsi"/>
-          <w:sz w:val="22"/>
-          <w:szCs w:val="22"/>
-        </w:rPr>
-        <w:t>Kaggle</w:t>
-      </w:r>
-      <w:proofErr w:type="spellEnd"/>
-      <w:r>
-        <w:rPr>
-          <w:rFonts w:asciiTheme="minorHAnsi" w:hAnsiTheme="minorHAnsi"/>
-          <w:sz w:val="22"/>
-          <w:szCs w:val="22"/>
-        </w:rPr>
-        <w:t xml:space="preserve"> i opisuje zadowolenie</w:t>
+        <w:t>e strony Kaggle i opisuje zadowolenie</w:t>
       </w:r>
       <w:r>
         <w:rPr>
@@ -535,102 +499,12 @@
           <w:sz w:val="22"/>
           <w:szCs w:val="22"/>
         </w:rPr>
-        <w:t xml:space="preserve">awiera 103 904 obserwacji w zbiorze treningowym oraz odpowiadający mu zbiór testowy. Każda obserwacja opisuje jednego pasażera za pomocą 22 zmiennych objaśniających, obejmujących cechy demograficzne (płeć, wiek), informacje o podróży (typ klienta, cel podróży, klasa, dystans lotu) oraz oceny 14 aspektów usługi lotniczej w skali 0–5 (m.in. Wi-Fi na pokładzie, komfort siedzeń, obsługa, czystość, catering). Uzupełnieniem są opóźnienia przy odlocie i przylocie wyrażone w minutach. Zmienna objaśniana </w:t>
-      </w:r>
-      <w:proofErr w:type="spellStart"/>
-      <w:r>
-        <w:rPr>
-          <w:rFonts w:asciiTheme="minorHAnsi" w:hAnsiTheme="minorHAnsi"/>
-          <w:sz w:val="22"/>
-          <w:szCs w:val="22"/>
-        </w:rPr>
-        <w:t>satisfaction</w:t>
-      </w:r>
-      <w:proofErr w:type="spellEnd"/>
-      <w:r>
-        <w:rPr>
-          <w:rFonts w:asciiTheme="minorHAnsi" w:hAnsiTheme="minorHAnsi"/>
-          <w:sz w:val="22"/>
-          <w:szCs w:val="22"/>
-        </w:rPr>
-        <w:t xml:space="preserve"> jest binarna — przyjmuje wartość </w:t>
-      </w:r>
-      <w:proofErr w:type="spellStart"/>
-      <w:r>
-        <w:rPr>
-          <w:rFonts w:asciiTheme="minorHAnsi" w:hAnsiTheme="minorHAnsi"/>
-          <w:sz w:val="22"/>
-          <w:szCs w:val="22"/>
-        </w:rPr>
-        <w:t>satisfied</w:t>
-      </w:r>
-      <w:proofErr w:type="spellEnd"/>
-      <w:r>
-        <w:rPr>
-          <w:rFonts w:asciiTheme="minorHAnsi" w:hAnsiTheme="minorHAnsi"/>
-          <w:sz w:val="22"/>
-          <w:szCs w:val="22"/>
-        </w:rPr>
-        <w:t xml:space="preserve"> lub </w:t>
-      </w:r>
-      <w:proofErr w:type="spellStart"/>
-      <w:r>
-        <w:rPr>
-          <w:rFonts w:asciiTheme="minorHAnsi" w:hAnsiTheme="minorHAnsi"/>
-          <w:sz w:val="22"/>
-          <w:szCs w:val="22"/>
-        </w:rPr>
-        <w:t>neutral</w:t>
-      </w:r>
-      <w:proofErr w:type="spellEnd"/>
-      <w:r>
-        <w:rPr>
-          <w:rFonts w:asciiTheme="minorHAnsi" w:hAnsiTheme="minorHAnsi"/>
-          <w:sz w:val="22"/>
-          <w:szCs w:val="22"/>
-        </w:rPr>
-        <w:t xml:space="preserve"> </w:t>
-      </w:r>
-      <w:proofErr w:type="spellStart"/>
-      <w:r>
-        <w:rPr>
-          <w:rFonts w:asciiTheme="minorHAnsi" w:hAnsiTheme="minorHAnsi"/>
-          <w:sz w:val="22"/>
-          <w:szCs w:val="22"/>
-        </w:rPr>
-        <w:t>or</w:t>
-      </w:r>
-      <w:proofErr w:type="spellEnd"/>
-      <w:r>
-        <w:rPr>
-          <w:rFonts w:asciiTheme="minorHAnsi" w:hAnsiTheme="minorHAnsi"/>
-          <w:sz w:val="22"/>
-          <w:szCs w:val="22"/>
-        </w:rPr>
-        <w:t xml:space="preserve"> </w:t>
-      </w:r>
-      <w:proofErr w:type="spellStart"/>
-      <w:r>
-        <w:rPr>
-          <w:rFonts w:asciiTheme="minorHAnsi" w:hAnsiTheme="minorHAnsi"/>
-          <w:sz w:val="22"/>
-          <w:szCs w:val="22"/>
-        </w:rPr>
-        <w:t>dissatisfied</w:t>
-      </w:r>
-      <w:proofErr w:type="spellEnd"/>
-      <w:r>
-        <w:rPr>
-          <w:rFonts w:asciiTheme="minorHAnsi" w:hAnsiTheme="minorHAnsi"/>
-          <w:sz w:val="22"/>
-          <w:szCs w:val="22"/>
-        </w:rPr>
-        <w:t>, zakodowaną na potrzeby modelowania jako 1 i 0. Dane były już wstępnie podzielone na zbiór treningowy i testowy.</w:t>
+        <w:t>awiera 103 904 obserwacji w zbiorze treningowym oraz odpowiadający mu zbiór testowy. Każda obserwacja opisuje jednego pasażera za pomocą 22 zmiennych objaśniających, obejmujących cechy demograficzne (płeć, wiek), informacje o podróży (typ klienta, cel podróży, klasa, dystans lotu) oraz oceny 14 aspektów usługi lotniczej w skali 0–5 (m.in. Wi-Fi na pokładzie, komfort siedzeń, obsługa, czystość, catering). Uzupełnieniem są opóźnienia przy odlocie i przylocie wyrażone w minutach. Zmienna objaśniana satisfaction jest binarna — przyjmuje wartość satisfied lub neutral or dissatisfied, zakodowaną na potrzeby modelowania jako 1 i 0. Dane były już wstępnie podzielone na zbiór treningowy i testowy.</w:t>
       </w:r>
     </w:p>
     <w:p>
       <w:pPr>
-        <w:pStyle w:val="NormalnyWeb"/>
+        <w:pStyle w:val="NormalWeb"/>
         <w:rPr>
           <w:rFonts w:asciiTheme="minorHAnsi" w:hAnsiTheme="minorHAnsi"/>
           <w:b/>
@@ -652,7 +526,7 @@
     </w:p>
     <w:p>
       <w:pPr>
-        <w:pStyle w:val="NormalnyWeb"/>
+        <w:pStyle w:val="NormalWeb"/>
         <w:rPr>
           <w:rFonts w:asciiTheme="minorHAnsi" w:hAnsiTheme="minorHAnsi"/>
           <w:sz w:val="22"/>
@@ -665,110 +539,12 @@
           <w:sz w:val="22"/>
           <w:szCs w:val="22"/>
         </w:rPr>
-        <w:t xml:space="preserve">Dane pobrane za pomocą biblioteki </w:t>
-      </w:r>
-      <w:proofErr w:type="spellStart"/>
-      <w:r>
-        <w:rPr>
-          <w:rFonts w:asciiTheme="minorHAnsi" w:hAnsiTheme="minorHAnsi"/>
-          <w:sz w:val="22"/>
-          <w:szCs w:val="22"/>
-        </w:rPr>
-        <w:t>yfinance</w:t>
-      </w:r>
-      <w:proofErr w:type="spellEnd"/>
-      <w:r>
-        <w:rPr>
-          <w:rFonts w:asciiTheme="minorHAnsi" w:hAnsiTheme="minorHAnsi"/>
-          <w:sz w:val="22"/>
-          <w:szCs w:val="22"/>
-        </w:rPr>
-        <w:t xml:space="preserve"> zawierają historyczne notowania akcji spółki </w:t>
-      </w:r>
-      <w:proofErr w:type="spellStart"/>
-      <w:r>
-        <w:rPr>
-          <w:rFonts w:asciiTheme="minorHAnsi" w:hAnsiTheme="minorHAnsi"/>
-          <w:sz w:val="22"/>
-          <w:szCs w:val="22"/>
-        </w:rPr>
-        <w:t>PayPal</w:t>
-      </w:r>
-      <w:proofErr w:type="spellEnd"/>
-      <w:r>
-        <w:rPr>
-          <w:rFonts w:asciiTheme="minorHAnsi" w:hAnsiTheme="minorHAnsi"/>
-          <w:sz w:val="22"/>
-          <w:szCs w:val="22"/>
-        </w:rPr>
-        <w:t xml:space="preserve">. </w:t>
-      </w:r>
-      <w:r>
-        <w:rPr>
-          <w:rFonts w:asciiTheme="minorHAnsi" w:hAnsiTheme="minorHAnsi"/>
-          <w:sz w:val="22"/>
-          <w:szCs w:val="22"/>
-        </w:rPr>
-        <w:t xml:space="preserve">Każda obserwacja odpowiada jednemu dniu handlowemu i zawiera kolumny: Open, High, </w:t>
-      </w:r>
-      <w:proofErr w:type="spellStart"/>
-      <w:r>
-        <w:rPr>
-          <w:rFonts w:asciiTheme="minorHAnsi" w:hAnsiTheme="minorHAnsi"/>
-          <w:sz w:val="22"/>
-          <w:szCs w:val="22"/>
-        </w:rPr>
-        <w:t>Low</w:t>
-      </w:r>
-      <w:proofErr w:type="spellEnd"/>
-      <w:r>
-        <w:rPr>
-          <w:rFonts w:asciiTheme="minorHAnsi" w:hAnsiTheme="minorHAnsi"/>
-          <w:sz w:val="22"/>
-          <w:szCs w:val="22"/>
-        </w:rPr>
-        <w:t>, Close, Volume. Zmienna objaśniana (target) to cena zamknięcia z następnego dnia (Close przesunięte o jeden wiersz), co oznacza, że model ma za zadanie przewidzieć jutrzejszą cenę zamknięcia na podstawie dzisiejszych danych. Podział na zbiór treningowy i testowy odbywa się bez tasowania (</w:t>
-      </w:r>
-      <w:proofErr w:type="spellStart"/>
-      <w:r>
-        <w:rPr>
-          <w:rFonts w:asciiTheme="minorHAnsi" w:hAnsiTheme="minorHAnsi"/>
-          <w:sz w:val="22"/>
-          <w:szCs w:val="22"/>
-        </w:rPr>
-        <w:t>shuffle</w:t>
-      </w:r>
-      <w:proofErr w:type="spellEnd"/>
-      <w:r>
-        <w:rPr>
-          <w:rFonts w:asciiTheme="minorHAnsi" w:hAnsiTheme="minorHAnsi"/>
-          <w:sz w:val="22"/>
-          <w:szCs w:val="22"/>
-        </w:rPr>
-        <w:t>=</w:t>
-      </w:r>
-      <w:proofErr w:type="spellStart"/>
-      <w:r>
-        <w:rPr>
-          <w:rFonts w:asciiTheme="minorHAnsi" w:hAnsiTheme="minorHAnsi"/>
-          <w:sz w:val="22"/>
-          <w:szCs w:val="22"/>
-        </w:rPr>
-        <w:t>False</w:t>
-      </w:r>
-      <w:proofErr w:type="spellEnd"/>
-      <w:r>
-        <w:rPr>
-          <w:rFonts w:asciiTheme="minorHAnsi" w:hAnsiTheme="minorHAnsi"/>
-          <w:sz w:val="22"/>
-          <w:szCs w:val="22"/>
-        </w:rPr>
-        <w:t>), co jest poprawnym podejściem dla danych szeregów czasowych — dane testowe są chronologicznie późniejsze niż treningowe.</w:t>
+        <w:t>Dane pobrane za pomocą biblioteki yfinance zawierają historyczne notowania akcji spółki PayPal. Każda obserwacja odpowiada jednemu dniu handlowemu i zawiera kolumny: Open, High, Low, Close, Volume. Zmienna objaśniana (target) to cena zamknięcia z następnego dnia (Close przesunięte o jeden wiersz), co oznacza, że model ma za zadanie przewidzieć jutrzejszą cenę zamknięcia na podstawie dzisiejszych danych. Podział na zbiór treningowy i testowy odbywa się bez tasowania (shuffle=False), co jest poprawnym podejściem dla danych szeregów czasowych — dane testowe są chronologicznie późniejsze niż treningowe.</w:t>
       </w:r>
     </w:p>
     <w:p>
       <w:pPr>
-        <w:pStyle w:val="NormalnyWeb"/>
+        <w:pStyle w:val="NormalWeb"/>
         <w:rPr>
           <w:rFonts w:asciiTheme="minorHAnsi" w:hAnsiTheme="minorHAnsi"/>
         </w:rPr>
@@ -776,7 +552,7 @@
     </w:p>
     <w:p>
       <w:pPr>
-        <w:pStyle w:val="Nagwek1"/>
+        <w:pStyle w:val="Heading1"/>
         <w:jc w:val="both"/>
         <w:rPr>
           <w:b/>
@@ -794,7 +570,7 @@
     </w:p>
     <w:p>
       <w:pPr>
-        <w:pStyle w:val="Podtytu"/>
+        <w:pStyle w:val="Subtitle"/>
         <w:jc w:val="both"/>
         <w:rPr>
           <w:rFonts w:asciiTheme="majorHAnsi" w:hAnsiTheme="majorHAnsi"/>
@@ -802,34 +578,14 @@
           <w:bCs/>
         </w:rPr>
       </w:pPr>
-      <w:proofErr w:type="spellStart"/>
       <w:r>
         <w:rPr>
           <w:rFonts w:asciiTheme="majorHAnsi" w:hAnsiTheme="majorHAnsi"/>
           <w:b/>
           <w:bCs/>
         </w:rPr>
-        <w:t>Random</w:t>
-      </w:r>
-      <w:proofErr w:type="spellEnd"/>
-      <w:r>
-        <w:rPr>
-          <w:rFonts w:asciiTheme="majorHAnsi" w:hAnsiTheme="majorHAnsi"/>
-          <w:b/>
-          <w:bCs/>
-        </w:rPr>
-        <w:t xml:space="preserve"> </w:t>
-      </w:r>
-      <w:proofErr w:type="spellStart"/>
-      <w:r>
-        <w:rPr>
-          <w:rFonts w:asciiTheme="majorHAnsi" w:hAnsiTheme="majorHAnsi"/>
-          <w:b/>
-          <w:bCs/>
-        </w:rPr>
-        <w:t>Forest</w:t>
-      </w:r>
-      <w:proofErr w:type="spellEnd"/>
+        <w:t>Random Forest</w:t>
+      </w:r>
     </w:p>
     <w:tbl>
       <w:tblPr>
@@ -1038,7 +794,6 @@
                 <w14:ligatures w14:val="none"/>
               </w:rPr>
             </w:pPr>
-            <w:proofErr w:type="gramStart"/>
             <w:r>
               <w:rPr>
                 <w:rFonts w:eastAsia="Times New Roman" w:cs="Times New Roman"/>
@@ -1048,19 +803,7 @@
                 <w:lang w:eastAsia="pl-PL"/>
                 <w14:ligatures w14:val="none"/>
               </w:rPr>
-              <w:t>accuracy[</w:t>
-            </w:r>
-            <w:proofErr w:type="gramEnd"/>
-            <w:r>
-              <w:rPr>
-                <w:rFonts w:eastAsia="Times New Roman" w:cs="Times New Roman"/>
-                <w:b/>
-                <w:bCs/>
-                <w:color w:val="FFFFFF"/>
-                <w:lang w:eastAsia="pl-PL"/>
-                <w14:ligatures w14:val="none"/>
-              </w:rPr>
-              <w:t>%]</w:t>
+              <w:t>accuracy[%]</w:t>
             </w:r>
           </w:p>
         </w:tc>
@@ -4037,22 +3780,22 @@
     <w:p/>
     <w:p>
       <w:pPr>
-        <w:pStyle w:val="Podtytu"/>
+        <w:pStyle w:val="Subtitle"/>
       </w:pPr>
     </w:p>
     <w:p>
       <w:pPr>
-        <w:pStyle w:val="Podtytu"/>
+        <w:pStyle w:val="Subtitle"/>
       </w:pPr>
     </w:p>
     <w:p>
       <w:pPr>
-        <w:pStyle w:val="Podtytu"/>
+        <w:pStyle w:val="Subtitle"/>
       </w:pPr>
     </w:p>
     <w:p>
       <w:pPr>
-        <w:pStyle w:val="Podtytu"/>
+        <w:pStyle w:val="Subtitle"/>
         <w:rPr>
           <w:rFonts w:asciiTheme="majorHAnsi" w:hAnsiTheme="majorHAnsi"/>
           <w:b/>
@@ -4062,7 +3805,7 @@
     </w:p>
     <w:p>
       <w:pPr>
-        <w:pStyle w:val="Podtytu"/>
+        <w:pStyle w:val="Subtitle"/>
         <w:rPr>
           <w:rFonts w:asciiTheme="majorHAnsi" w:hAnsiTheme="majorHAnsi"/>
           <w:b/>
@@ -4072,7 +3815,7 @@
     </w:p>
     <w:p>
       <w:pPr>
-        <w:pStyle w:val="Podtytu"/>
+        <w:pStyle w:val="Subtitle"/>
         <w:rPr>
           <w:rFonts w:asciiTheme="majorHAnsi" w:hAnsiTheme="majorHAnsi"/>
           <w:b/>
@@ -4082,7 +3825,7 @@
     </w:p>
     <w:p>
       <w:pPr>
-        <w:pStyle w:val="Podtytu"/>
+        <w:pStyle w:val="Subtitle"/>
         <w:rPr>
           <w:rFonts w:asciiTheme="majorHAnsi" w:hAnsiTheme="majorHAnsi"/>
           <w:b/>
@@ -4096,16 +3839,7 @@
           <w:bCs/>
         </w:rPr>
         <w:lastRenderedPageBreak/>
-        <w:t xml:space="preserve">Gradient </w:t>
-      </w:r>
-      <w:proofErr w:type="spellStart"/>
-      <w:r>
-        <w:rPr>
-          <w:rFonts w:asciiTheme="majorHAnsi" w:hAnsiTheme="majorHAnsi"/>
-          <w:b/>
-          <w:bCs/>
-        </w:rPr>
-        <w:t>Boos</w:t>
+        <w:t>Gradient Boos</w:t>
       </w:r>
       <w:r>
         <w:rPr>
@@ -4115,7 +3849,6 @@
         </w:rPr>
         <w:t>ting</w:t>
       </w:r>
-      <w:proofErr w:type="spellEnd"/>
     </w:p>
     <w:tbl>
       <w:tblPr>
@@ -4324,7 +4057,6 @@
                 <w14:ligatures w14:val="none"/>
               </w:rPr>
             </w:pPr>
-            <w:proofErr w:type="gramStart"/>
             <w:r>
               <w:rPr>
                 <w:rFonts w:eastAsia="Times New Roman" w:cs="Times New Roman"/>
@@ -4334,19 +4066,7 @@
                 <w:lang w:eastAsia="pl-PL"/>
                 <w14:ligatures w14:val="none"/>
               </w:rPr>
-              <w:t>accuracy[</w:t>
-            </w:r>
-            <w:proofErr w:type="gramEnd"/>
-            <w:r>
-              <w:rPr>
-                <w:rFonts w:eastAsia="Times New Roman" w:cs="Times New Roman"/>
-                <w:b/>
-                <w:bCs/>
-                <w:color w:val="FFFFFF"/>
-                <w:lang w:eastAsia="pl-PL"/>
-                <w14:ligatures w14:val="none"/>
-              </w:rPr>
-              <w:t>%]</w:t>
+              <w:t>accuracy[%]</w:t>
             </w:r>
           </w:p>
         </w:tc>
@@ -7312,13 +7032,8 @@
         <w:t>Domyślna wartość</w:t>
       </w:r>
       <w:r>
-        <w:t xml:space="preserve"> parametru </w:t>
-      </w:r>
-      <w:proofErr w:type="spellStart"/>
-      <w:r>
-        <w:t>learning_rate</w:t>
-      </w:r>
-      <w:proofErr w:type="spellEnd"/>
+        <w:t xml:space="preserve"> parametru learning_rate</w:t>
+      </w:r>
       <w:r>
         <w:t xml:space="preserve"> </w:t>
       </w:r>
@@ -7369,7 +7084,7 @@
     </w:p>
     <w:p>
       <w:pPr>
-        <w:pStyle w:val="Nagwek1"/>
+        <w:pStyle w:val="Heading1"/>
         <w:rPr>
           <w:b/>
           <w:bCs/>
@@ -7386,41 +7101,21 @@
     </w:p>
     <w:p>
       <w:pPr>
-        <w:pStyle w:val="Podtytu"/>
+        <w:pStyle w:val="Subtitle"/>
         <w:rPr>
           <w:rFonts w:asciiTheme="majorHAnsi" w:hAnsiTheme="majorHAnsi"/>
           <w:b/>
           <w:bCs/>
         </w:rPr>
       </w:pPr>
-      <w:proofErr w:type="spellStart"/>
       <w:r>
         <w:rPr>
           <w:rFonts w:asciiTheme="majorHAnsi" w:hAnsiTheme="majorHAnsi"/>
           <w:b/>
           <w:bCs/>
         </w:rPr>
-        <w:t>Random</w:t>
-      </w:r>
-      <w:proofErr w:type="spellEnd"/>
-      <w:r>
-        <w:rPr>
-          <w:rFonts w:asciiTheme="majorHAnsi" w:hAnsiTheme="majorHAnsi"/>
-          <w:b/>
-          <w:bCs/>
-        </w:rPr>
-        <w:t xml:space="preserve"> </w:t>
-      </w:r>
-      <w:proofErr w:type="spellStart"/>
-      <w:r>
-        <w:rPr>
-          <w:rFonts w:asciiTheme="majorHAnsi" w:hAnsiTheme="majorHAnsi"/>
-          <w:b/>
-          <w:bCs/>
-        </w:rPr>
-        <w:t>Forest</w:t>
-      </w:r>
-      <w:proofErr w:type="spellEnd"/>
+        <w:t>Random Forest</w:t>
+      </w:r>
     </w:p>
     <w:tbl>
       <w:tblPr>
@@ -7711,7 +7406,6 @@
                 <w14:ligatures w14:val="none"/>
               </w:rPr>
             </w:pPr>
-            <w:proofErr w:type="gramStart"/>
             <w:r>
               <w:rPr>
                 <w:rFonts w:eastAsia="Times New Roman" w:cs="Times New Roman"/>
@@ -7721,19 +7415,7 @@
                 <w:lang w:eastAsia="pl-PL"/>
                 <w14:ligatures w14:val="none"/>
               </w:rPr>
-              <w:t>mape[</w:t>
-            </w:r>
-            <w:proofErr w:type="gramEnd"/>
-            <w:r>
-              <w:rPr>
-                <w:rFonts w:eastAsia="Times New Roman" w:cs="Times New Roman"/>
-                <w:b/>
-                <w:bCs/>
-                <w:color w:val="FFFFFF"/>
-                <w:lang w:eastAsia="pl-PL"/>
-                <w14:ligatures w14:val="none"/>
-              </w:rPr>
-              <w:t>%]</w:t>
+              <w:t>mape[%]</w:t>
             </w:r>
           </w:p>
         </w:tc>
@@ -11835,15 +11517,7 @@
         <w:t>N</w:t>
       </w:r>
       <w:r>
-        <w:t xml:space="preserve">iewielkie zwiększenie parametru </w:t>
-      </w:r>
-      <w:proofErr w:type="spellStart"/>
-      <w:r>
-        <w:t>min_samples_leaf</w:t>
-      </w:r>
-      <w:proofErr w:type="spellEnd"/>
-      <w:r>
-        <w:t xml:space="preserve"> poprawiło jakość predykcji</w:t>
+        <w:t>iewielkie zwiększenie parametru min_samples_leaf poprawiło jakość predykcji</w:t>
       </w:r>
       <w:r>
         <w:t xml:space="preserve">. Ustawienie go na wartość 2 pozwoliło osiągnąć najlepszy wynik w </w:t>
@@ -11868,7 +11542,7 @@
     </w:p>
     <w:p>
       <w:pPr>
-        <w:pStyle w:val="Podtytu"/>
+        <w:pStyle w:val="Subtitle"/>
         <w:rPr>
           <w:rFonts w:asciiTheme="majorHAnsi" w:hAnsiTheme="majorHAnsi"/>
           <w:b/>
@@ -11882,16 +11556,7 @@
           <w:bCs/>
         </w:rPr>
         <w:lastRenderedPageBreak/>
-        <w:t xml:space="preserve">Gradient </w:t>
-      </w:r>
-      <w:proofErr w:type="spellStart"/>
-      <w:r>
-        <w:rPr>
-          <w:rFonts w:asciiTheme="majorHAnsi" w:hAnsiTheme="majorHAnsi"/>
-          <w:b/>
-          <w:bCs/>
-        </w:rPr>
-        <w:t>Boos</w:t>
+        <w:t>Gradient Boos</w:t>
       </w:r>
       <w:r>
         <w:rPr>
@@ -11901,7 +11566,6 @@
         </w:rPr>
         <w:t>ting</w:t>
       </w:r>
-      <w:proofErr w:type="spellEnd"/>
     </w:p>
     <w:tbl>
       <w:tblPr>
@@ -12192,7 +11856,6 @@
                 <w14:ligatures w14:val="none"/>
               </w:rPr>
             </w:pPr>
-            <w:proofErr w:type="gramStart"/>
             <w:r>
               <w:rPr>
                 <w:rFonts w:eastAsia="Times New Roman" w:cs="Times New Roman"/>
@@ -12202,19 +11865,7 @@
                 <w:lang w:eastAsia="pl-PL"/>
                 <w14:ligatures w14:val="none"/>
               </w:rPr>
-              <w:t>mape[</w:t>
-            </w:r>
-            <w:proofErr w:type="gramEnd"/>
-            <w:r>
-              <w:rPr>
-                <w:rFonts w:eastAsia="Times New Roman" w:cs="Times New Roman"/>
-                <w:b/>
-                <w:bCs/>
-                <w:color w:val="FFFFFF"/>
-                <w:lang w:eastAsia="pl-PL"/>
-                <w14:ligatures w14:val="none"/>
-              </w:rPr>
-              <w:t>%]</w:t>
+              <w:t>mape[%]</w:t>
             </w:r>
           </w:p>
         </w:tc>
@@ -16318,15 +15969,7 @@
         <w:t>właściwe</w:t>
       </w:r>
       <w:r>
-        <w:t>. Ograniczenie danych treningowych dla każdego drzewa do losowych 90% (</w:t>
-      </w:r>
-      <w:proofErr w:type="spellStart"/>
-      <w:r>
-        <w:t>subsample</w:t>
-      </w:r>
-      <w:proofErr w:type="spellEnd"/>
-      <w:r>
-        <w:t xml:space="preserve"> = 0.9) uchroniło model przed przeuczeniem. Błąd MAPE drastycznie spadł, dając najlepszy wynik dla tej metody: 1,79% (przy najniższym MAE = 0,79).</w:t>
+        <w:t>. Ograniczenie danych treningowych dla każdego drzewa do losowych 90% (subsample = 0.9) uchroniło model przed przeuczeniem. Błąd MAPE drastycznie spadł, dając najlepszy wynik dla tej metody: 1,79% (przy najniższym MAE = 0,79).</w:t>
       </w:r>
     </w:p>
     <w:p>
@@ -16349,7 +15992,7 @@
     <w:p/>
     <w:p>
       <w:pPr>
-        <w:pStyle w:val="Tytu"/>
+        <w:pStyle w:val="Title"/>
       </w:pPr>
       <w:r>
         <w:lastRenderedPageBreak/>
@@ -16358,7 +16001,7 @@
     </w:p>
     <w:p>
       <w:pPr>
-        <w:pStyle w:val="Nagwek1"/>
+        <w:pStyle w:val="Heading1"/>
         <w:rPr>
           <w:b/>
           <w:bCs/>
@@ -16379,7 +16022,7 @@
     </w:p>
     <w:p>
       <w:pPr>
-        <w:pStyle w:val="Nagwek1"/>
+        <w:pStyle w:val="Heading1"/>
         <w:rPr>
           <w:b/>
           <w:bCs/>
@@ -16395,7 +16038,7 @@
     </w:p>
     <w:p>
       <w:pPr>
-        <w:pStyle w:val="Nagwek2"/>
+        <w:pStyle w:val="Heading2"/>
         <w:rPr>
           <w:b/>
           <w:bCs/>
@@ -16482,15 +16125,59 @@
       </w:r>
     </w:p>
     <w:p>
+      <w:pPr>
+        <w:numPr>
+          <w:ilvl w:val="0"/>
+          <w:numId w:val="6"/>
+        </w:numPr>
+        <w:rPr>
+          <w:lang w:val="en-GB"/>
+        </w:rPr>
+      </w:pPr>
+      <w:proofErr w:type="spellStart"/>
+      <w:r>
+        <w:rPr>
+          <w:lang w:val="en-GB"/>
+        </w:rPr>
+        <w:t>liniową</w:t>
+      </w:r>
+      <w:proofErr w:type="spellEnd"/>
+    </w:p>
+    <w:p>
+      <w:pPr>
+        <w:numPr>
+          <w:ilvl w:val="0"/>
+          <w:numId w:val="6"/>
+        </w:numPr>
+        <w:rPr>
+          <w:lang w:val="en-GB"/>
+        </w:rPr>
+      </w:pPr>
+      <w:proofErr w:type="spellStart"/>
+      <w:r>
+        <w:rPr>
+          <w:lang w:val="en-GB"/>
+        </w:rPr>
+        <w:t>relu</w:t>
+      </w:r>
+      <w:proofErr w:type="spellEnd"/>
+    </w:p>
+    <w:p>
+      <w:pPr>
+        <w:jc w:val="center"/>
+        <w:rPr>
+          <w:noProof/>
+        </w:rPr>
+      </w:pPr>
       <w:r>
         <w:rPr>
           <w:noProof/>
         </w:rPr>
         <w:drawing>
-          <wp:inline distT="0" distB="0" distL="0" distR="0" wp14:anchorId="01B8A256" wp14:editId="23387E5B">
+          <wp:inline distT="0" distB="0" distL="0" distR="0" wp14:anchorId="7BD595CC" wp14:editId="1EEB949C">
             <wp:extent cx="5760720" cy="3830320"/>
             <wp:effectExtent l="0" t="0" r="0" b="0"/>
-            <wp:docPr id="45117909" name="Picture 1"/>
+            <wp:docPr id="317963424" name="Picture 4"/>
             <wp:cNvGraphicFramePr>
               <a:graphicFrameLocks xmlns:a="http://schemas.openxmlformats.org/drawingml/2006/main" noChangeAspect="1"/>
             </wp:cNvGraphicFramePr>
@@ -16498,7 +16185,7 @@
               <a:graphicData uri="http://schemas.openxmlformats.org/drawingml/2006/picture">
                 <pic:pic xmlns:pic="http://schemas.openxmlformats.org/drawingml/2006/picture">
                   <pic:nvPicPr>
-                    <pic:cNvPr id="0" name="Picture 1"/>
+                    <pic:cNvPr id="0" name="Picture 10"/>
                     <pic:cNvPicPr>
                       <a:picLocks noChangeAspect="1" noChangeArrowheads="1"/>
                     </pic:cNvPicPr>
@@ -16535,14 +16222,22 @@
           </wp:inline>
         </w:drawing>
       </w:r>
-      <w:r>
-        <w:t>Jak widać na powyższym wykresie tanh wykazuje się mniejszym błędem MSE na przestrzeni 500 epoch. Sigmoid uczy się szybciej, lecz wraz ze zmniejszaniem się błędu, tempo nauki spada.</w:t>
+    </w:p>
+    <w:p>
+      <w:r>
+        <w:t xml:space="preserve">Jak widać na powyższym wykresie </w:t>
+      </w:r>
+      <w:r>
+        <w:t>tanh i relu są najlepsze w swoich grupach funkcji</w:t>
+      </w:r>
+      <w:r>
+        <w:t>.</w:t>
       </w:r>
     </w:p>
     <w:p/>
     <w:p>
       <w:pPr>
-        <w:pStyle w:val="Nagwek2"/>
+        <w:pStyle w:val="Heading2"/>
         <w:rPr>
           <w:b/>
           <w:bCs/>
@@ -16553,6 +16248,7 @@
           <w:b/>
           <w:bCs/>
         </w:rPr>
+        <w:lastRenderedPageBreak/>
         <w:t>Liczba neuronów w warstwach ukrytych</w:t>
       </w:r>
     </w:p>
@@ -16565,11 +16261,13 @@
       </w:r>
     </w:p>
     <w:p>
+      <w:pPr>
+        <w:jc w:val="center"/>
+      </w:pPr>
       <w:r>
         <w:rPr>
           <w:noProof/>
         </w:rPr>
-        <w:lastRenderedPageBreak/>
         <w:drawing>
           <wp:inline distT="0" distB="0" distL="0" distR="0" wp14:anchorId="49543CFB" wp14:editId="3FB44472">
             <wp:extent cx="5760720" cy="3830320"/>
@@ -16630,7 +16328,7 @@
     </w:p>
     <w:p>
       <w:pPr>
-        <w:pStyle w:val="Nagwek2"/>
+        <w:pStyle w:val="Heading2"/>
         <w:rPr>
           <w:b/>
           <w:bCs/>
@@ -16648,12 +16346,22 @@
       <w:r>
         <w:t>Zwiększenie głębokości sieci pozwala na tworzenie bardziej złożonych abstrakcji, ale niesie ryzyko przeuczenia (overfitting).</w:t>
       </w:r>
+      <w:r>
+        <w:t xml:space="preserve"> Zwiększa też złożoność obliczeniową. Sieć może potrzebować więcej czasu na naukę. W tym przypadku można spodziewać się, że płytka sieć sprawdzi się lepiej ze względu na to, że złożoność problemu jest niska, a zależności między zmiennymi, a wynikiem nie są </w:t>
+      </w:r>
+      <w:r>
+        <w:t>skomplikowane.</w:t>
+      </w:r>
     </w:p>
     <w:p>
+      <w:pPr>
+        <w:jc w:val="center"/>
+      </w:pPr>
       <w:r>
         <w:rPr>
           <w:noProof/>
         </w:rPr>
+        <w:lastRenderedPageBreak/>
         <w:drawing>
           <wp:inline distT="0" distB="0" distL="0" distR="0" wp14:anchorId="01B2AC66" wp14:editId="3E8C7682">
             <wp:extent cx="5065461" cy="3368040"/>
@@ -16706,94 +16414,27 @@
     </w:p>
     <w:p>
       <w:r>
-        <w:lastRenderedPageBreak/>
         <w:t>Wszystkie konfiguracje neuronów w dwóch warstwach ukrytych osiągały gorsze wyniki od sieci z jedną dwunastoneuronową warstwą. Z tego względu uznane zostało, że jedna warstwa z dwunastoma neuronami jest optymalnym układem sieci.</w:t>
       </w:r>
     </w:p>
     <w:p>
-      <w:pPr>
-        <w:pStyle w:val="Nagwek2"/>
-        <w:rPr>
-          <w:b/>
-          <w:bCs/>
-        </w:rPr>
-      </w:pPr>
-      <w:r>
-        <w:rPr>
-          <w:b/>
-          <w:bCs/>
-        </w:rPr>
-        <w:t>Sposób inicjalizacji wag</w:t>
+      <w:r>
+        <w:t>Na powyższym wykresie sieci wyglądają na niedouczone, dlatego zwiększono dwukrotnie liczbę epoch. Wyniki wciąż są gorsze od jedej dwunastoneuronowej sieci, lecz są zdecydowanie bliższe (wyniki są znacznie niższe ze względu na to, że inne parametry sieci takie jak sposób normalizacji danych, wybór danych wejściowych, funkcja aktywacji itp. zostały ustawione na optymalne w porównaniu do uczenia na przestrzeni 500 epoch, kiedy to parametry te były losowe).</w:t>
       </w:r>
     </w:p>
     <w:p>
-      <w:r>
-        <w:t>Porównano inicjalizację losową na podstawie rozkładu normalnego o parametrach</w:t>
-      </w:r>
-      <w:r>
-        <w:t xml:space="preserve"> </w:t>
-      </w:r>
-      <m:oMath>
-        <m:r>
-          <w:rPr>
-            <w:rFonts w:ascii="Cambria Math" w:hAnsi="Cambria Math"/>
-          </w:rPr>
-          <m:t>μ=0</m:t>
-        </m:r>
-      </m:oMath>
-      <w:r>
-        <w:t>  i </w:t>
-      </w:r>
-      <m:oMath>
-        <m:r>
-          <w:rPr>
-            <w:rFonts w:ascii="Cambria Math" w:hAnsi="Cambria Math"/>
-          </w:rPr>
-          <m:t>σ=1</m:t>
-        </m:r>
-      </m:oMath>
-      <w:r>
-        <w:t>, rozkład jednostajny na przedziale</w:t>
-      </w:r>
-      <w:r>
-        <w:t xml:space="preserve"> [-0,5; 0,5</w:t>
-      </w:r>
-      <w:proofErr w:type="gramStart"/>
-      <w:r>
-        <w:t>]</w:t>
-      </w:r>
-      <w:r>
-        <w:t>  oraz</w:t>
-      </w:r>
-      <w:proofErr w:type="gramEnd"/>
-      <w:r>
-        <w:t xml:space="preserve"> przy użyciu</w:t>
-      </w:r>
-      <w:r>
-        <w:t xml:space="preserve"> metod</w:t>
-      </w:r>
-      <w:r>
-        <w:t>y</w:t>
-      </w:r>
-      <w:r>
-        <w:t xml:space="preserve"> Xaviera.</w:t>
-      </w:r>
-    </w:p>
-    <w:p>
-      <w:pPr>
-        <w:rPr>
-          <w:rFonts w:eastAsiaTheme="minorEastAsia"/>
-        </w:rPr>
+      <w:pPr>
+        <w:jc w:val="center"/>
       </w:pPr>
       <w:r>
         <w:rPr>
           <w:noProof/>
         </w:rPr>
         <w:drawing>
-          <wp:inline distT="0" distB="0" distL="0" distR="0" wp14:anchorId="2DAB2E93" wp14:editId="1B26839D">
-            <wp:extent cx="5760720" cy="3830320"/>
+          <wp:inline distT="0" distB="0" distL="0" distR="0" wp14:anchorId="7343C5DE" wp14:editId="537EAD35">
+            <wp:extent cx="4838700" cy="3530120"/>
             <wp:effectExtent l="0" t="0" r="0" b="0"/>
-            <wp:docPr id="1317223542" name="Picture 4"/>
+            <wp:docPr id="317766686" name="Picture 1"/>
             <wp:cNvGraphicFramePr>
               <a:graphicFrameLocks xmlns:a="http://schemas.openxmlformats.org/drawingml/2006/main" noChangeAspect="1"/>
             </wp:cNvGraphicFramePr>
@@ -16801,7 +16442,7 @@
               <a:graphicData uri="http://schemas.openxmlformats.org/drawingml/2006/picture">
                 <pic:pic xmlns:pic="http://schemas.openxmlformats.org/drawingml/2006/picture">
                   <pic:nvPicPr>
-                    <pic:cNvPr id="0" name="Picture 7"/>
+                    <pic:cNvPr id="0" name="Picture 1"/>
                     <pic:cNvPicPr>
                       <a:picLocks noChangeAspect="1" noChangeArrowheads="1"/>
                     </pic:cNvPicPr>
@@ -16822,7 +16463,7 @@
                   <pic:spPr bwMode="auto">
                     <a:xfrm>
                       <a:off x="0" y="0"/>
-                      <a:ext cx="5760720" cy="3830320"/>
+                      <a:ext cx="4852455" cy="3540155"/>
                     </a:xfrm>
                     <a:prstGeom prst="rect">
                       <a:avLst/>
@@ -16839,20 +16480,10 @@
         </w:drawing>
       </w:r>
     </w:p>
+    <w:p/>
     <w:p>
-      <w:r>
-        <w:t>Z powyższego wykresu wynika, iż rozkład jednostajny jest optymalną metodą. Na wykresie nie ma zawartego rozkładu na przedziale </w:t>
-      </w:r>
-      <w:r>
-        <w:t>[-1;1]</w:t>
-      </w:r>
-      <w:r>
-        <w:t>, lecz on również został pobity przez wyniki rozkładu oznaczonego czerwoną linią.</w:t>
-      </w:r>
-    </w:p>
-    <w:p>
-      <w:pPr>
-        <w:pStyle w:val="Nagwek2"/>
+      <w:pPr>
+        <w:pStyle w:val="Heading2"/>
         <w:rPr>
           <w:b/>
           <w:bCs/>
@@ -16863,86 +16494,73 @@
           <w:b/>
           <w:bCs/>
         </w:rPr>
-        <w:t>Sposób normalizacji danych wejściowych</w:t>
+        <w:t>Sposób inicjalizacji wag</w:t>
       </w:r>
     </w:p>
     <w:p>
-      <w:pPr>
-        <w:rPr>
-          <w:lang w:val="en-GB"/>
-        </w:rPr>
-      </w:pPr>
-      <w:r>
-        <w:t xml:space="preserve">Sieci neuronowe są wrażliwe na skalę danych wejściowych. </w:t>
-      </w:r>
-      <w:proofErr w:type="spellStart"/>
-      <w:r>
-        <w:rPr>
-          <w:lang w:val="en-GB"/>
-        </w:rPr>
-        <w:t>Porównano</w:t>
-      </w:r>
-      <w:proofErr w:type="spellEnd"/>
-      <w:r>
-        <w:rPr>
-          <w:lang w:val="en-GB"/>
-        </w:rPr>
-        <w:t>:</w:t>
+      <w:r>
+        <w:t>Porównano inicjalizację losową na podstawie rozkładu normalnego o parametrach</w:t>
+      </w:r>
+      <w:r>
+        <w:t xml:space="preserve"> </w:t>
+      </w:r>
+      <m:oMath>
+        <m:r>
+          <w:rPr>
+            <w:rFonts w:ascii="Cambria Math" w:hAnsi="Cambria Math"/>
+          </w:rPr>
+          <m:t>μ=0</m:t>
+        </m:r>
+      </m:oMath>
+      <w:r>
+        <w:t>  i </w:t>
+      </w:r>
+      <m:oMath>
+        <m:r>
+          <w:rPr>
+            <w:rFonts w:ascii="Cambria Math" w:hAnsi="Cambria Math"/>
+          </w:rPr>
+          <m:t>σ=1</m:t>
+        </m:r>
+      </m:oMath>
+      <w:r>
+        <w:t>, rozkład jednostajny na przedziale</w:t>
+      </w:r>
+      <w:r>
+        <w:t xml:space="preserve"> [-0,5; 0,5]</w:t>
+      </w:r>
+      <w:r>
+        <w:t>  oraz</w:t>
+      </w:r>
+      <w:r>
+        <w:t xml:space="preserve"> przy użyciu</w:t>
+      </w:r>
+      <w:r>
+        <w:t xml:space="preserve"> metod</w:t>
+      </w:r>
+      <w:r>
+        <w:t>y</w:t>
+      </w:r>
+      <w:r>
+        <w:t xml:space="preserve"> Xaviera.</w:t>
       </w:r>
     </w:p>
     <w:p>
       <w:pPr>
-        <w:numPr>
-          <w:ilvl w:val="0"/>
-          <w:numId w:val="7"/>
-        </w:numPr>
-      </w:pPr>
-      <w:r>
-        <w:t>Min-Max Scaling (przesunięcie do zakresu </w:t>
-      </w:r>
-      <w:r>
-        <w:t>[0; 1]</w:t>
-      </w:r>
-      <w:r>
-        <w:t>)</w:t>
-      </w:r>
-    </w:p>
-    <w:p>
-      <w:pPr>
-        <w:numPr>
-          <w:ilvl w:val="0"/>
-          <w:numId w:val="7"/>
-        </w:numPr>
+        <w:jc w:val="center"/>
         <w:rPr>
-          <w:lang w:val="en-GB"/>
+          <w:rFonts w:eastAsiaTheme="minorEastAsia"/>
         </w:rPr>
       </w:pPr>
-      <w:proofErr w:type="spellStart"/>
-      <w:r>
-        <w:rPr>
-          <w:lang w:val="en-GB"/>
-        </w:rPr>
-        <w:t>Standaryzację</w:t>
-      </w:r>
-      <w:proofErr w:type="spellEnd"/>
-      <w:r>
-        <w:rPr>
-          <w:lang w:val="en-GB"/>
-        </w:rPr>
-        <w:t xml:space="preserve"> (Z-score normalization).</w:t>
-      </w:r>
-    </w:p>
-    <w:p>
       <w:r>
         <w:rPr>
           <w:noProof/>
         </w:rPr>
-        <w:lastRenderedPageBreak/>
         <w:drawing>
-          <wp:inline distT="0" distB="0" distL="0" distR="0" wp14:anchorId="2F93D914" wp14:editId="55FBB333">
+          <wp:inline distT="0" distB="0" distL="0" distR="0" wp14:anchorId="2DAB2E93" wp14:editId="1B26839D">
             <wp:extent cx="5760720" cy="3830320"/>
             <wp:effectExtent l="0" t="0" r="0" b="0"/>
-            <wp:docPr id="541020092" name="Picture 5"/>
+            <wp:docPr id="1317223542" name="Picture 4"/>
             <wp:cNvGraphicFramePr>
               <a:graphicFrameLocks xmlns:a="http://schemas.openxmlformats.org/drawingml/2006/main" noChangeAspect="1"/>
             </wp:cNvGraphicFramePr>
@@ -16950,7 +16568,7 @@
               <a:graphicData uri="http://schemas.openxmlformats.org/drawingml/2006/picture">
                 <pic:pic xmlns:pic="http://schemas.openxmlformats.org/drawingml/2006/picture">
                   <pic:nvPicPr>
-                    <pic:cNvPr id="0" name="Picture 9"/>
+                    <pic:cNvPr id="0" name="Picture 7"/>
                     <pic:cNvPicPr>
                       <a:picLocks noChangeAspect="1" noChangeArrowheads="1"/>
                     </pic:cNvPicPr>
@@ -16990,20 +16608,192 @@
     </w:p>
     <w:p>
       <w:r>
-        <w:t xml:space="preserve">Normalizacja do rozkładu normalnego o </w:t>
-      </w:r>
-      <w:proofErr w:type="gramStart"/>
-      <w:r>
-        <w:t>parametrach  i</w:t>
-      </w:r>
-      <w:proofErr w:type="gramEnd"/>
-      <w:r>
-        <w:t>  okazała się optymalnym wyborem, który znacznie zmniejszał błąd sieci.</w:t>
+        <w:t>Z powyższego wykresu wynika, iż rozkład jednostajny jest optymalną metodą. Na wykresie nie ma zawartego rozkładu na przedziale </w:t>
+      </w:r>
+      <w:r>
+        <w:t>[-1;1]</w:t>
+      </w:r>
+      <w:r>
+        <w:t>, lecz on również został pobity przez wyniki rozkładu oznaczonego czerwoną linią.</w:t>
       </w:r>
     </w:p>
     <w:p>
       <w:pPr>
-        <w:pStyle w:val="Nagwek2"/>
+        <w:pStyle w:val="Heading2"/>
+        <w:rPr>
+          <w:b/>
+          <w:bCs/>
+        </w:rPr>
+      </w:pPr>
+      <w:r>
+        <w:rPr>
+          <w:b/>
+          <w:bCs/>
+        </w:rPr>
+        <w:t>Sposób normalizacji danych wejściowych</w:t>
+      </w:r>
+    </w:p>
+    <w:p>
+      <w:pPr>
+        <w:rPr>
+          <w:lang w:val="en-GB"/>
+        </w:rPr>
+      </w:pPr>
+      <w:r>
+        <w:t xml:space="preserve">Sieci neuronowe są wrażliwe na skalę danych wejściowych. </w:t>
+      </w:r>
+      <w:proofErr w:type="spellStart"/>
+      <w:r>
+        <w:rPr>
+          <w:lang w:val="en-GB"/>
+        </w:rPr>
+        <w:t>Porównano</w:t>
+      </w:r>
+      <w:proofErr w:type="spellEnd"/>
+      <w:r>
+        <w:rPr>
+          <w:lang w:val="en-GB"/>
+        </w:rPr>
+        <w:t>:</w:t>
+      </w:r>
+    </w:p>
+    <w:p>
+      <w:pPr>
+        <w:numPr>
+          <w:ilvl w:val="0"/>
+          <w:numId w:val="7"/>
+        </w:numPr>
+      </w:pPr>
+      <w:r>
+        <w:t>Min-Max Scaling (przesunięcie do zakresu </w:t>
+      </w:r>
+      <w:r>
+        <w:t>[0; 1]</w:t>
+      </w:r>
+      <w:r>
+        <w:t>)</w:t>
+      </w:r>
+    </w:p>
+    <w:p>
+      <w:pPr>
+        <w:numPr>
+          <w:ilvl w:val="0"/>
+          <w:numId w:val="7"/>
+        </w:numPr>
+        <w:rPr>
+          <w:lang w:val="en-GB"/>
+        </w:rPr>
+      </w:pPr>
+      <w:proofErr w:type="spellStart"/>
+      <w:r>
+        <w:rPr>
+          <w:lang w:val="en-GB"/>
+        </w:rPr>
+        <w:t>Standaryzację</w:t>
+      </w:r>
+      <w:proofErr w:type="spellEnd"/>
+      <w:r>
+        <w:rPr>
+          <w:lang w:val="en-GB"/>
+        </w:rPr>
+        <w:t xml:space="preserve"> (Z-score normalization)</w:t>
+      </w:r>
+    </w:p>
+    <w:p>
+      <w:pPr>
+        <w:numPr>
+          <w:ilvl w:val="0"/>
+          <w:numId w:val="7"/>
+        </w:numPr>
+      </w:pPr>
+      <w:r>
+        <w:t>Podzielenie wartości przez wartość m</w:t>
+      </w:r>
+      <w:r>
+        <w:t>aksymalną (div_max)</w:t>
+      </w:r>
+    </w:p>
+    <w:p>
+      <w:r>
+        <w:t>Dzięki ich zastosowaniu sieci powinny się szybciej uczyć oraz pozwala unikać nasycenia przy funkcjach typu sigmoid czy tangens hiperboliczny, a ta ostatnia została uznana za optymalną przy początkowych testach.</w:t>
+      </w:r>
+    </w:p>
+    <w:p>
+      <w:pPr>
+        <w:jc w:val="center"/>
+      </w:pPr>
+      <w:r>
+        <w:rPr>
+          <w:noProof/>
+        </w:rPr>
+        <w:lastRenderedPageBreak/>
+        <w:drawing>
+          <wp:inline distT="0" distB="0" distL="0" distR="0" wp14:anchorId="769C2C8E" wp14:editId="3C98D3A4">
+            <wp:extent cx="5523875" cy="3672840"/>
+            <wp:effectExtent l="0" t="0" r="635" b="3810"/>
+            <wp:docPr id="2102668764" name="Picture 2"/>
+            <wp:cNvGraphicFramePr>
+              <a:graphicFrameLocks xmlns:a="http://schemas.openxmlformats.org/drawingml/2006/main" noChangeAspect="1"/>
+            </wp:cNvGraphicFramePr>
+            <a:graphic xmlns:a="http://schemas.openxmlformats.org/drawingml/2006/main">
+              <a:graphicData uri="http://schemas.openxmlformats.org/drawingml/2006/picture">
+                <pic:pic xmlns:pic="http://schemas.openxmlformats.org/drawingml/2006/picture">
+                  <pic:nvPicPr>
+                    <pic:cNvPr id="0" name="Picture 3"/>
+                    <pic:cNvPicPr>
+                      <a:picLocks noChangeAspect="1" noChangeArrowheads="1"/>
+                    </pic:cNvPicPr>
+                  </pic:nvPicPr>
+                  <pic:blipFill>
+                    <a:blip r:embed="rId13">
+                      <a:extLst>
+                        <a:ext uri="{28A0092B-C50C-407E-A947-70E740481C1C}">
+                          <a14:useLocalDpi xmlns:a14="http://schemas.microsoft.com/office/drawing/2010/main" val="0"/>
+                        </a:ext>
+                      </a:extLst>
+                    </a:blip>
+                    <a:srcRect/>
+                    <a:stretch>
+                      <a:fillRect/>
+                    </a:stretch>
+                  </pic:blipFill>
+                  <pic:spPr bwMode="auto">
+                    <a:xfrm>
+                      <a:off x="0" y="0"/>
+                      <a:ext cx="5538627" cy="3682649"/>
+                    </a:xfrm>
+                    <a:prstGeom prst="rect">
+                      <a:avLst/>
+                    </a:prstGeom>
+                    <a:noFill/>
+                    <a:ln>
+                      <a:noFill/>
+                    </a:ln>
+                  </pic:spPr>
+                </pic:pic>
+              </a:graphicData>
+            </a:graphic>
+          </wp:inline>
+        </w:drawing>
+      </w:r>
+    </w:p>
+    <w:p>
+      <w:r>
+        <w:t xml:space="preserve">Normalizacja </w:t>
+      </w:r>
+      <w:r>
+        <w:t>za pomocą metody min-max</w:t>
+      </w:r>
+      <w:r>
+        <w:t xml:space="preserve"> </w:t>
+      </w:r>
+      <w:r>
+        <w:t>okazała się optymalnym wyborem, który znacznie zmniejszał błąd sieci.</w:t>
+      </w:r>
+    </w:p>
+    <w:p>
+      <w:pPr>
+        <w:pStyle w:val="Heading2"/>
         <w:rPr>
           <w:b/>
           <w:bCs/>
@@ -17145,6 +16935,9 @@
       </w:r>
     </w:p>
     <w:p>
+      <w:pPr>
+        <w:jc w:val="center"/>
+      </w:pPr>
       <w:r>
         <w:rPr>
           <w:noProof/>
@@ -17168,7 +16961,7 @@
                     </pic:cNvPicPr>
                   </pic:nvPicPr>
                   <pic:blipFill>
-                    <a:blip r:embed="rId13">
+                    <a:blip r:embed="rId14">
                       <a:extLst>
                         <a:ext uri="{28A0092B-C50C-407E-A947-70E740481C1C}">
                           <a14:useLocalDpi xmlns:a14="http://schemas.microsoft.com/office/drawing/2010/main" val="0"/>
@@ -17207,7 +17000,7 @@
     </w:p>
     <w:p>
       <w:pPr>
-        <w:pStyle w:val="Nagwek2"/>
+        <w:pStyle w:val="Heading2"/>
         <w:rPr>
           <w:b/>
           <w:bCs/>
@@ -17232,18 +17025,10 @@
         <w:t xml:space="preserve">. Zmiana progu pozwala na balansowanie między precyzją (Precision) a czułością (Recall). Poniżej znajduje się porównanie dla wartości odcięcia </w:t>
       </w:r>
       <w:r>
-        <w:t>0,</w:t>
-      </w:r>
-      <w:proofErr w:type="gramStart"/>
-      <w:r>
-        <w:t>3</w:t>
-      </w:r>
-      <w:r>
-        <w:t>  oraz</w:t>
-      </w:r>
-      <w:proofErr w:type="gramEnd"/>
-      <w:r>
-        <w:t> </w:t>
+        <w:t>0,3</w:t>
+      </w:r>
+      <w:r>
+        <w:t>  oraz </w:t>
       </w:r>
       <w:r>
         <w:t>0,7</w:t>
@@ -17253,6 +17038,9 @@
       </w:r>
     </w:p>
     <w:p>
+      <w:pPr>
+        <w:jc w:val="center"/>
+      </w:pPr>
       <w:r>
         <w:rPr>
           <w:noProof/>
@@ -17275,7 +17063,7 @@
                     </pic:cNvPicPr>
                   </pic:nvPicPr>
                   <pic:blipFill>
-                    <a:blip r:embed="rId14">
+                    <a:blip r:embed="rId15">
                       <a:extLst>
                         <a:ext uri="{28A0092B-C50C-407E-A947-70E740481C1C}">
                           <a14:useLocalDpi xmlns:a14="http://schemas.microsoft.com/office/drawing/2010/main" val="0"/>
@@ -17334,7 +17122,7 @@
     <w:p/>
     <w:p>
       <w:pPr>
-        <w:pStyle w:val="Nagwek2"/>
+        <w:pStyle w:val="Heading2"/>
         <w:rPr>
           <w:b/>
           <w:bCs/>
@@ -17354,6 +17142,9 @@
       </w:r>
     </w:p>
     <w:p>
+      <w:pPr>
+        <w:jc w:val="center"/>
+      </w:pPr>
       <w:r>
         <w:rPr>
           <w:noProof/>
@@ -17376,7 +17167,7 @@
                     </pic:cNvPicPr>
                   </pic:nvPicPr>
                   <pic:blipFill>
-                    <a:blip r:embed="rId15">
+                    <a:blip r:embed="rId16">
                       <a:extLst>
                         <a:ext uri="{28A0092B-C50C-407E-A947-70E740481C1C}">
                           <a14:useLocalDpi xmlns:a14="http://schemas.microsoft.com/office/drawing/2010/main" val="0"/>
@@ -17432,7 +17223,7 @@
     </w:p>
     <w:p>
       <w:pPr>
-        <w:pStyle w:val="Tytu"/>
+        <w:pStyle w:val="Title"/>
       </w:pPr>
       <w:r>
         <w:lastRenderedPageBreak/>
@@ -17441,7 +17232,7 @@
     </w:p>
     <w:p>
       <w:pPr>
-        <w:pStyle w:val="Nagwek1"/>
+        <w:pStyle w:val="Heading1"/>
         <w:numPr>
           <w:ilvl w:val="0"/>
           <w:numId w:val="8"/>
@@ -17456,23 +17247,7 @@
         <w:jc w:val="both"/>
       </w:pPr>
       <w:r>
-        <w:t xml:space="preserve">Problemem podjętym w ramach projektu jest prognozowanie szeregów czasowych na przykładzie notowań giełdowych spółki </w:t>
-      </w:r>
-      <w:proofErr w:type="spellStart"/>
-      <w:r>
-        <w:t>PayPal</w:t>
-      </w:r>
-      <w:proofErr w:type="spellEnd"/>
-      <w:r>
-        <w:t xml:space="preserve"> Holdings, Inc. (PYPL). Zaimplementowano sieć neuronową typu MLP, na podstawie sieci do klasyfikacji z pierwszej części projektu, </w:t>
-      </w:r>
-      <w:proofErr w:type="gramStart"/>
-      <w:r>
-        <w:t>ze</w:t>
-      </w:r>
-      <w:proofErr w:type="gramEnd"/>
-      <w:r>
-        <w:t xml:space="preserve"> znaczącymi modyfikacjami, aby nadawała się do problemu regresji. Dane giełdowe, pobrane z serwisu Yahoo Finance, zawierają ceny: otwarcia, zamknięcia, najwyższą, najniższą oraz wolumen. Dane zawierają 2703 rekordy z zakresu od 6 czerwca 2015 do 2 kwietnia 2026.</w:t>
+        <w:t>Problemem podjętym w ramach projektu jest prognozowanie szeregów czasowych na przykładzie notowań giełdowych spółki PayPal Holdings, Inc. (PYPL). Zaimplementowano sieć neuronową typu MLP, na podstawie sieci do klasyfikacji z pierwszej części projektu, ze znaczącymi modyfikacjami, aby nadawała się do problemu regresji. Dane giełdowe, pobrane z serwisu Yahoo Finance, zawierają ceny: otwarcia, zamknięcia, najwyższą, najniższą oraz wolumen. Dane zawierają 2703 rekordy z zakresu od 6 czerwca 2015 do 2 kwietnia 2026.</w:t>
       </w:r>
       <w:r>
         <w:t xml:space="preserve"> Na podstawie wyżej wymienionych zmiennych przewidywana jest cena zamknięcia na dzień następny.</w:t>
@@ -17480,7 +17255,7 @@
     </w:p>
     <w:p>
       <w:pPr>
-        <w:pStyle w:val="Nagwek1"/>
+        <w:pStyle w:val="Heading1"/>
         <w:numPr>
           <w:ilvl w:val="0"/>
           <w:numId w:val="8"/>
@@ -17508,95 +17283,31 @@
       <w:r>
         <w:t xml:space="preserve">ń </w:t>
       </w:r>
-      <w:hyperlink r:id="rId16" w:history="1">
-        <w:proofErr w:type="spellStart"/>
+      <w:hyperlink r:id="rId17" w:history="1">
         <w:r>
           <w:rPr>
-            <w:rStyle w:val="Hipercze"/>
+            <w:rStyle w:val="Hyperlink"/>
             <w:i/>
             <w:iCs/>
           </w:rPr>
-          <w:t>Intro</w:t>
+          <w:t>Intro to Recurrent Neural Networks LSTM | GRU</w:t>
         </w:r>
-        <w:proofErr w:type="spellEnd"/>
+      </w:hyperlink>
+      <w:r>
+        <w:t xml:space="preserve"> oraz </w:t>
+      </w:r>
+      <w:hyperlink r:id="rId18" w:history="1">
         <w:r>
           <w:rPr>
-            <w:rStyle w:val="Hipercze"/>
+            <w:rStyle w:val="Hyperlink"/>
             <w:i/>
             <w:iCs/>
           </w:rPr>
-          <w:t xml:space="preserve"> to </w:t>
-        </w:r>
-        <w:proofErr w:type="spellStart"/>
-        <w:r>
-          <w:rPr>
-            <w:rStyle w:val="Hipercze"/>
-            <w:i/>
-            <w:iCs/>
-          </w:rPr>
-          <w:t>Recurrent</w:t>
-        </w:r>
-        <w:proofErr w:type="spellEnd"/>
-        <w:r>
-          <w:rPr>
-            <w:rStyle w:val="Hipercze"/>
-            <w:i/>
-            <w:iCs/>
-          </w:rPr>
-          <w:t xml:space="preserve"> </w:t>
-        </w:r>
-        <w:proofErr w:type="spellStart"/>
-        <w:r>
-          <w:rPr>
-            <w:rStyle w:val="Hipercze"/>
-            <w:i/>
-            <w:iCs/>
-          </w:rPr>
-          <w:t>Neural</w:t>
-        </w:r>
-        <w:proofErr w:type="spellEnd"/>
-        <w:r>
-          <w:rPr>
-            <w:rStyle w:val="Hipercze"/>
-            <w:i/>
-            <w:iCs/>
-          </w:rPr>
-          <w:t xml:space="preserve"> Networks LSTM | GRU</w:t>
-        </w:r>
-      </w:hyperlink>
-      <w:r>
-        <w:t xml:space="preserve"> oraz </w:t>
-      </w:r>
-      <w:hyperlink r:id="rId17" w:history="1">
-        <w:r>
-          <w:rPr>
-            <w:rStyle w:val="Hipercze"/>
-            <w:i/>
-            <w:iCs/>
-          </w:rPr>
-          <w:t xml:space="preserve">Tesla Stock </w:t>
-        </w:r>
-        <w:proofErr w:type="spellStart"/>
-        <w:r>
-          <w:rPr>
-            <w:rStyle w:val="Hipercze"/>
-            <w:i/>
-            <w:iCs/>
-          </w:rPr>
-          <w:t>Forecasting</w:t>
-        </w:r>
-        <w:proofErr w:type="spellEnd"/>
-        <w:r>
-          <w:rPr>
-            <w:rStyle w:val="Hipercze"/>
-            <w:i/>
-            <w:iCs/>
-          </w:rPr>
-          <w:t xml:space="preserve"> </w:t>
+          <w:t xml:space="preserve">Tesla Stock Forecasting </w:t>
         </w:r>
         <w:r>
           <w:rPr>
-            <w:rStyle w:val="Hipercze"/>
+            <w:rStyle w:val="Hyperlink"/>
             <w:rFonts w:ascii="Segoe UI Emoji" w:hAnsi="Segoe UI Emoji" w:cs="Segoe UI Emoji"/>
             <w:i/>
             <w:iCs/>
@@ -17605,42 +17316,19 @@
         </w:r>
         <w:r>
           <w:rPr>
-            <w:rStyle w:val="Hipercze"/>
+            <w:rStyle w:val="Hyperlink"/>
             <w:i/>
             <w:iCs/>
           </w:rPr>
-          <w:t xml:space="preserve"> Multi-Step </w:t>
-        </w:r>
-        <w:proofErr w:type="spellStart"/>
-        <w:r>
-          <w:rPr>
-            <w:rStyle w:val="Hipercze"/>
-            <w:i/>
-            <w:iCs/>
-          </w:rPr>
-          <w:t>Stacked</w:t>
-        </w:r>
-        <w:proofErr w:type="spellEnd"/>
-        <w:r>
-          <w:rPr>
-            <w:rStyle w:val="Hipercze"/>
-            <w:i/>
-            <w:iCs/>
-          </w:rPr>
-          <w:t xml:space="preserve"> LSTM</w:t>
+          <w:t xml:space="preserve"> Multi-Step Stacked LSTM</w:t>
         </w:r>
       </w:hyperlink>
       <w:r>
         <w:t xml:space="preserve"> </w:t>
       </w:r>
       <w:r>
-        <w:t xml:space="preserve">z serwisu </w:t>
-      </w:r>
-      <w:proofErr w:type="spellStart"/>
-      <w:r>
-        <w:t>Kaggle</w:t>
-      </w:r>
-      <w:proofErr w:type="spellEnd"/>
+        <w:t>z serwisu Kaggle</w:t>
+      </w:r>
       <w:r>
         <w:t>. Opracowania</w:t>
       </w:r>
@@ -17671,7 +17359,7 @@
     </w:p>
     <w:p>
       <w:pPr>
-        <w:pStyle w:val="Nagwek1"/>
+        <w:pStyle w:val="Heading1"/>
         <w:numPr>
           <w:ilvl w:val="0"/>
           <w:numId w:val="8"/>
@@ -17683,7 +17371,7 @@
     </w:p>
     <w:p>
       <w:pPr>
-        <w:pStyle w:val="Nagwek2"/>
+        <w:pStyle w:val="Heading2"/>
       </w:pPr>
       <w:r>
         <w:t>Parametry</w:t>
@@ -17699,7 +17387,7 @@
     </w:p>
     <w:p>
       <w:pPr>
-        <w:pStyle w:val="Akapitzlist"/>
+        <w:pStyle w:val="ListParagraph"/>
         <w:numPr>
           <w:ilvl w:val="0"/>
           <w:numId w:val="10"/>
@@ -17712,7 +17400,7 @@
     </w:p>
     <w:p>
       <w:pPr>
-        <w:pStyle w:val="Akapitzlist"/>
+        <w:pStyle w:val="ListParagraph"/>
         <w:numPr>
           <w:ilvl w:val="0"/>
           <w:numId w:val="10"/>
@@ -17727,24 +17415,15 @@
           <w:i/>
           <w:iCs/>
         </w:rPr>
-        <w:t xml:space="preserve">learning </w:t>
-      </w:r>
-      <w:proofErr w:type="spellStart"/>
-      <w:r>
-        <w:rPr>
-          <w:i/>
-          <w:iCs/>
-        </w:rPr>
-        <w:t>rate</w:t>
-      </w:r>
-      <w:proofErr w:type="spellEnd"/>
+        <w:t>learning rate</w:t>
+      </w:r>
       <w:r>
         <w:t>; 0.01, 0.05, 0.1, 0.3)</w:t>
       </w:r>
     </w:p>
     <w:p>
       <w:pPr>
-        <w:pStyle w:val="Akapitzlist"/>
+        <w:pStyle w:val="ListParagraph"/>
         <w:numPr>
           <w:ilvl w:val="0"/>
           <w:numId w:val="10"/>
@@ -17754,7 +17433,6 @@
       <w:r>
         <w:t>Liczba epok (</w:t>
       </w:r>
-      <w:proofErr w:type="spellStart"/>
       <w:r>
         <w:rPr>
           <w:i/>
@@ -17762,14 +17440,13 @@
         </w:rPr>
         <w:t>epochs</w:t>
       </w:r>
-      <w:proofErr w:type="spellEnd"/>
       <w:r>
         <w:t>; 500, 1000, 2000, 5000)</w:t>
       </w:r>
     </w:p>
     <w:p>
       <w:pPr>
-        <w:pStyle w:val="Akapitzlist"/>
+        <w:pStyle w:val="ListParagraph"/>
         <w:numPr>
           <w:ilvl w:val="0"/>
           <w:numId w:val="10"/>
@@ -17782,7 +17459,7 @@
     </w:p>
     <w:p>
       <w:pPr>
-        <w:pStyle w:val="Akapitzlist"/>
+        <w:pStyle w:val="ListParagraph"/>
         <w:numPr>
           <w:ilvl w:val="0"/>
           <w:numId w:val="10"/>
@@ -17792,38 +17469,20 @@
       <w:r>
         <w:t>Podział zbioru na dane treningowe i testowe (</w:t>
       </w:r>
-      <w:proofErr w:type="spellStart"/>
       <w:r>
         <w:rPr>
           <w:i/>
           <w:iCs/>
         </w:rPr>
-        <w:t>train</w:t>
-      </w:r>
-      <w:proofErr w:type="spellEnd"/>
-      <w:r>
-        <w:rPr>
-          <w:i/>
-          <w:iCs/>
-        </w:rPr>
-        <w:t xml:space="preserve"> test </w:t>
-      </w:r>
-      <w:proofErr w:type="spellStart"/>
-      <w:r>
-        <w:rPr>
-          <w:i/>
-          <w:iCs/>
-        </w:rPr>
-        <w:t>split</w:t>
-      </w:r>
-      <w:proofErr w:type="spellEnd"/>
+        <w:t>train test split</w:t>
+      </w:r>
       <w:r>
         <w:t>; 60-40, 70-30, 80-20, 90-10)</w:t>
       </w:r>
     </w:p>
     <w:p>
       <w:pPr>
-        <w:pStyle w:val="Akapitzlist"/>
+        <w:pStyle w:val="ListParagraph"/>
         <w:numPr>
           <w:ilvl w:val="0"/>
           <w:numId w:val="10"/>
@@ -17831,52 +17490,21 @@
         <w:jc w:val="both"/>
       </w:pPr>
       <w:r>
-        <w:t>Funkcje aktywacji (</w:t>
-      </w:r>
-      <w:proofErr w:type="spellStart"/>
-      <w:r>
-        <w:t>sigmoid</w:t>
-      </w:r>
-      <w:proofErr w:type="spellEnd"/>
+        <w:t xml:space="preserve">Funkcje aktywacji (sigmoid, tanh, </w:t>
+      </w:r>
+      <w:r>
+        <w:t>ReLU</w:t>
+      </w:r>
       <w:r>
         <w:t xml:space="preserve">, </w:t>
       </w:r>
-      <w:proofErr w:type="spellStart"/>
-      <w:r>
-        <w:t>tanh</w:t>
-      </w:r>
-      <w:proofErr w:type="spellEnd"/>
-      <w:r>
-        <w:t xml:space="preserve">, </w:t>
-      </w:r>
-      <w:proofErr w:type="spellStart"/>
-      <w:r>
-        <w:t>ReLU</w:t>
-      </w:r>
-      <w:proofErr w:type="spellEnd"/>
-      <w:r>
-        <w:t xml:space="preserve">, </w:t>
-      </w:r>
-      <w:proofErr w:type="spellStart"/>
-      <w:r>
-        <w:t>leaky</w:t>
-      </w:r>
-      <w:proofErr w:type="spellEnd"/>
-      <w:r>
-        <w:t xml:space="preserve"> </w:t>
-      </w:r>
-      <w:proofErr w:type="spellStart"/>
-      <w:r>
-        <w:t>ReLU</w:t>
-      </w:r>
-      <w:proofErr w:type="spellEnd"/>
-      <w:r>
-        <w:t>)</w:t>
+      <w:r>
+        <w:t>leaky ReLU)</w:t>
       </w:r>
     </w:p>
     <w:p>
       <w:pPr>
-        <w:pStyle w:val="Akapitzlist"/>
+        <w:pStyle w:val="ListParagraph"/>
         <w:numPr>
           <w:ilvl w:val="0"/>
           <w:numId w:val="10"/>
@@ -17892,7 +17520,7 @@
     </w:p>
     <w:p>
       <w:pPr>
-        <w:pStyle w:val="Akapitzlist"/>
+        <w:pStyle w:val="ListParagraph"/>
         <w:numPr>
           <w:ilvl w:val="0"/>
           <w:numId w:val="10"/>
@@ -17908,15 +17536,7 @@
         <w:jc w:val="both"/>
       </w:pPr>
       <w:r>
-        <w:t xml:space="preserve">Parametrami bazowymi były kolejno: 8, 0.1, 1000, 0.5, 80-20, </w:t>
-      </w:r>
-      <w:proofErr w:type="spellStart"/>
-      <w:r>
-        <w:t>sigmoid</w:t>
-      </w:r>
-      <w:proofErr w:type="spellEnd"/>
-      <w:r>
-        <w:t>, 1, 4 (nieistotne, gdyż w tym przypadku jest tylko 1 warstwa ukryta).</w:t>
+        <w:t>Parametrami bazowymi były kolejno: 8, 0.1, 1000, 0.5, 80-20, sigmoid, 1, 4 (nieistotne, gdyż w tym przypadku jest tylko 1 warstwa ukryta).</w:t>
       </w:r>
     </w:p>
     <w:p>
@@ -17958,7 +17578,7 @@
     </w:p>
     <w:p>
       <w:pPr>
-        <w:pStyle w:val="Nagwek2"/>
+        <w:pStyle w:val="Heading2"/>
       </w:pPr>
       <w:r>
         <w:lastRenderedPageBreak/>
@@ -17967,7 +17587,7 @@
     </w:p>
     <w:p>
       <w:pPr>
-        <w:pStyle w:val="Nagwek3"/>
+        <w:pStyle w:val="Heading3"/>
         <w:numPr>
           <w:ilvl w:val="0"/>
           <w:numId w:val="11"/>
@@ -18000,7 +17620,7 @@
                     </pic:cNvPicPr>
                   </pic:nvPicPr>
                   <pic:blipFill>
-                    <a:blip r:embed="rId18" cstate="print">
+                    <a:blip r:embed="rId19" cstate="print">
                       <a:extLst>
                         <a:ext uri="{28A0092B-C50C-407E-A947-70E740481C1C}">
                           <a14:useLocalDpi xmlns:a14="http://schemas.microsoft.com/office/drawing/2010/main" val="0"/>
@@ -18045,30 +17665,12 @@
         <w:t xml:space="preserve">Wyjątkowo dla tego parametru przedstawione zostaną również </w:t>
       </w:r>
       <w:r>
-        <w:t xml:space="preserve">wartości MSE dla danych znormalizowanych, RMSE w dolarach oraz MAPE w tabeli. Dla pozostałych parametrów nie zostanie to zawarte w sprawozdaniu, gdyż zajmuje to dużo miejsca. Tabele takie można stworzyć za pomocą linii 227-230 w pliku </w:t>
-      </w:r>
-      <w:proofErr w:type="spellStart"/>
-      <w:r>
-        <w:t>R_Regression</w:t>
-      </w:r>
-      <w:proofErr w:type="spellEnd"/>
-      <w:r>
-        <w:t>/</w:t>
-      </w:r>
-      <w:proofErr w:type="spellStart"/>
-      <w:proofErr w:type="gramStart"/>
-      <w:r>
-        <w:t>main.R</w:t>
-      </w:r>
-      <w:proofErr w:type="spellEnd"/>
-      <w:proofErr w:type="gramEnd"/>
-      <w:r>
-        <w:t>, zmieniając nazwę parametru w linii 228.</w:t>
+        <w:t>wartości MSE dla danych znormalizowanych, RMSE w dolarach oraz MAPE w tabeli. Dla pozostałych parametrów nie zostanie to zawarte w sprawozdaniu, gdyż zajmuje to dużo miejsca. Tabele takie można stworzyć za pomocą linii 227-230 w pliku R_Regression/main.R, zmieniając nazwę parametru w linii 228.</w:t>
       </w:r>
     </w:p>
     <w:tbl>
       <w:tblPr>
-        <w:tblStyle w:val="Tabela-Siatka"/>
+        <w:tblStyle w:val="TableGrid"/>
         <w:tblW w:w="0" w:type="auto"/>
         <w:tblLook w:val="04A0" w:firstRow="1" w:lastRow="0" w:firstColumn="1" w:lastColumn="0" w:noHBand="0" w:noVBand="1"/>
       </w:tblPr>
@@ -18115,11 +17717,9 @@
             <w:hideMark/>
           </w:tcPr>
           <w:p>
-            <w:proofErr w:type="spellStart"/>
             <w:r>
               <w:t>Train_MSE_norm</w:t>
             </w:r>
-            <w:proofErr w:type="spellEnd"/>
           </w:p>
         </w:tc>
         <w:tc>
@@ -18129,11 +17729,9 @@
             <w:hideMark/>
           </w:tcPr>
           <w:p>
-            <w:proofErr w:type="spellStart"/>
             <w:r>
               <w:t>Test_MSE_norm</w:t>
             </w:r>
-            <w:proofErr w:type="spellEnd"/>
           </w:p>
         </w:tc>
         <w:tc>
@@ -18143,11 +17741,9 @@
             <w:hideMark/>
           </w:tcPr>
           <w:p>
-            <w:proofErr w:type="spellStart"/>
             <w:r>
               <w:t>Test_RMSE_USD</w:t>
             </w:r>
-            <w:proofErr w:type="spellEnd"/>
           </w:p>
         </w:tc>
         <w:tc>
@@ -18157,11 +17753,9 @@
             <w:hideMark/>
           </w:tcPr>
           <w:p>
-            <w:proofErr w:type="spellStart"/>
             <w:r>
               <w:t>Test_MAPE_pct</w:t>
             </w:r>
-            <w:proofErr w:type="spellEnd"/>
           </w:p>
         </w:tc>
       </w:tr>
@@ -19195,7 +18789,7 @@
                     </pic:cNvPicPr>
                   </pic:nvPicPr>
                   <pic:blipFill>
-                    <a:blip r:embed="rId19">
+                    <a:blip r:embed="rId20">
                       <a:extLst>
                         <a:ext uri="{28A0092B-C50C-407E-A947-70E740481C1C}">
                           <a14:useLocalDpi xmlns:a14="http://schemas.microsoft.com/office/drawing/2010/main" val="0"/>
@@ -19254,66 +18848,6 @@
                 <pic:pic xmlns:pic="http://schemas.openxmlformats.org/drawingml/2006/picture">
                   <pic:nvPicPr>
                     <pic:cNvPr id="0" name="Picture 8"/>
-                    <pic:cNvPicPr>
-                      <a:picLocks noChangeAspect="1" noChangeArrowheads="1"/>
-                    </pic:cNvPicPr>
-                  </pic:nvPicPr>
-                  <pic:blipFill>
-                    <a:blip r:embed="rId20">
-                      <a:extLst>
-                        <a:ext uri="{28A0092B-C50C-407E-A947-70E740481C1C}">
-                          <a14:useLocalDpi xmlns:a14="http://schemas.microsoft.com/office/drawing/2010/main" val="0"/>
-                        </a:ext>
-                      </a:extLst>
-                    </a:blip>
-                    <a:srcRect/>
-                    <a:stretch>
-                      <a:fillRect/>
-                    </a:stretch>
-                  </pic:blipFill>
-                  <pic:spPr bwMode="auto">
-                    <a:xfrm>
-                      <a:off x="0" y="0"/>
-                      <a:ext cx="5753100" cy="3916680"/>
-                    </a:xfrm>
-                    <a:prstGeom prst="rect">
-                      <a:avLst/>
-                    </a:prstGeom>
-                    <a:noFill/>
-                    <a:ln>
-                      <a:noFill/>
-                    </a:ln>
-                  </pic:spPr>
-                </pic:pic>
-              </a:graphicData>
-            </a:graphic>
-          </wp:inline>
-        </w:drawing>
-      </w:r>
-    </w:p>
-    <w:p>
-      <w:r>
-        <w:t>12 neuronów:</w:t>
-      </w:r>
-    </w:p>
-    <w:p>
-      <w:r>
-        <w:rPr>
-          <w:noProof/>
-        </w:rPr>
-        <w:drawing>
-          <wp:inline distT="0" distB="0" distL="0" distR="0" wp14:anchorId="684E556B" wp14:editId="4F013D80">
-            <wp:extent cx="5753100" cy="3916680"/>
-            <wp:effectExtent l="0" t="0" r="0" b="7620"/>
-            <wp:docPr id="1377702839" name="Obraz 5"/>
-            <wp:cNvGraphicFramePr>
-              <a:graphicFrameLocks xmlns:a="http://schemas.openxmlformats.org/drawingml/2006/main" noChangeAspect="1"/>
-            </wp:cNvGraphicFramePr>
-            <a:graphic xmlns:a="http://schemas.openxmlformats.org/drawingml/2006/main">
-              <a:graphicData uri="http://schemas.openxmlformats.org/drawingml/2006/picture">
-                <pic:pic xmlns:pic="http://schemas.openxmlformats.org/drawingml/2006/picture">
-                  <pic:nvPicPr>
-                    <pic:cNvPr id="0" name="Picture 9"/>
                     <pic:cNvPicPr>
                       <a:picLocks noChangeAspect="1" noChangeArrowheads="1"/>
                     </pic:cNvPicPr>
@@ -19353,13 +18887,7 @@
     </w:p>
     <w:p>
       <w:r>
-        <w:br w:type="page"/>
-      </w:r>
-    </w:p>
-    <w:p>
-      <w:r>
-        <w:lastRenderedPageBreak/>
-        <w:t>16 neuronów:</w:t>
+        <w:t>12 neuronów:</w:t>
       </w:r>
     </w:p>
     <w:p>
@@ -19368,10 +18896,10 @@
           <w:noProof/>
         </w:rPr>
         <w:drawing>
-          <wp:inline distT="0" distB="0" distL="0" distR="0" wp14:anchorId="18EE5300" wp14:editId="7DF22C18">
+          <wp:inline distT="0" distB="0" distL="0" distR="0" wp14:anchorId="684E556B" wp14:editId="4F013D80">
             <wp:extent cx="5753100" cy="3916680"/>
             <wp:effectExtent l="0" t="0" r="0" b="7620"/>
-            <wp:docPr id="652549691" name="Obraz 6"/>
+            <wp:docPr id="1377702839" name="Obraz 5"/>
             <wp:cNvGraphicFramePr>
               <a:graphicFrameLocks xmlns:a="http://schemas.openxmlformats.org/drawingml/2006/main" noChangeAspect="1"/>
             </wp:cNvGraphicFramePr>
@@ -19379,7 +18907,7 @@
               <a:graphicData uri="http://schemas.openxmlformats.org/drawingml/2006/picture">
                 <pic:pic xmlns:pic="http://schemas.openxmlformats.org/drawingml/2006/picture">
                   <pic:nvPicPr>
-                    <pic:cNvPr id="0" name="Picture 10"/>
+                    <pic:cNvPr id="0" name="Picture 9"/>
                     <pic:cNvPicPr>
                       <a:picLocks noChangeAspect="1" noChangeArrowheads="1"/>
                     </pic:cNvPicPr>
@@ -19418,8 +18946,74 @@
       </w:r>
     </w:p>
     <w:p>
-      <w:pPr>
-        <w:pStyle w:val="Nagwek3"/>
+      <w:r>
+        <w:br w:type="page"/>
+      </w:r>
+    </w:p>
+    <w:p>
+      <w:r>
+        <w:lastRenderedPageBreak/>
+        <w:t>16 neuronów:</w:t>
+      </w:r>
+    </w:p>
+    <w:p>
+      <w:r>
+        <w:rPr>
+          <w:noProof/>
+        </w:rPr>
+        <w:drawing>
+          <wp:inline distT="0" distB="0" distL="0" distR="0" wp14:anchorId="18EE5300" wp14:editId="7DF22C18">
+            <wp:extent cx="5753100" cy="3916680"/>
+            <wp:effectExtent l="0" t="0" r="0" b="7620"/>
+            <wp:docPr id="652549691" name="Obraz 6"/>
+            <wp:cNvGraphicFramePr>
+              <a:graphicFrameLocks xmlns:a="http://schemas.openxmlformats.org/drawingml/2006/main" noChangeAspect="1"/>
+            </wp:cNvGraphicFramePr>
+            <a:graphic xmlns:a="http://schemas.openxmlformats.org/drawingml/2006/main">
+              <a:graphicData uri="http://schemas.openxmlformats.org/drawingml/2006/picture">
+                <pic:pic xmlns:pic="http://schemas.openxmlformats.org/drawingml/2006/picture">
+                  <pic:nvPicPr>
+                    <pic:cNvPr id="0" name="Picture 10"/>
+                    <pic:cNvPicPr>
+                      <a:picLocks noChangeAspect="1" noChangeArrowheads="1"/>
+                    </pic:cNvPicPr>
+                  </pic:nvPicPr>
+                  <pic:blipFill>
+                    <a:blip r:embed="rId23">
+                      <a:extLst>
+                        <a:ext uri="{28A0092B-C50C-407E-A947-70E740481C1C}">
+                          <a14:useLocalDpi xmlns:a14="http://schemas.microsoft.com/office/drawing/2010/main" val="0"/>
+                        </a:ext>
+                      </a:extLst>
+                    </a:blip>
+                    <a:srcRect/>
+                    <a:stretch>
+                      <a:fillRect/>
+                    </a:stretch>
+                  </pic:blipFill>
+                  <pic:spPr bwMode="auto">
+                    <a:xfrm>
+                      <a:off x="0" y="0"/>
+                      <a:ext cx="5753100" cy="3916680"/>
+                    </a:xfrm>
+                    <a:prstGeom prst="rect">
+                      <a:avLst/>
+                    </a:prstGeom>
+                    <a:noFill/>
+                    <a:ln>
+                      <a:noFill/>
+                    </a:ln>
+                  </pic:spPr>
+                </pic:pic>
+              </a:graphicData>
+            </a:graphic>
+          </wp:inline>
+        </w:drawing>
+      </w:r>
+    </w:p>
+    <w:p>
+      <w:pPr>
+        <w:pStyle w:val="Heading3"/>
         <w:numPr>
           <w:ilvl w:val="0"/>
           <w:numId w:val="11"/>
@@ -19447,91 +19041,6 @@
                 <pic:pic xmlns:pic="http://schemas.openxmlformats.org/drawingml/2006/picture">
                   <pic:nvPicPr>
                     <pic:cNvPr id="0" name="Picture 11"/>
-                    <pic:cNvPicPr>
-                      <a:picLocks noChangeAspect="1" noChangeArrowheads="1"/>
-                    </pic:cNvPicPr>
-                  </pic:nvPicPr>
-                  <pic:blipFill>
-                    <a:blip r:embed="rId23" cstate="print">
-                      <a:extLst>
-                        <a:ext uri="{28A0092B-C50C-407E-A947-70E740481C1C}">
-                          <a14:useLocalDpi xmlns:a14="http://schemas.microsoft.com/office/drawing/2010/main" val="0"/>
-                        </a:ext>
-                      </a:extLst>
-                    </a:blip>
-                    <a:srcRect/>
-                    <a:stretch>
-                      <a:fillRect/>
-                    </a:stretch>
-                  </pic:blipFill>
-                  <pic:spPr bwMode="auto">
-                    <a:xfrm>
-                      <a:off x="0" y="0"/>
-                      <a:ext cx="5760720" cy="3596640"/>
-                    </a:xfrm>
-                    <a:prstGeom prst="rect">
-                      <a:avLst/>
-                    </a:prstGeom>
-                    <a:noFill/>
-                    <a:ln>
-                      <a:noFill/>
-                    </a:ln>
-                  </pic:spPr>
-                </pic:pic>
-              </a:graphicData>
-            </a:graphic>
-          </wp:inline>
-        </w:drawing>
-      </w:r>
-    </w:p>
-    <w:p>
-      <w:r>
-        <w:t xml:space="preserve">Wartości błędu maleją wraz ze wzrostem wartości szybkości uczenia. Dla wartości 0.1 i 0.3 błąd jest podobny. </w:t>
-      </w:r>
-      <w:r>
-        <w:t>Wartości błędów dla najlepszego modelu (pod względem RMSE) z LR=0.3: RMSE=</w:t>
-      </w:r>
-      <w:r>
-        <w:t>1.873493</w:t>
-      </w:r>
-      <w:r>
-        <w:t>; MAPE=</w:t>
-      </w:r>
-      <w:r>
-        <w:t>1.949458</w:t>
-      </w:r>
-    </w:p>
-    <w:p>
-      <w:pPr>
-        <w:pStyle w:val="Nagwek3"/>
-        <w:numPr>
-          <w:ilvl w:val="0"/>
-          <w:numId w:val="11"/>
-        </w:numPr>
-      </w:pPr>
-      <w:r>
-        <w:lastRenderedPageBreak/>
-        <w:t>Liczba epok</w:t>
-      </w:r>
-    </w:p>
-    <w:p>
-      <w:r>
-        <w:rPr>
-          <w:noProof/>
-        </w:rPr>
-        <w:drawing>
-          <wp:inline distT="0" distB="0" distL="0" distR="0" wp14:anchorId="320841CA" wp14:editId="5781E658">
-            <wp:extent cx="5760720" cy="3596640"/>
-            <wp:effectExtent l="0" t="0" r="0" b="3810"/>
-            <wp:docPr id="695426926" name="Obraz 8"/>
-            <wp:cNvGraphicFramePr>
-              <a:graphicFrameLocks xmlns:a="http://schemas.openxmlformats.org/drawingml/2006/main" noChangeAspect="1"/>
-            </wp:cNvGraphicFramePr>
-            <a:graphic xmlns:a="http://schemas.openxmlformats.org/drawingml/2006/main">
-              <a:graphicData uri="http://schemas.openxmlformats.org/drawingml/2006/picture">
-                <pic:pic xmlns:pic="http://schemas.openxmlformats.org/drawingml/2006/picture">
-                  <pic:nvPicPr>
-                    <pic:cNvPr id="0" name="Picture 12"/>
                     <pic:cNvPicPr>
                       <a:picLocks noChangeAspect="1" noChangeArrowheads="1"/>
                     </pic:cNvPicPr>
@@ -19571,39 +19080,32 @@
     </w:p>
     <w:p>
       <w:r>
-        <w:t xml:space="preserve">Tu również dostrzegalne jest potencjalne przeszkolenie modelu przy wartości 5000. Najlepszy (pod względem RMSE) model z </w:t>
-      </w:r>
-      <w:proofErr w:type="spellStart"/>
-      <w:r>
-        <w:t>Epochs</w:t>
-      </w:r>
-      <w:proofErr w:type="spellEnd"/>
-      <w:r>
-        <w:t>=2000: RMSE=</w:t>
-      </w:r>
-      <w:r>
-        <w:t>2.022729</w:t>
+        <w:t xml:space="preserve">Wartości błędu maleją wraz ze wzrostem wartości szybkości uczenia. Dla wartości 0.1 i 0.3 błąd jest podobny. </w:t>
+      </w:r>
+      <w:r>
+        <w:t>Wartości błędów dla najlepszego modelu (pod względem RMSE) z LR=0.3: RMSE=</w:t>
+      </w:r>
+      <w:r>
+        <w:t>1.873493</w:t>
       </w:r>
       <w:r>
         <w:t>; MAPE=</w:t>
       </w:r>
       <w:r>
-        <w:t>2.268343</w:t>
-      </w:r>
-      <w:r>
-        <w:t>.</w:t>
+        <w:t>1.949458</w:t>
       </w:r>
     </w:p>
     <w:p>
       <w:pPr>
-        <w:pStyle w:val="Nagwek3"/>
+        <w:pStyle w:val="Heading3"/>
         <w:numPr>
           <w:ilvl w:val="0"/>
           <w:numId w:val="11"/>
         </w:numPr>
       </w:pPr>
       <w:r>
-        <w:t>Zakres inicjalizacji wag</w:t>
+        <w:lastRenderedPageBreak/>
+        <w:t>Liczba epok</w:t>
       </w:r>
     </w:p>
     <w:p>
@@ -19612,10 +19114,10 @@
           <w:noProof/>
         </w:rPr>
         <w:drawing>
-          <wp:inline distT="0" distB="0" distL="0" distR="0" wp14:anchorId="1FBDA6E8" wp14:editId="31244543">
+          <wp:inline distT="0" distB="0" distL="0" distR="0" wp14:anchorId="320841CA" wp14:editId="5781E658">
             <wp:extent cx="5760720" cy="3596640"/>
             <wp:effectExtent l="0" t="0" r="0" b="3810"/>
-            <wp:docPr id="1996859238" name="Obraz 9"/>
+            <wp:docPr id="695426926" name="Obraz 8"/>
             <wp:cNvGraphicFramePr>
               <a:graphicFrameLocks xmlns:a="http://schemas.openxmlformats.org/drawingml/2006/main" noChangeAspect="1"/>
             </wp:cNvGraphicFramePr>
@@ -19623,7 +19125,7 @@
               <a:graphicData uri="http://schemas.openxmlformats.org/drawingml/2006/picture">
                 <pic:pic xmlns:pic="http://schemas.openxmlformats.org/drawingml/2006/picture">
                   <pic:nvPicPr>
-                    <pic:cNvPr id="0" name="Picture 13"/>
+                    <pic:cNvPr id="0" name="Picture 12"/>
                     <pic:cNvPicPr>
                       <a:picLocks noChangeAspect="1" noChangeArrowheads="1"/>
                     </pic:cNvPicPr>
@@ -19663,25 +19165,16 @@
     </w:p>
     <w:p>
       <w:r>
-        <w:lastRenderedPageBreak/>
-        <w:t xml:space="preserve">Podobnie jak poprzednio, dla najwyższej przyjętej wartości może występować przeszkolenie modelu, choć rozrzut wyników jest duży i najlepszy model udało się wyszkolić przy wartości </w:t>
-      </w:r>
-      <w:proofErr w:type="spellStart"/>
-      <w:r>
-        <w:t>Init_Range</w:t>
-      </w:r>
-      <w:proofErr w:type="spellEnd"/>
-      <w:r>
-        <w:t>=1: RMSE=</w:t>
-      </w:r>
-      <w:r>
-        <w:t>1.89050</w:t>
+        <w:t>Tu również dostrzegalne jest potencjalne przeszkolenie modelu przy wartości 5000. Najlepszy (pod względem RMSE) model z Epochs=2000: RMSE=</w:t>
+      </w:r>
+      <w:r>
+        <w:t>2.022729</w:t>
       </w:r>
       <w:r>
         <w:t>; MAPE=</w:t>
       </w:r>
       <w:r>
-        <w:t>1.994306</w:t>
+        <w:t>2.268343</w:t>
       </w:r>
       <w:r>
         <w:t>.</w:t>
@@ -19689,14 +19182,14 @@
     </w:p>
     <w:p>
       <w:pPr>
-        <w:pStyle w:val="Nagwek3"/>
+        <w:pStyle w:val="Heading3"/>
         <w:numPr>
           <w:ilvl w:val="0"/>
           <w:numId w:val="11"/>
         </w:numPr>
       </w:pPr>
       <w:r>
-        <w:t>Podział zbioru na dane treningowe i testowe</w:t>
+        <w:t>Zakres inicjalizacji wag</w:t>
       </w:r>
     </w:p>
     <w:p>
@@ -19705,10 +19198,10 @@
           <w:noProof/>
         </w:rPr>
         <w:drawing>
-          <wp:inline distT="0" distB="0" distL="0" distR="0" wp14:anchorId="462261DF" wp14:editId="6D535657">
+          <wp:inline distT="0" distB="0" distL="0" distR="0" wp14:anchorId="1FBDA6E8" wp14:editId="31244543">
             <wp:extent cx="5760720" cy="3596640"/>
             <wp:effectExtent l="0" t="0" r="0" b="3810"/>
-            <wp:docPr id="1116831764" name="Obraz 10"/>
+            <wp:docPr id="1996859238" name="Obraz 9"/>
             <wp:cNvGraphicFramePr>
               <a:graphicFrameLocks xmlns:a="http://schemas.openxmlformats.org/drawingml/2006/main" noChangeAspect="1"/>
             </wp:cNvGraphicFramePr>
@@ -19716,7 +19209,7 @@
               <a:graphicData uri="http://schemas.openxmlformats.org/drawingml/2006/picture">
                 <pic:pic xmlns:pic="http://schemas.openxmlformats.org/drawingml/2006/picture">
                   <pic:nvPicPr>
-                    <pic:cNvPr id="0" name="Picture 14"/>
+                    <pic:cNvPr id="0" name="Picture 13"/>
                     <pic:cNvPicPr>
                       <a:picLocks noChangeAspect="1" noChangeArrowheads="1"/>
                     </pic:cNvPicPr>
@@ -19756,19 +19249,17 @@
     </w:p>
     <w:p>
       <w:r>
-        <w:t>W tym przypadku nie widać wyraźnej zależności. Wpłynąć na to mógł charakter danych</w:t>
-      </w:r>
-      <w:r>
-        <w:t>, np. szumy losowe. Najlepszy model z Split=0.8 (podział 80-20): RMSE=</w:t>
-      </w:r>
-      <w:r>
-        <w:t>1.972612</w:t>
+        <w:lastRenderedPageBreak/>
+        <w:t>Podobnie jak poprzednio, dla najwyższej przyjętej wartości może występować przeszkolenie modelu, choć rozrzut wyników jest duży i najlepszy model udało się wyszkolić przy wartości Init_Range=1: RMSE=</w:t>
+      </w:r>
+      <w:r>
+        <w:t>1.89050</w:t>
       </w:r>
       <w:r>
         <w:t>; MAPE=</w:t>
       </w:r>
       <w:r>
-        <w:t>2.158708</w:t>
+        <w:t>1.994306</w:t>
       </w:r>
       <w:r>
         <w:t>.</w:t>
@@ -19776,7 +19267,94 @@
     </w:p>
     <w:p>
       <w:pPr>
-        <w:pStyle w:val="Nagwek3"/>
+        <w:pStyle w:val="Heading3"/>
+        <w:numPr>
+          <w:ilvl w:val="0"/>
+          <w:numId w:val="11"/>
+        </w:numPr>
+      </w:pPr>
+      <w:r>
+        <w:t>Podział zbioru na dane treningowe i testowe</w:t>
+      </w:r>
+    </w:p>
+    <w:p>
+      <w:r>
+        <w:rPr>
+          <w:noProof/>
+        </w:rPr>
+        <w:drawing>
+          <wp:inline distT="0" distB="0" distL="0" distR="0" wp14:anchorId="462261DF" wp14:editId="6D535657">
+            <wp:extent cx="5760720" cy="3596640"/>
+            <wp:effectExtent l="0" t="0" r="0" b="3810"/>
+            <wp:docPr id="1116831764" name="Obraz 10"/>
+            <wp:cNvGraphicFramePr>
+              <a:graphicFrameLocks xmlns:a="http://schemas.openxmlformats.org/drawingml/2006/main" noChangeAspect="1"/>
+            </wp:cNvGraphicFramePr>
+            <a:graphic xmlns:a="http://schemas.openxmlformats.org/drawingml/2006/main">
+              <a:graphicData uri="http://schemas.openxmlformats.org/drawingml/2006/picture">
+                <pic:pic xmlns:pic="http://schemas.openxmlformats.org/drawingml/2006/picture">
+                  <pic:nvPicPr>
+                    <pic:cNvPr id="0" name="Picture 14"/>
+                    <pic:cNvPicPr>
+                      <a:picLocks noChangeAspect="1" noChangeArrowheads="1"/>
+                    </pic:cNvPicPr>
+                  </pic:nvPicPr>
+                  <pic:blipFill>
+                    <a:blip r:embed="rId27" cstate="print">
+                      <a:extLst>
+                        <a:ext uri="{28A0092B-C50C-407E-A947-70E740481C1C}">
+                          <a14:useLocalDpi xmlns:a14="http://schemas.microsoft.com/office/drawing/2010/main" val="0"/>
+                        </a:ext>
+                      </a:extLst>
+                    </a:blip>
+                    <a:srcRect/>
+                    <a:stretch>
+                      <a:fillRect/>
+                    </a:stretch>
+                  </pic:blipFill>
+                  <pic:spPr bwMode="auto">
+                    <a:xfrm>
+                      <a:off x="0" y="0"/>
+                      <a:ext cx="5760720" cy="3596640"/>
+                    </a:xfrm>
+                    <a:prstGeom prst="rect">
+                      <a:avLst/>
+                    </a:prstGeom>
+                    <a:noFill/>
+                    <a:ln>
+                      <a:noFill/>
+                    </a:ln>
+                  </pic:spPr>
+                </pic:pic>
+              </a:graphicData>
+            </a:graphic>
+          </wp:inline>
+        </w:drawing>
+      </w:r>
+    </w:p>
+    <w:p>
+      <w:r>
+        <w:t>W tym przypadku nie widać wyraźnej zależności. Wpłynąć na to mógł charakter danych</w:t>
+      </w:r>
+      <w:r>
+        <w:t>, np. szumy losowe. Najlepszy model z Split=0.8 (podział 80-20): RMSE=</w:t>
+      </w:r>
+      <w:r>
+        <w:t>1.972612</w:t>
+      </w:r>
+      <w:r>
+        <w:t>; MAPE=</w:t>
+      </w:r>
+      <w:r>
+        <w:t>2.158708</w:t>
+      </w:r>
+      <w:r>
+        <w:t>.</w:t>
+      </w:r>
+    </w:p>
+    <w:p>
+      <w:pPr>
+        <w:pStyle w:val="Heading3"/>
         <w:numPr>
           <w:ilvl w:val="0"/>
           <w:numId w:val="11"/>
@@ -19809,7 +19387,7 @@
                     </pic:cNvPicPr>
                   </pic:nvPicPr>
                   <pic:blipFill>
-                    <a:blip r:embed="rId27" cstate="print">
+                    <a:blip r:embed="rId28" cstate="print">
                       <a:extLst>
                         <a:ext uri="{28A0092B-C50C-407E-A947-70E740481C1C}">
                           <a14:useLocalDpi xmlns:a14="http://schemas.microsoft.com/office/drawing/2010/main" val="0"/>
@@ -19844,38 +19422,7 @@
     <w:p>
       <w:r>
         <w:lastRenderedPageBreak/>
-        <w:t xml:space="preserve">Najlepsze wyniki dały funkcje </w:t>
-      </w:r>
-      <w:proofErr w:type="spellStart"/>
-      <w:proofErr w:type="gramStart"/>
-      <w:r>
-        <w:t>ReLU</w:t>
-      </w:r>
-      <w:proofErr w:type="spellEnd"/>
-      <w:r>
-        <w:t xml:space="preserve">  oraz</w:t>
-      </w:r>
-      <w:proofErr w:type="gramEnd"/>
-      <w:r>
-        <w:t xml:space="preserve"> tangens hiperboliczny. Najlepszy model z </w:t>
-      </w:r>
-      <w:proofErr w:type="spellStart"/>
-      <w:r>
-        <w:t>Activation</w:t>
-      </w:r>
-      <w:proofErr w:type="spellEnd"/>
-      <w:proofErr w:type="gramStart"/>
-      <w:r>
-        <w:t>=”</w:t>
-      </w:r>
-      <w:proofErr w:type="spellStart"/>
-      <w:r>
-        <w:t>relu</w:t>
-      </w:r>
-      <w:proofErr w:type="spellEnd"/>
-      <w:proofErr w:type="gramEnd"/>
-      <w:r>
-        <w:t>”: RMSE=</w:t>
+        <w:t>Najlepsze wyniki dały funkcje ReLU  oraz tangens hiperboliczny. Najlepszy model z Activation=”relu”: RMSE=</w:t>
       </w:r>
       <w:r>
         <w:t>1.949950</w:t>
@@ -19892,7 +19439,7 @@
     </w:p>
     <w:p>
       <w:pPr>
-        <w:pStyle w:val="Nagwek3"/>
+        <w:pStyle w:val="Heading3"/>
         <w:numPr>
           <w:ilvl w:val="0"/>
           <w:numId w:val="11"/>
@@ -19925,7 +19472,7 @@
                     </pic:cNvPicPr>
                   </pic:nvPicPr>
                   <pic:blipFill>
-                    <a:blip r:embed="rId28" cstate="print">
+                    <a:blip r:embed="rId29" cstate="print">
                       <a:extLst>
                         <a:ext uri="{28A0092B-C50C-407E-A947-70E740481C1C}">
                           <a14:useLocalDpi xmlns:a14="http://schemas.microsoft.com/office/drawing/2010/main" val="0"/>
@@ -19964,7 +19511,7 @@
     </w:p>
     <w:p>
       <w:pPr>
-        <w:pStyle w:val="Nagwek3"/>
+        <w:pStyle w:val="Heading3"/>
         <w:numPr>
           <w:ilvl w:val="0"/>
           <w:numId w:val="11"/>
@@ -19997,7 +19544,7 @@
                     </pic:cNvPicPr>
                   </pic:nvPicPr>
                   <pic:blipFill>
-                    <a:blip r:embed="rId29" cstate="print">
+                    <a:blip r:embed="rId30" cstate="print">
                       <a:extLst>
                         <a:ext uri="{28A0092B-C50C-407E-A947-70E740481C1C}">
                           <a14:useLocalDpi xmlns:a14="http://schemas.microsoft.com/office/drawing/2010/main" val="0"/>
@@ -20049,7 +19596,7 @@
     </w:p>
     <w:p>
       <w:pPr>
-        <w:pStyle w:val="Nagwek1"/>
+        <w:pStyle w:val="Heading1"/>
       </w:pPr>
       <w:r>
         <w:t>Wnioski</w:t>
@@ -20057,7 +19604,7 @@
     </w:p>
     <w:p>
       <w:pPr>
-        <w:pStyle w:val="Akapitzlist"/>
+        <w:pStyle w:val="ListParagraph"/>
         <w:numPr>
           <w:ilvl w:val="0"/>
           <w:numId w:val="12"/>
@@ -20072,7 +19619,7 @@
       <w:hyperlink w:anchor="_Inne_opracowania" w:history="1">
         <w:r>
           <w:rPr>
-            <w:rStyle w:val="Hipercze"/>
+            <w:rStyle w:val="Hyperlink"/>
           </w:rPr>
           <w:t>wyżej wspomnianych opracowaniach</w:t>
         </w:r>
@@ -20083,7 +19630,7 @@
     </w:p>
     <w:p>
       <w:pPr>
-        <w:pStyle w:val="Akapitzlist"/>
+        <w:pStyle w:val="ListParagraph"/>
         <w:numPr>
           <w:ilvl w:val="0"/>
           <w:numId w:val="12"/>
@@ -20095,7 +19642,7 @@
     </w:p>
     <w:p>
       <w:pPr>
-        <w:pStyle w:val="Akapitzlist"/>
+        <w:pStyle w:val="ListParagraph"/>
         <w:numPr>
           <w:ilvl w:val="0"/>
           <w:numId w:val="12"/>
@@ -20107,27 +19654,19 @@
     </w:p>
     <w:p>
       <w:pPr>
-        <w:pStyle w:val="Akapitzlist"/>
+        <w:pStyle w:val="ListParagraph"/>
         <w:numPr>
           <w:ilvl w:val="0"/>
           <w:numId w:val="12"/>
         </w:numPr>
       </w:pPr>
       <w:r>
-        <w:t xml:space="preserve">Najlepszą funkcją aktywacji do tego problemu okazała się funkcja </w:t>
-      </w:r>
-      <w:proofErr w:type="spellStart"/>
-      <w:r>
-        <w:t>ReLU</w:t>
-      </w:r>
-      <w:proofErr w:type="spellEnd"/>
-      <w:r>
-        <w:t>.</w:t>
+        <w:t>Najlepszą funkcją aktywacji do tego problemu okazała się funkcja ReLU.</w:t>
       </w:r>
     </w:p>
     <w:p>
       <w:pPr>
-        <w:pStyle w:val="Akapitzlist"/>
+        <w:pStyle w:val="ListParagraph"/>
         <w:numPr>
           <w:ilvl w:val="0"/>
           <w:numId w:val="12"/>
@@ -21984,15 +21523,15 @@
     <w:lsdException w:name="Unresolved Mention" w:semiHidden="1" w:unhideWhenUsed="1"/>
     <w:lsdException w:name="Smart Link" w:semiHidden="1" w:unhideWhenUsed="1"/>
   </w:latentStyles>
-  <w:style w:type="paragraph" w:default="1" w:styleId="Normalny">
+  <w:style w:type="paragraph" w:default="1" w:styleId="Normal">
     <w:name w:val="Normal"/>
     <w:qFormat/>
   </w:style>
-  <w:style w:type="paragraph" w:styleId="Nagwek1">
+  <w:style w:type="paragraph" w:styleId="Heading1">
     <w:name w:val="heading 1"/>
-    <w:basedOn w:val="Normalny"/>
-    <w:next w:val="Normalny"/>
-    <w:link w:val="Nagwek1Znak"/>
+    <w:basedOn w:val="Normal"/>
+    <w:next w:val="Normal"/>
+    <w:link w:val="Heading1Char"/>
     <w:uiPriority w:val="9"/>
     <w:qFormat/>
     <w:rsid w:val="007B07D8"/>
@@ -22009,11 +21548,11 @@
       <w:szCs w:val="40"/>
     </w:rPr>
   </w:style>
-  <w:style w:type="paragraph" w:styleId="Nagwek2">
+  <w:style w:type="paragraph" w:styleId="Heading2">
     <w:name w:val="heading 2"/>
-    <w:basedOn w:val="Normalny"/>
-    <w:next w:val="Normalny"/>
-    <w:link w:val="Nagwek2Znak"/>
+    <w:basedOn w:val="Normal"/>
+    <w:next w:val="Normal"/>
+    <w:link w:val="Heading2Char"/>
     <w:uiPriority w:val="9"/>
     <w:unhideWhenUsed/>
     <w:qFormat/>
@@ -22031,11 +21570,11 @@
       <w:szCs w:val="32"/>
     </w:rPr>
   </w:style>
-  <w:style w:type="paragraph" w:styleId="Nagwek3">
+  <w:style w:type="paragraph" w:styleId="Heading3">
     <w:name w:val="heading 3"/>
-    <w:basedOn w:val="Normalny"/>
-    <w:next w:val="Normalny"/>
-    <w:link w:val="Nagwek3Znak"/>
+    <w:basedOn w:val="Normal"/>
+    <w:next w:val="Normal"/>
+    <w:link w:val="Heading3Char"/>
     <w:uiPriority w:val="9"/>
     <w:unhideWhenUsed/>
     <w:qFormat/>
@@ -22053,11 +21592,11 @@
       <w:szCs w:val="28"/>
     </w:rPr>
   </w:style>
-  <w:style w:type="paragraph" w:styleId="Nagwek4">
+  <w:style w:type="paragraph" w:styleId="Heading4">
     <w:name w:val="heading 4"/>
-    <w:basedOn w:val="Normalny"/>
-    <w:next w:val="Normalny"/>
-    <w:link w:val="Nagwek4Znak"/>
+    <w:basedOn w:val="Normal"/>
+    <w:next w:val="Normal"/>
+    <w:link w:val="Heading4Char"/>
     <w:uiPriority w:val="9"/>
     <w:semiHidden/>
     <w:unhideWhenUsed/>
@@ -22076,11 +21615,11 @@
       <w:color w:val="0F4761" w:themeColor="accent1" w:themeShade="BF"/>
     </w:rPr>
   </w:style>
-  <w:style w:type="paragraph" w:styleId="Nagwek5">
+  <w:style w:type="paragraph" w:styleId="Heading5">
     <w:name w:val="heading 5"/>
-    <w:basedOn w:val="Normalny"/>
-    <w:next w:val="Normalny"/>
-    <w:link w:val="Nagwek5Znak"/>
+    <w:basedOn w:val="Normal"/>
+    <w:next w:val="Normal"/>
+    <w:link w:val="Heading5Char"/>
     <w:uiPriority w:val="9"/>
     <w:semiHidden/>
     <w:unhideWhenUsed/>
@@ -22097,11 +21636,11 @@
       <w:color w:val="0F4761" w:themeColor="accent1" w:themeShade="BF"/>
     </w:rPr>
   </w:style>
-  <w:style w:type="paragraph" w:styleId="Nagwek6">
+  <w:style w:type="paragraph" w:styleId="Heading6">
     <w:name w:val="heading 6"/>
-    <w:basedOn w:val="Normalny"/>
-    <w:next w:val="Normalny"/>
-    <w:link w:val="Nagwek6Znak"/>
+    <w:basedOn w:val="Normal"/>
+    <w:next w:val="Normal"/>
+    <w:link w:val="Heading6Char"/>
     <w:uiPriority w:val="9"/>
     <w:semiHidden/>
     <w:unhideWhenUsed/>
@@ -22120,11 +21659,11 @@
       <w:color w:val="595959" w:themeColor="text1" w:themeTint="A6"/>
     </w:rPr>
   </w:style>
-  <w:style w:type="paragraph" w:styleId="Nagwek7">
+  <w:style w:type="paragraph" w:styleId="Heading7">
     <w:name w:val="heading 7"/>
-    <w:basedOn w:val="Normalny"/>
-    <w:next w:val="Normalny"/>
-    <w:link w:val="Nagwek7Znak"/>
+    <w:basedOn w:val="Normal"/>
+    <w:next w:val="Normal"/>
+    <w:link w:val="Heading7Char"/>
     <w:uiPriority w:val="9"/>
     <w:semiHidden/>
     <w:unhideWhenUsed/>
@@ -22141,11 +21680,11 @@
       <w:color w:val="595959" w:themeColor="text1" w:themeTint="A6"/>
     </w:rPr>
   </w:style>
-  <w:style w:type="paragraph" w:styleId="Nagwek8">
+  <w:style w:type="paragraph" w:styleId="Heading8">
     <w:name w:val="heading 8"/>
-    <w:basedOn w:val="Normalny"/>
-    <w:next w:val="Normalny"/>
-    <w:link w:val="Nagwek8Znak"/>
+    <w:basedOn w:val="Normal"/>
+    <w:next w:val="Normal"/>
+    <w:link w:val="Heading8Char"/>
     <w:uiPriority w:val="9"/>
     <w:semiHidden/>
     <w:unhideWhenUsed/>
@@ -22164,11 +21703,11 @@
       <w:color w:val="272727" w:themeColor="text1" w:themeTint="D8"/>
     </w:rPr>
   </w:style>
-  <w:style w:type="paragraph" w:styleId="Nagwek9">
+  <w:style w:type="paragraph" w:styleId="Heading9">
     <w:name w:val="heading 9"/>
-    <w:basedOn w:val="Normalny"/>
-    <w:next w:val="Normalny"/>
-    <w:link w:val="Nagwek9Znak"/>
+    <w:basedOn w:val="Normal"/>
+    <w:next w:val="Normal"/>
+    <w:link w:val="Heading9Char"/>
     <w:uiPriority w:val="9"/>
     <w:semiHidden/>
     <w:unhideWhenUsed/>
@@ -22185,12 +21724,13 @@
       <w:color w:val="272727" w:themeColor="text1" w:themeTint="D8"/>
     </w:rPr>
   </w:style>
-  <w:style w:type="character" w:default="1" w:styleId="Domylnaczcionkaakapitu">
+  <w:style w:type="character" w:default="1" w:styleId="DefaultParagraphFont">
     <w:name w:val="Default Paragraph Font"/>
     <w:uiPriority w:val="1"/>
+    <w:semiHidden/>
     <w:unhideWhenUsed/>
   </w:style>
-  <w:style w:type="table" w:default="1" w:styleId="Standardowy">
+  <w:style w:type="table" w:default="1" w:styleId="TableNormal">
     <w:name w:val="Normal Table"/>
     <w:uiPriority w:val="99"/>
     <w:semiHidden/>
@@ -22205,16 +21745,16 @@
       </w:tblCellMar>
     </w:tblPr>
   </w:style>
-  <w:style w:type="numbering" w:default="1" w:styleId="Bezlisty">
+  <w:style w:type="numbering" w:default="1" w:styleId="NoList">
     <w:name w:val="No List"/>
     <w:uiPriority w:val="99"/>
     <w:semiHidden/>
     <w:unhideWhenUsed/>
   </w:style>
-  <w:style w:type="character" w:customStyle="1" w:styleId="Nagwek1Znak">
-    <w:name w:val="Nagłówek 1 Znak"/>
-    <w:basedOn w:val="Domylnaczcionkaakapitu"/>
-    <w:link w:val="Nagwek1"/>
+  <w:style w:type="character" w:customStyle="1" w:styleId="Heading1Char">
+    <w:name w:val="Heading 1 Char"/>
+    <w:basedOn w:val="DefaultParagraphFont"/>
+    <w:link w:val="Heading1"/>
     <w:uiPriority w:val="9"/>
     <w:rsid w:val="007B07D8"/>
     <w:rPr>
@@ -22224,10 +21764,10 @@
       <w:szCs w:val="40"/>
     </w:rPr>
   </w:style>
-  <w:style w:type="character" w:customStyle="1" w:styleId="Nagwek2Znak">
-    <w:name w:val="Nagłówek 2 Znak"/>
-    <w:basedOn w:val="Domylnaczcionkaakapitu"/>
-    <w:link w:val="Nagwek2"/>
+  <w:style w:type="character" w:customStyle="1" w:styleId="Heading2Char">
+    <w:name w:val="Heading 2 Char"/>
+    <w:basedOn w:val="DefaultParagraphFont"/>
+    <w:link w:val="Heading2"/>
     <w:uiPriority w:val="9"/>
     <w:rsid w:val="007B07D8"/>
     <w:rPr>
@@ -22237,10 +21777,10 @@
       <w:szCs w:val="32"/>
     </w:rPr>
   </w:style>
-  <w:style w:type="character" w:customStyle="1" w:styleId="Nagwek3Znak">
-    <w:name w:val="Nagłówek 3 Znak"/>
-    <w:basedOn w:val="Domylnaczcionkaakapitu"/>
-    <w:link w:val="Nagwek3"/>
+  <w:style w:type="character" w:customStyle="1" w:styleId="Heading3Char">
+    <w:name w:val="Heading 3 Char"/>
+    <w:basedOn w:val="DefaultParagraphFont"/>
+    <w:link w:val="Heading3"/>
     <w:uiPriority w:val="9"/>
     <w:rsid w:val="007B07D8"/>
     <w:rPr>
@@ -22250,10 +21790,10 @@
       <w:szCs w:val="28"/>
     </w:rPr>
   </w:style>
-  <w:style w:type="character" w:customStyle="1" w:styleId="Nagwek4Znak">
-    <w:name w:val="Nagłówek 4 Znak"/>
-    <w:basedOn w:val="Domylnaczcionkaakapitu"/>
-    <w:link w:val="Nagwek4"/>
+  <w:style w:type="character" w:customStyle="1" w:styleId="Heading4Char">
+    <w:name w:val="Heading 4 Char"/>
+    <w:basedOn w:val="DefaultParagraphFont"/>
+    <w:link w:val="Heading4"/>
     <w:uiPriority w:val="9"/>
     <w:semiHidden/>
     <w:rsid w:val="007B07D8"/>
@@ -22264,10 +21804,10 @@
       <w:color w:val="0F4761" w:themeColor="accent1" w:themeShade="BF"/>
     </w:rPr>
   </w:style>
-  <w:style w:type="character" w:customStyle="1" w:styleId="Nagwek5Znak">
-    <w:name w:val="Nagłówek 5 Znak"/>
-    <w:basedOn w:val="Domylnaczcionkaakapitu"/>
-    <w:link w:val="Nagwek5"/>
+  <w:style w:type="character" w:customStyle="1" w:styleId="Heading5Char">
+    <w:name w:val="Heading 5 Char"/>
+    <w:basedOn w:val="DefaultParagraphFont"/>
+    <w:link w:val="Heading5"/>
     <w:uiPriority w:val="9"/>
     <w:semiHidden/>
     <w:rsid w:val="007B07D8"/>
@@ -22276,10 +21816,10 @@
       <w:color w:val="0F4761" w:themeColor="accent1" w:themeShade="BF"/>
     </w:rPr>
   </w:style>
-  <w:style w:type="character" w:customStyle="1" w:styleId="Nagwek6Znak">
-    <w:name w:val="Nagłówek 6 Znak"/>
-    <w:basedOn w:val="Domylnaczcionkaakapitu"/>
-    <w:link w:val="Nagwek6"/>
+  <w:style w:type="character" w:customStyle="1" w:styleId="Heading6Char">
+    <w:name w:val="Heading 6 Char"/>
+    <w:basedOn w:val="DefaultParagraphFont"/>
+    <w:link w:val="Heading6"/>
     <w:uiPriority w:val="9"/>
     <w:semiHidden/>
     <w:rsid w:val="007B07D8"/>
@@ -22290,10 +21830,10 @@
       <w:color w:val="595959" w:themeColor="text1" w:themeTint="A6"/>
     </w:rPr>
   </w:style>
-  <w:style w:type="character" w:customStyle="1" w:styleId="Nagwek7Znak">
-    <w:name w:val="Nagłówek 7 Znak"/>
-    <w:basedOn w:val="Domylnaczcionkaakapitu"/>
-    <w:link w:val="Nagwek7"/>
+  <w:style w:type="character" w:customStyle="1" w:styleId="Heading7Char">
+    <w:name w:val="Heading 7 Char"/>
+    <w:basedOn w:val="DefaultParagraphFont"/>
+    <w:link w:val="Heading7"/>
     <w:uiPriority w:val="9"/>
     <w:semiHidden/>
     <w:rsid w:val="007B07D8"/>
@@ -22302,10 +21842,10 @@
       <w:color w:val="595959" w:themeColor="text1" w:themeTint="A6"/>
     </w:rPr>
   </w:style>
-  <w:style w:type="character" w:customStyle="1" w:styleId="Nagwek8Znak">
-    <w:name w:val="Nagłówek 8 Znak"/>
-    <w:basedOn w:val="Domylnaczcionkaakapitu"/>
-    <w:link w:val="Nagwek8"/>
+  <w:style w:type="character" w:customStyle="1" w:styleId="Heading8Char">
+    <w:name w:val="Heading 8 Char"/>
+    <w:basedOn w:val="DefaultParagraphFont"/>
+    <w:link w:val="Heading8"/>
     <w:uiPriority w:val="9"/>
     <w:semiHidden/>
     <w:rsid w:val="007B07D8"/>
@@ -22316,10 +21856,10 @@
       <w:color w:val="272727" w:themeColor="text1" w:themeTint="D8"/>
     </w:rPr>
   </w:style>
-  <w:style w:type="character" w:customStyle="1" w:styleId="Nagwek9Znak">
-    <w:name w:val="Nagłówek 9 Znak"/>
-    <w:basedOn w:val="Domylnaczcionkaakapitu"/>
-    <w:link w:val="Nagwek9"/>
+  <w:style w:type="character" w:customStyle="1" w:styleId="Heading9Char">
+    <w:name w:val="Heading 9 Char"/>
+    <w:basedOn w:val="DefaultParagraphFont"/>
+    <w:link w:val="Heading9"/>
     <w:uiPriority w:val="9"/>
     <w:semiHidden/>
     <w:rsid w:val="007B07D8"/>
@@ -22328,11 +21868,11 @@
       <w:color w:val="272727" w:themeColor="text1" w:themeTint="D8"/>
     </w:rPr>
   </w:style>
-  <w:style w:type="paragraph" w:styleId="Tytu">
+  <w:style w:type="paragraph" w:styleId="Title">
     <w:name w:val="Title"/>
-    <w:basedOn w:val="Normalny"/>
-    <w:next w:val="Normalny"/>
-    <w:link w:val="TytuZnak"/>
+    <w:basedOn w:val="Normal"/>
+    <w:next w:val="Normal"/>
+    <w:link w:val="TitleChar"/>
     <w:uiPriority w:val="10"/>
     <w:qFormat/>
     <w:rsid w:val="007B07D8"/>
@@ -22348,10 +21888,10 @@
       <w:szCs w:val="56"/>
     </w:rPr>
   </w:style>
-  <w:style w:type="character" w:customStyle="1" w:styleId="TytuZnak">
-    <w:name w:val="Tytuł Znak"/>
-    <w:basedOn w:val="Domylnaczcionkaakapitu"/>
-    <w:link w:val="Tytu"/>
+  <w:style w:type="character" w:customStyle="1" w:styleId="TitleChar">
+    <w:name w:val="Title Char"/>
+    <w:basedOn w:val="DefaultParagraphFont"/>
+    <w:link w:val="Title"/>
     <w:uiPriority w:val="10"/>
     <w:rsid w:val="007B07D8"/>
     <w:rPr>
@@ -22362,11 +21902,11 @@
       <w:szCs w:val="56"/>
     </w:rPr>
   </w:style>
-  <w:style w:type="paragraph" w:styleId="Podtytu">
+  <w:style w:type="paragraph" w:styleId="Subtitle">
     <w:name w:val="Subtitle"/>
-    <w:basedOn w:val="Normalny"/>
-    <w:next w:val="Normalny"/>
-    <w:link w:val="PodtytuZnak"/>
+    <w:basedOn w:val="Normal"/>
+    <w:next w:val="Normal"/>
+    <w:link w:val="SubtitleChar"/>
     <w:uiPriority w:val="11"/>
     <w:qFormat/>
     <w:rsid w:val="007B07D8"/>
@@ -22383,10 +21923,10 @@
       <w:szCs w:val="28"/>
     </w:rPr>
   </w:style>
-  <w:style w:type="character" w:customStyle="1" w:styleId="PodtytuZnak">
-    <w:name w:val="Podtytuł Znak"/>
-    <w:basedOn w:val="Domylnaczcionkaakapitu"/>
-    <w:link w:val="Podtytu"/>
+  <w:style w:type="character" w:customStyle="1" w:styleId="SubtitleChar">
+    <w:name w:val="Subtitle Char"/>
+    <w:basedOn w:val="DefaultParagraphFont"/>
+    <w:link w:val="Subtitle"/>
     <w:uiPriority w:val="11"/>
     <w:rsid w:val="007B07D8"/>
     <w:rPr>
@@ -22397,11 +21937,11 @@
       <w:szCs w:val="28"/>
     </w:rPr>
   </w:style>
-  <w:style w:type="paragraph" w:styleId="Cytat">
+  <w:style w:type="paragraph" w:styleId="Quote">
     <w:name w:val="Quote"/>
-    <w:basedOn w:val="Normalny"/>
-    <w:next w:val="Normalny"/>
-    <w:link w:val="CytatZnak"/>
+    <w:basedOn w:val="Normal"/>
+    <w:next w:val="Normal"/>
+    <w:link w:val="QuoteChar"/>
     <w:uiPriority w:val="29"/>
     <w:qFormat/>
     <w:rsid w:val="007B07D8"/>
@@ -22415,10 +21955,10 @@
       <w:color w:val="404040" w:themeColor="text1" w:themeTint="BF"/>
     </w:rPr>
   </w:style>
-  <w:style w:type="character" w:customStyle="1" w:styleId="CytatZnak">
-    <w:name w:val="Cytat Znak"/>
-    <w:basedOn w:val="Domylnaczcionkaakapitu"/>
-    <w:link w:val="Cytat"/>
+  <w:style w:type="character" w:customStyle="1" w:styleId="QuoteChar">
+    <w:name w:val="Quote Char"/>
+    <w:basedOn w:val="DefaultParagraphFont"/>
+    <w:link w:val="Quote"/>
     <w:uiPriority w:val="29"/>
     <w:rsid w:val="007B07D8"/>
     <w:rPr>
@@ -22427,9 +21967,9 @@
       <w:color w:val="404040" w:themeColor="text1" w:themeTint="BF"/>
     </w:rPr>
   </w:style>
-  <w:style w:type="paragraph" w:styleId="Akapitzlist">
+  <w:style w:type="paragraph" w:styleId="ListParagraph">
     <w:name w:val="List Paragraph"/>
-    <w:basedOn w:val="Normalny"/>
+    <w:basedOn w:val="Normal"/>
     <w:uiPriority w:val="34"/>
     <w:qFormat/>
     <w:rsid w:val="007B07D8"/>
@@ -22438,9 +21978,9 @@
       <w:contextualSpacing/>
     </w:pPr>
   </w:style>
-  <w:style w:type="character" w:styleId="Wyrnienieintensywne">
+  <w:style w:type="character" w:styleId="IntenseEmphasis">
     <w:name w:val="Intense Emphasis"/>
-    <w:basedOn w:val="Domylnaczcionkaakapitu"/>
+    <w:basedOn w:val="DefaultParagraphFont"/>
     <w:uiPriority w:val="21"/>
     <w:qFormat/>
     <w:rsid w:val="007B07D8"/>
@@ -22450,11 +21990,11 @@
       <w:color w:val="0F4761" w:themeColor="accent1" w:themeShade="BF"/>
     </w:rPr>
   </w:style>
-  <w:style w:type="paragraph" w:styleId="Cytatintensywny">
+  <w:style w:type="paragraph" w:styleId="IntenseQuote">
     <w:name w:val="Intense Quote"/>
-    <w:basedOn w:val="Normalny"/>
-    <w:next w:val="Normalny"/>
-    <w:link w:val="CytatintensywnyZnak"/>
+    <w:basedOn w:val="Normal"/>
+    <w:next w:val="Normal"/>
+    <w:link w:val="IntenseQuoteChar"/>
     <w:uiPriority w:val="30"/>
     <w:qFormat/>
     <w:rsid w:val="007B07D8"/>
@@ -22473,10 +22013,10 @@
       <w:color w:val="0F4761" w:themeColor="accent1" w:themeShade="BF"/>
     </w:rPr>
   </w:style>
-  <w:style w:type="character" w:customStyle="1" w:styleId="CytatintensywnyZnak">
-    <w:name w:val="Cytat intensywny Znak"/>
-    <w:basedOn w:val="Domylnaczcionkaakapitu"/>
-    <w:link w:val="Cytatintensywny"/>
+  <w:style w:type="character" w:customStyle="1" w:styleId="IntenseQuoteChar">
+    <w:name w:val="Intense Quote Char"/>
+    <w:basedOn w:val="DefaultParagraphFont"/>
+    <w:link w:val="IntenseQuote"/>
     <w:uiPriority w:val="30"/>
     <w:rsid w:val="007B07D8"/>
     <w:rPr>
@@ -22485,9 +22025,9 @@
       <w:color w:val="0F4761" w:themeColor="accent1" w:themeShade="BF"/>
     </w:rPr>
   </w:style>
-  <w:style w:type="character" w:styleId="Odwoanieintensywne">
+  <w:style w:type="character" w:styleId="IntenseReference">
     <w:name w:val="Intense Reference"/>
-    <w:basedOn w:val="Domylnaczcionkaakapitu"/>
+    <w:basedOn w:val="DefaultParagraphFont"/>
     <w:uiPriority w:val="32"/>
     <w:qFormat/>
     <w:rsid w:val="007B07D8"/>
@@ -22499,9 +22039,9 @@
       <w:spacing w:val="5"/>
     </w:rPr>
   </w:style>
-  <w:style w:type="paragraph" w:styleId="NormalnyWeb">
+  <w:style w:type="paragraph" w:styleId="NormalWeb">
     <w:name w:val="Normal (Web)"/>
-    <w:basedOn w:val="Normalny"/>
+    <w:basedOn w:val="Normal"/>
     <w:uiPriority w:val="99"/>
     <w:semiHidden/>
     <w:unhideWhenUsed/>
@@ -22517,9 +22057,9 @@
       <w14:ligatures w14:val="none"/>
     </w:rPr>
   </w:style>
-  <w:style w:type="character" w:styleId="Hipercze">
+  <w:style w:type="character" w:styleId="Hyperlink">
     <w:name w:val="Hyperlink"/>
-    <w:basedOn w:val="Domylnaczcionkaakapitu"/>
+    <w:basedOn w:val="DefaultParagraphFont"/>
     <w:uiPriority w:val="99"/>
     <w:unhideWhenUsed/>
     <w:rsid w:val="00E7764E"/>
@@ -22528,9 +22068,9 @@
       <w:u w:val="single"/>
     </w:rPr>
   </w:style>
-  <w:style w:type="character" w:styleId="Nierozpoznanawzmianka">
+  <w:style w:type="character" w:styleId="UnresolvedMention">
     <w:name w:val="Unresolved Mention"/>
-    <w:basedOn w:val="Domylnaczcionkaakapitu"/>
+    <w:basedOn w:val="DefaultParagraphFont"/>
     <w:uiPriority w:val="99"/>
     <w:semiHidden/>
     <w:unhideWhenUsed/>
@@ -22540,9 +22080,9 @@
       <w:shd w:val="clear" w:color="auto" w:fill="E1DFDD"/>
     </w:rPr>
   </w:style>
-  <w:style w:type="character" w:styleId="UyteHipercze">
+  <w:style w:type="character" w:styleId="FollowedHyperlink">
     <w:name w:val="FollowedHyperlink"/>
-    <w:basedOn w:val="Domylnaczcionkaakapitu"/>
+    <w:basedOn w:val="DefaultParagraphFont"/>
     <w:uiPriority w:val="99"/>
     <w:semiHidden/>
     <w:unhideWhenUsed/>
@@ -22552,9 +22092,9 @@
       <w:u w:val="single"/>
     </w:rPr>
   </w:style>
-  <w:style w:type="table" w:styleId="Tabela-Siatka">
+  <w:style w:type="table" w:styleId="TableGrid">
     <w:name w:val="Table Grid"/>
-    <w:basedOn w:val="Standardowy"/>
+    <w:basedOn w:val="TableNormal"/>
     <w:uiPriority w:val="39"/>
     <w:rsid w:val="00743362"/>
     <w:pPr>
@@ -22571,10 +22111,10 @@
       </w:tblBorders>
     </w:tblPr>
   </w:style>
-  <w:style w:type="paragraph" w:styleId="Tekstprzypisukocowego">
+  <w:style w:type="paragraph" w:styleId="EndnoteText">
     <w:name w:val="endnote text"/>
-    <w:basedOn w:val="Normalny"/>
-    <w:link w:val="TekstprzypisukocowegoZnak"/>
+    <w:basedOn w:val="Normal"/>
+    <w:link w:val="EndnoteTextChar"/>
     <w:uiPriority w:val="99"/>
     <w:semiHidden/>
     <w:unhideWhenUsed/>
@@ -22587,10 +22127,10 @@
       <w:szCs w:val="20"/>
     </w:rPr>
   </w:style>
-  <w:style w:type="character" w:customStyle="1" w:styleId="TekstprzypisukocowegoZnak">
-    <w:name w:val="Tekst przypisu końcowego Znak"/>
-    <w:basedOn w:val="Domylnaczcionkaakapitu"/>
-    <w:link w:val="Tekstprzypisukocowego"/>
+  <w:style w:type="character" w:customStyle="1" w:styleId="EndnoteTextChar">
+    <w:name w:val="Endnote Text Char"/>
+    <w:basedOn w:val="DefaultParagraphFont"/>
+    <w:link w:val="EndnoteText"/>
     <w:uiPriority w:val="99"/>
     <w:semiHidden/>
     <w:rsid w:val="00F17653"/>
@@ -22599,9 +22139,9 @@
       <w:szCs w:val="20"/>
     </w:rPr>
   </w:style>
-  <w:style w:type="character" w:styleId="Odwoanieprzypisukocowego">
+  <w:style w:type="character" w:styleId="EndnoteReference">
     <w:name w:val="endnote reference"/>
-    <w:basedOn w:val="Domylnaczcionkaakapitu"/>
+    <w:basedOn w:val="DefaultParagraphFont"/>
     <w:uiPriority w:val="99"/>
     <w:semiHidden/>
     <w:unhideWhenUsed/>

</xml_diff>